<commit_message>
Documentos Word: telar 8 en la API, cuatro relés LCA110 y no SSR
Documentación de Proyecto decía que el ESP32 sondea /api/telares/1 (es el 8);
el árbol de problemas hablaba de 8 actuadores (son 4 bobinas, con un LCA110
cada una) y la guía de los bloques C y D decía SSR donde va el LCA110.

Co-Authored-By: Claude Opus 5.5 <noreply@anthropic.com>
Claude-Session: https://claude.ai/code/session_01QiY8ZZNAM9gwPKiqSkCaaj
</commit_message>
<xml_diff>
--- a/documentacion_proyecto/Documentación_de_Proyecto.docx
+++ b/documentacion_proyecto/Documentación_de_Proyecto.docx
@@ -7043,7 +7043,7 @@
           <w:rFonts w:ascii="IBM Plex Sans" w:cs="IBM Plex Sans" w:eastAsia="IBM Plex Sans" w:hAnsi="IBM Plex Sans"/>
           <w:rtl w:val="0"/>
         </w:rPr>
-        <w:t>El firmware del ESP32 se acopla al backend propio (Node.js/Express) exclusivamente por HTTP: sondea el endpoint GET /api/telares/1 cada 2,5 s para conocer el estado deseado del telar y reporta fallas por POST /api/errores. No existe integración con Firebase ni con bases de datos de series temporales externas: toda la persistencia vive en la misma base PostgreSQL (Neon) que usa la web.</w:t>
+        <w:t>El firmware del ESP32 se acopla al backend propio (Node.js/Express) exclusivamente por HTTP: sondea el endpoint GET /api/telares/8?origen=esp32 cada 2,5 s (8 es el id del telar en la base, TELAR_ID en el firmware) para conocer el estado deseado del telar y reporta fallas por POST /api/errores. No existe integración con Firebase ni con bases de datos de series temporales externas: toda la persistencia vive en la misma base PostgreSQL (Neon) que usa la web.</w:t>
       </w:r>
     </w:p>
     <w:p>
@@ -7297,7 +7297,7 @@
                 <w:rFonts w:ascii="IBM Plex Sans" w:cs="IBM Plex Sans" w:eastAsia="IBM Plex Sans" w:hAnsi="IBM Plex Sans"/>
                 <w:rtl w:val="0"/>
               </w:rPr>
-              <w:t>GET /api/telares/1</w:t>
+              <w:t>GET /api/telares/8</w:t>
             </w:r>
           </w:p>
         </w:tc>
@@ -12999,7 +12999,7 @@
           <w:rFonts w:ascii="IBM Plex Sans" w:cs="IBM Plex Sans" w:eastAsia="IBM Plex Sans" w:hAnsi="IBM Plex Sans"/>
           <w:rtl w:val="0"/>
         </w:rPr>
-        <w:t>El microcontrolador ESP32-WROOM-32 se comunica exclusivamente por Wi-Fi con el backend propio (Node.js/Express) mediante peticiones HTTP/REST en JSON: sondea GET /api/telares/1 cada 2,5 s para conocer el estado deseado del telar y reporta fallas con POST /api/errores. El backend, es el único intermediario entre el ESP32, la web y la base de datos PostgreSQL alojada en Neon; no se utiliza MQTT, WebSockets ni ningún broker intermedio en el stack actual.</w:t>
+        <w:t>El microcontrolador ESP32-WROOM-32 se comunica exclusivamente por Wi-Fi con el backend propio (Node.js/Express) mediante peticiones HTTP/REST en JSON: sondea GET /api/telares/8?origen=esp32 cada 2,5 s (8 es el id del telar en la base, TELAR_ID en el firmware) para conocer el estado deseado del telar y reporta fallas con POST /api/errores. El backend, es el único intermediario entre el ESP32, la web y la base de datos PostgreSQL alojada en Neon; no se utiliza MQTT, WebSockets ni ningún broker intermedio en el stack actual.</w:t>
       </w:r>
     </w:p>
     <w:p>

</xml_diff>

<commit_message>
Corregir la tabla de componentes de la Documentación de Proyecto
Bobinas y LCA110 en 4, 74HC595 descartado en 0, capacitores de sensado
y de 470 uF agregados, polarización del relé de Retroceder a GND, fila
de resistencias de los LCA110 y controles con Terminar trabajo.

Co-Authored-By: Claude Opus 5.5 <noreply@anthropic.com>
Claude-Session: https://claude.ai/code/session_01QiY8ZZNAM9gwPKiqSkCaaj
</commit_message>
<xml_diff>
--- a/documentacion_proyecto/Documentación_de_Proyecto.docx
+++ b/documentacion_proyecto/Documentación_de_Proyecto.docx
@@ -4084,7 +4084,7 @@
           <w:color w:val="000000"/>
           <w:rtl w:val="0"/>
         </w:rPr>
-        <w:t>grilla interactiva donde cada fila es una combinación de bobinas, que se teje en una o más pasadas seguidas, y cada columna una bobina de selección: tocar una celda la activa o la desactiva para esa pasada. Al costado de cada fila se indica cuántas pasadas seguidas se teje. Arriba se definen las filas (1 a 300) y las columnas (1 a 8), el nombre del dibujo con su indicador de estado, y una barra con el estado del equipo del telar (conexión, tejido y conteo del sensor). Incluye las herramientas Limpiar, el simulador de color de hilo y la descarga de la ficha técnica en PDF; los controles ▶, Pausa, Retroceder y Detener, que resaltan la fila que se está tejiendo; y los botones Nuevo y Guardar.</w:t>
+        <w:t>grilla interactiva donde cada fila es una combinación de bobinas, que se teje en una o más pasadas seguidas, y cada columna una bobina de selección: tocar una celda la activa o la desactiva para esa pasada. Al costado de cada fila se indica cuántas pasadas seguidas se teje. Arriba se definen las filas (1 a 300) y las columnas (1 a 8), el nombre del dibujo con su indicador de estado, y una barra con el estado del equipo del telar (conexión, tejido y conteo del sensor). Incluye las herramientas Limpiar, el simulador de color de hilo y la descarga de la ficha técnica en PDF; los controles ▶, Pausa, Retroceder y Terminar trabajo (⏹), que resaltan la fila que se está tejiendo; y los botones Nuevo y Guardar.</w:t>
       </w:r>
     </w:p>
     <w:p>
@@ -11774,7 +11774,7 @@
           <w:rFonts w:ascii="IBM Plex Sans" w:cs="IBM Plex Sans" w:eastAsia="IBM Plex Sans" w:hAnsi="IBM Plex Sans"/>
           <w:rtl w:val="0"/>
         </w:rPr>
-        <w:t>Barra con el estado del equipo del telar (conexión, tejido y conteo del sensor) y controles ▶, Pausa, Retroceder y Detener, que actúan sobre los relés del Bloque A. No se implementa una parada de emergencia por software: esa función la conserva la botonera física del telar, que sigue operable en todo momento.</w:t>
+        <w:t>Barra con el estado del equipo del telar (conexión, tejido y conteo del sensor) y controles ▶, Pausa, Retroceder y Terminar trabajo (⏹), que actúan sobre los relés del Bloque A. No se implementa una parada de emergencia por software: esa función la conserva la botonera física del telar, que sigue operable en todo momento.</w:t>
       </w:r>
     </w:p>
     <w:p>
@@ -16376,13 +16376,7 @@
               <w:rPr>
                 <w:rFonts w:ascii="IBM Plex Sans" w:hAnsi="IBM Plex Sans" w:cs="IBM Plex Sans" w:eastAsia="IBM Plex Sans"/>
               </w:rPr>
-            </w:r>
-            <w:r>
-              <w:rPr>
-                <w:rFonts w:ascii="IBM Plex Sans" w:hAnsi="IBM Plex Sans" w:cs="IBM Plex Sans" w:eastAsia="IBM Plex Sans"/>
-                <w:sz w:val="17"/>
-              </w:rPr>
-              <w:t>Puente rectificador DB157 / DB157 (1 A)</w:t>
+              <w:t xml:space="preserve">Puente rectificador DB157 (1 A)</w:t>
             </w:r>
           </w:p>
         </w:tc>
@@ -16578,13 +16572,7 @@
               <w:rPr>
                 <w:rFonts w:ascii="IBM Plex Sans" w:hAnsi="IBM Plex Sans" w:cs="IBM Plex Sans" w:eastAsia="IBM Plex Sans"/>
               </w:rPr>
-            </w:r>
-            <w:r>
-              <w:rPr>
-                <w:rFonts w:ascii="IBM Plex Sans" w:hAnsi="IBM Plex Sans" w:cs="IBM Plex Sans" w:eastAsia="IBM Plex Sans"/>
-                <w:sz w:val="17"/>
-              </w:rPr>
-              <w:t>Polarización: 3 para los relés (a 3,3 V) y 3 para el sensado. Evitan el accionamiento fantasma al encender.</w:t>
+              <w:t xml:space="preserve">Polarización: 3 para los relés (IN1 e IN2 a 3,3 V; la de Retroceder a GND, porque su módulo es activo-alto) y 3 para el sensado. Evitan el accionamiento fantasma al encender.</w:t>
             </w:r>
           </w:p>
         </w:tc>
@@ -16646,13 +16634,7 @@
               <w:rPr>
                 <w:rFonts w:ascii="IBM Plex Sans" w:hAnsi="IBM Plex Sans" w:cs="IBM Plex Sans" w:eastAsia="IBM Plex Sans"/>
               </w:rPr>
-            </w:r>
-            <w:r>
-              <w:rPr>
-                <w:rFonts w:ascii="IBM Plex Sans" w:hAnsi="IBM Plex Sans" w:cs="IBM Plex Sans" w:eastAsia="IBM Plex Sans"/>
-                <w:sz w:val="17"/>
-              </w:rPr>
-              <w:t>Capacitor cerámico 100 nF</w:t>
+              <w:t xml:space="preserve">Capacitores: cerámicos de 100 nF y electrolíticos de 22–47 µF y 470 µF</w:t>
             </w:r>
           </w:p>
         </w:tc>
@@ -16668,13 +16650,7 @@
               <w:rPr>
                 <w:rFonts w:ascii="IBM Plex Sans" w:hAnsi="IBM Plex Sans" w:cs="IBM Plex Sans" w:eastAsia="IBM Plex Sans"/>
               </w:rPr>
-            </w:r>
-            <w:r>
-              <w:rPr>
-                <w:rFonts w:ascii="IBM Plex Sans" w:hAnsi="IBM Plex Sans" w:cs="IBM Plex Sans" w:eastAsia="IBM Plex Sans"/>
-                <w:sz w:val="17"/>
-              </w:rPr>
-              <w:t>Desacople junto al ESP32 y al módulo de relés: filtra el ruido de conmutación.</w:t>
+              <w:t xml:space="preserve">Los de 100 nF filtran el ruido de conmutación; los de 22–47 µF aplanan la tensión rectificada del sensado (uno por botón: sin ellos una pulsación se lee como varias); el de 470 µF sostiene los 5 V cuando engancha un relé.</w:t>
             </w:r>
           </w:p>
         </w:tc>
@@ -16690,13 +16666,7 @@
               <w:rPr>
                 <w:rFonts w:ascii="IBM Plex Sans" w:hAnsi="IBM Plex Sans" w:cs="IBM Plex Sans" w:eastAsia="IBM Plex Sans"/>
               </w:rPr>
-            </w:r>
-            <w:r>
-              <w:rPr>
-                <w:rFonts w:ascii="IBM Plex Sans" w:hAnsi="IBM Plex Sans" w:cs="IBM Plex Sans" w:eastAsia="IBM Plex Sans"/>
-                <w:sz w:val="17"/>
-              </w:rPr>
-              <w:t>3</w:t>
+              <w:t xml:space="preserve">3 + 3 + 1</w:t>
             </w:r>
           </w:p>
         </w:tc>
@@ -17089,13 +17059,7 @@
               <w:rPr>
                 <w:rFonts w:ascii="IBM Plex Sans" w:hAnsi="IBM Plex Sans" w:cs="IBM Plex Sans" w:eastAsia="IBM Plex Sans"/>
               </w:rPr>
-            </w:r>
-            <w:r>
-              <w:rPr>
-                <w:rFonts w:ascii="IBM Plex Sans" w:hAnsi="IBM Plex Sans" w:cs="IBM Plex Sans" w:eastAsia="IBM Plex Sans"/>
-                <w:sz w:val="17"/>
-              </w:rPr>
-              <w:t>Optoacoplador PC817 + resistencias</w:t>
+              <w:t xml:space="preserve">Optoacoplador PC817 + resistencias de 1,2 kΩ y 10 kΩ</w:t>
             </w:r>
           </w:p>
         </w:tc>
@@ -17217,13 +17181,7 @@
               <w:rPr>
                 <w:rFonts w:ascii="IBM Plex Sans" w:hAnsi="IBM Plex Sans" w:cs="IBM Plex Sans" w:eastAsia="IBM Plex Sans"/>
               </w:rPr>
-            </w:r>
-            <w:r>
-              <w:rPr>
-                <w:rFonts w:ascii="IBM Plex Sans" w:hAnsi="IBM Plex Sans" w:cs="IBM Plex Sans" w:eastAsia="IBM Plex Sans"/>
-                <w:sz w:val="17"/>
-              </w:rPr>
-              <w:t>3</w:t>
+              <w:t xml:space="preserve">4</w:t>
             </w:r>
           </w:p>
         </w:tc>
@@ -17307,13 +17265,7 @@
               <w:rPr>
                 <w:rFonts w:ascii="IBM Plex Sans" w:hAnsi="IBM Plex Sans" w:cs="IBM Plex Sans" w:eastAsia="IBM Plex Sans"/>
               </w:rPr>
-            </w:r>
-            <w:r>
-              <w:rPr>
-                <w:rFonts w:ascii="IBM Plex Sans" w:hAnsi="IBM Plex Sans" w:cs="IBM Plex Sans" w:eastAsia="IBM Plex Sans"/>
-                <w:sz w:val="17"/>
-              </w:rPr>
-              <w:t>1</w:t>
+              <w:t xml:space="preserve">0</w:t>
             </w:r>
           </w:p>
         </w:tc>
@@ -17391,13 +17343,7 @@
               <w:rPr>
                 <w:rFonts w:ascii="IBM Plex Sans" w:hAnsi="IBM Plex Sans" w:cs="IBM Plex Sans" w:eastAsia="IBM Plex Sans"/>
               </w:rPr>
-            </w:r>
-            <w:r>
-              <w:rPr>
-                <w:rFonts w:ascii="IBM Plex Sans" w:hAnsi="IBM Plex Sans" w:cs="IBM Plex Sans" w:eastAsia="IBM Plex Sans"/>
-                <w:sz w:val="17"/>
-              </w:rPr>
-              <w:t>a definir</w:t>
+              <w:t xml:space="preserve">4</w:t>
             </w:r>
           </w:p>
         </w:tc>
@@ -17437,13 +17383,7 @@
               <w:rPr>
                 <w:rFonts w:ascii="IBM Plex Sans" w:hAnsi="IBM Plex Sans" w:cs="IBM Plex Sans" w:eastAsia="IBM Plex Sans"/>
               </w:rPr>
-            </w:r>
-            <w:r>
-              <w:rPr>
-                <w:rFonts w:ascii="IBM Plex Sans" w:hAnsi="IBM Plex Sans" w:cs="IBM Plex Sans" w:eastAsia="IBM Plex Sans"/>
-                <w:sz w:val="17"/>
-              </w:rPr>
-              <w:t>(no aplica: las bobinas se alimentan desde el telar)</w:t>
+              <w:t xml:space="preserve">Resistencias de 330 Ω y 10 kΩ, una de cada por canal</w:t>
             </w:r>
           </w:p>
         </w:tc>
@@ -17459,13 +17399,7 @@
               <w:rPr>
                 <w:rFonts w:ascii="IBM Plex Sans" w:hAnsi="IBM Plex Sans" w:cs="IBM Plex Sans" w:eastAsia="IBM Plex Sans"/>
               </w:rPr>
-            </w:r>
-            <w:r>
-              <w:rPr>
-                <w:rFonts w:ascii="IBM Plex Sans" w:hAnsi="IBM Plex Sans" w:cs="IBM Plex Sans" w:eastAsia="IBM Plex Sans"/>
-                <w:sz w:val="17"/>
-              </w:rPr>
-              <w:t>El propio telar alimenta las bobinas. El sistema solo conmuta la señal del lector óptico. tras medir las bobinas instaladas.</w:t>
+              <w:t xml:space="preserve">La de 330 Ω limita la corriente del LED de entrada del LCA110 y la de 10 kΩ mantiene la salida en bajo mientras el ESP32 arranca. No hace falta fuente aparte: las bobinas las sigue alimentando el telar y el sistema solo conmuta la señal del lector óptico.</w:t>
             </w:r>
           </w:p>
         </w:tc>
@@ -17481,13 +17415,7 @@
               <w:rPr>
                 <w:rFonts w:ascii="IBM Plex Sans" w:hAnsi="IBM Plex Sans" w:cs="IBM Plex Sans" w:eastAsia="IBM Plex Sans"/>
               </w:rPr>
-            </w:r>
-            <w:r>
-              <w:rPr>
-                <w:rFonts w:ascii="IBM Plex Sans" w:hAnsi="IBM Plex Sans" w:cs="IBM Plex Sans" w:eastAsia="IBM Plex Sans"/>
-                <w:sz w:val="17"/>
-              </w:rPr>
-              <w:t>1</w:t>
+              <w:t xml:space="preserve">4 + 4</w:t>
             </w:r>
           </w:p>
         </w:tc>

</xml_diff>

<commit_message>
Decimoquinta revisión: contraste del color de hilo, coherencia de bobinas y documentos
- Web: el texto de las celdas y el número de la fila activa se leen sobre
  cualquier color de hilo (antes 1,6:1 con bordó en modo oscuro).
- verif_coherencia.py: la cantidad de bobinas es la misma en web, firmware y
  base (19/19).
- Documentación de Proyecto: esquema SQL, modelo de la matriz, tablas,
  requerimientos, endpoints, hardware y otros datos viejos corregidos.
- Manual Telar Fábrica, LEEME de verificación y análisis histórico.

Co-Authored-By: Claude Opus 5.5 <noreply@anthropic.com>
Claude-Session: https://claude.ai/code/session_01QiY8ZZNAM9gwPKiqSkCaaj
</commit_message>
<xml_diff>
--- a/documentacion_proyecto/Documentación_de_Proyecto.docx
+++ b/documentacion_proyecto/Documentación_de_Proyecto.docx
@@ -1965,7 +1965,7 @@
           <w:rFonts w:ascii="IBM Plex Sans" w:cs="IBM Plex Sans" w:eastAsia="IBM Plex Sans" w:hAnsi="IBM Plex Sans"/>
           <w:rtl w:val="0"/>
         </w:rPr>
-        <w:t xml:space="preserve"> Constituye el alcance actual del proyecto. Consiste en una intervención no invasiva sobre la electrónica de control del telar, operando exclusivamente sobre la línea de encendido y detención (Play/Pausa) mediante relés optoacoplados conectados en paralelo a la botonera física existente. La sincronización y el conteo de pasadas se ejecutan a través de un sensor inductivo/óptico montado sobre la estructura mecánica. La persistencia local y la gestión del catálogo de matrices se sincronizan con una plataforma web en la nube. </w:t>
+        <w:t xml:space="preserve"> Constituye el alcance actual del proyecto. Consiste en una intervención no invasiva sobre la electrónica de control del telar, operando exclusivamente sobre los botones de Marcha, Pausa y Retroceder mediante relés optoacoplados conectados en paralelo a la botonera física existente. La sincronización y el conteo de pasadas se ejecutan a través de un sensor inductivo/óptico montado sobre la estructura mecánica. El catálogo de dibujos, el estado del telar y la producción se guardan en una base de datos en la nube, a la que acceden la web y el nodo de control a través del backend. </w:t>
       </w:r>
     </w:p>
     <w:p>
@@ -2453,7 +2453,7 @@
                 <w:rFonts w:ascii="IBM Plex Sans" w:hAnsi="IBM Plex Sans" w:cs="IBM Plex Sans" w:eastAsia="IBM Plex Sans"/>
                 <w:sz w:val="18"/>
               </w:rPr>
-              <w:t>Reglas por las que la web, la app y el ESP32 le piden datos al backend. Ninguno accede a la base de datos directamente.</w:t>
+              <w:t>Reglas por las que la web y el ESP32 le piden datos al backend. Ninguno accede a la base de datos directamente.</w:t>
             </w:r>
           </w:p>
         </w:tc>
@@ -3201,7 +3201,7 @@
                 <w:rFonts w:ascii="IBM Plex Sans" w:hAnsi="IBM Plex Sans" w:cs="IBM Plex Sans" w:eastAsia="IBM Plex Sans"/>
                 <w:sz w:val="18"/>
               </w:rPr>
-              <w:t>Cada inserción de un hilo de trama a lo ancho del telar. Una fila del patrón equivale a una pasada.</w:t>
+              <w:t>Cada inserción de un hilo de trama a lo ancho del telar. Cada fila del dibujo se teje en una o más pasadas seguidas (sus repeticiones).</w:t>
             </w:r>
           </w:p>
         </w:tc>
@@ -4008,7 +4008,7 @@
               <w:rFonts w:ascii="IBM Plex Sans" w:cs="IBM Plex Sans" w:eastAsia="IBM Plex Sans" w:hAnsi="IBM Plex Sans"/>
               <w:rtl w:val="0"/>
             </w:rPr>
-            <w:t xml:space="preserve">La plataforma se organiza en tres vistas principales (Inicio, Editor y Biblioteca), diseñadas bajo un enfoque mobile-first: el operario abre la web desde el navegador de su celular. En pantallas de escritorio (≥1024px) la navegación se reorganiza en una barra lateral (Sidebar) o menú superior; en celular se usa una barra de navegación inferior (Bottom Navigation Bar) con iconos y etiquetas, siguiendo los lineamientos del Design System del proyecto para garantizar alta legibilidad en entornos industriales.</w:t>
+            <w:t xml:space="preserve">La plataforma se organiza en tres vistas principales (Inicio, Editor y Biblioteca), diseñadas bajo un enfoque mobile-first: el operario abre la web desde el navegador de su celular. En celular y en computadora se usa la misma columna de hasta 430 px, con una barra de navegación inferior (Bottom Navigation Bar) con iconos y etiquetas, siguiendo los lineamientos del Design System del proyecto para garantizar alta legibilidad en entornos industriales.</w:t>
           </w:r>
         </w:sdtContent>
       </w:sdt>
@@ -4471,7 +4471,7 @@
                 <w:rFonts w:ascii="IBM Plex Sans" w:cs="IBM Plex Sans" w:eastAsia="IBM Plex Sans" w:hAnsi="IBM Plex Sans"/>
                 <w:rtl w:val="0"/>
               </w:rPr>
-              <w:t>nombre, filas, columnas, matriz_pasadas (JSONB), matriz_ligamento (JSONB), colores_filas (JSONB), metadata (JSONB)</w:t>
+              <w:t>nombre, filas (1 a 300), columnas (1 a 8), matriz_pasadas (JSONB), matriz_ligamento (JSONB), repeticiones_por_fila, colores_filas (JSONB), metadata (JSONB), metros_por_pasada, creado_por_invitado</w:t>
             </w:r>
           </w:p>
         </w:tc>
@@ -4563,7 +4563,7 @@
                 <w:rFonts w:ascii="IBM Plex Sans" w:cs="IBM Plex Sans" w:eastAsia="IBM Plex Sans" w:hAnsi="IBM Plex Sans"/>
                 <w:rtl w:val="0"/>
               </w:rPr>
-              <w:t>codigo, nombre, estado (apagado/tejiendo/pausado/error), patron_actual_id</w:t>
+              <w:t>codigo, nombre, estado (apagado/tejiendo/pausado/error), motivo_pausa, patron_actual_id, elementos_seleccion, y las señales del ESP32 (último sondeo, órdenes de Retroceder, retrocesos contados, uso manual de la botonera, posición incierta)</w:t>
             </w:r>
           </w:p>
         </w:tc>
@@ -4663,7 +4663,7 @@
                 <w:rFonts w:ascii="IBM Plex Sans" w:cs="IBM Plex Sans" w:eastAsia="IBM Plex Sans" w:hAnsi="IBM Plex Sans"/>
                 <w:rtl w:val="0"/>
               </w:rPr>
-              <w:t>telar_id, patron_id, fecha_inicio, fecha_fin, pasadas_totales, fila_actual, columna_actual, pasada_actual, vueltas_completadas, estado</w:t>
+              <w:t>telar_id, patron_id, fecha_inicio, fecha_fin, fila_actual, repeticion_en_fila, vueltas_completadas, pasadas_totales (estimadas por reloj), pasadas_sensor (medidas), conteo_validado, estado</w:t>
             </w:r>
           </w:p>
         </w:tc>
@@ -4951,7 +4951,7 @@
           <w:rFonts w:ascii="IBM Plex Sans" w:cs="IBM Plex Sans" w:eastAsia="IBM Plex Sans" w:hAnsi="IBM Plex Sans"/>
           <w:rtl w:val="0"/>
         </w:rPr>
-        <w:t>El almacenamiento persistente utiliza PostgreSQL (alojado en Neon) aprovechando sus capacidades relacionales y el tipo de dato nativo JSONB para las matrices de patrones. A continuación, el esquema real:</w:t>
+        <w:t>El almacenamiento persistente utiliza PostgreSQL (alojado en Neon) aprovechando sus capacidades relacionales y el tipo de dato nativo JSONB para las matrices de patrones. A continuación, el esquema actual, resumido (la definición completa, con todas las restricciones, está en database/01_base_de_datos_completa.sql):</w:t>
       </w:r>
     </w:p>
     <w:p>
@@ -4984,167 +4984,7 @@
           <w:sz w:val="16"/>
           <w:rtl w:val="0"/>
         </w:rPr>
-        <w:t>CREATE TABLE patrones (</w:t>
-      </w:r>
-    </w:p>
-    <w:p>
-      <w:pPr>
-        <w:spacing w:after="0" w:before="0" w:line="240" w:lineRule="auto"/>
-        <w:jc w:val="both"/>
-        <w:rPr>
-          <w:rFonts w:ascii="IBM Plex Sans" w:cs="IBM Plex Sans" w:eastAsia="IBM Plex Sans" w:hAnsi="IBM Plex Sans"/>
-        </w:rPr>
-      </w:pPr>
-      <w:r>
-        <w:rPr>
-          <w:rFonts w:ascii="IBM Plex Sans" w:cs="IBM Plex Sans" w:eastAsia="IBM Plex Sans" w:hAnsi="IBM Plex Sans"/>
-          <w:rtl w:val="0"/>
-        </w:rPr>
-        <w:t xml:space="preserve">  id                SERIAL PRIMARY KEY,</w:t>
-      </w:r>
-    </w:p>
-    <w:p>
-      <w:pPr>
-        <w:spacing w:after="0" w:before="0" w:line="240" w:lineRule="auto"/>
-        <w:jc w:val="both"/>
-        <w:rPr>
-          <w:rFonts w:ascii="IBM Plex Sans" w:cs="IBM Plex Sans" w:eastAsia="IBM Plex Sans" w:hAnsi="IBM Plex Sans"/>
-        </w:rPr>
-      </w:pPr>
-      <w:r>
-        <w:rPr>
-          <w:rFonts w:ascii="IBM Plex Sans" w:cs="IBM Plex Sans" w:eastAsia="IBM Plex Sans" w:hAnsi="IBM Plex Sans"/>
-          <w:rtl w:val="0"/>
-        </w:rPr>
-        <w:t xml:space="preserve">  nombre            TEXT NOT NULL UNIQUE,</w:t>
-      </w:r>
-    </w:p>
-    <w:p>
-      <w:pPr>
-        <w:spacing w:after="0" w:before="0" w:line="240" w:lineRule="auto"/>
-        <w:jc w:val="both"/>
-        <w:rPr>
-          <w:rFonts w:ascii="IBM Plex Sans" w:cs="IBM Plex Sans" w:eastAsia="IBM Plex Sans" w:hAnsi="IBM Plex Sans"/>
-        </w:rPr>
-      </w:pPr>
-      <w:r>
-        <w:rPr>
-          <w:rFonts w:ascii="IBM Plex Sans" w:cs="IBM Plex Sans" w:eastAsia="IBM Plex Sans" w:hAnsi="IBM Plex Sans"/>
-          <w:rtl w:val="0"/>
-        </w:rPr>
-        <w:t xml:space="preserve">  filas             INTEGER NOT NULL CHECK (filas &gt; 0),</w:t>
-      </w:r>
-    </w:p>
-    <w:p>
-      <w:pPr>
-        <w:spacing w:after="0" w:before="0" w:line="240" w:lineRule="auto"/>
-        <w:jc w:val="both"/>
-        <w:rPr>
-          <w:rFonts w:ascii="IBM Plex Sans" w:cs="IBM Plex Sans" w:eastAsia="IBM Plex Sans" w:hAnsi="IBM Plex Sans"/>
-        </w:rPr>
-      </w:pPr>
-      <w:r>
-        <w:rPr>
-          <w:rFonts w:ascii="IBM Plex Sans" w:cs="IBM Plex Sans" w:eastAsia="IBM Plex Sans" w:hAnsi="IBM Plex Sans"/>
-          <w:rtl w:val="0"/>
-        </w:rPr>
-        <w:t xml:space="preserve">  columnas          INTEGER NOT NULL CHECK (columnas &gt; 0),</w:t>
-      </w:r>
-    </w:p>
-    <w:p>
-      <w:pPr>
-        <w:spacing w:after="0" w:before="0" w:line="240" w:lineRule="auto"/>
-        <w:jc w:val="both"/>
-        <w:rPr>
-          <w:rFonts w:ascii="IBM Plex Sans" w:cs="IBM Plex Sans" w:eastAsia="IBM Plex Sans" w:hAnsi="IBM Plex Sans"/>
-        </w:rPr>
-      </w:pPr>
-      <w:r>
-        <w:rPr>
-          <w:rFonts w:ascii="IBM Plex Sans" w:cs="IBM Plex Sans" w:eastAsia="IBM Plex Sans" w:hAnsi="IBM Plex Sans"/>
-          <w:rtl w:val="0"/>
-        </w:rPr>
-        <w:t xml:space="preserve">  matriz_pasadas    JSONB NOT NULL,   -- repeticiones de fila (enteros 0,1,2,3...)</w:t>
-      </w:r>
-    </w:p>
-    <w:p>
-      <w:pPr>
-        <w:spacing w:after="0" w:before="0" w:line="240" w:lineRule="auto"/>
-        <w:jc w:val="both"/>
-        <w:rPr>
-          <w:rFonts w:ascii="IBM Plex Sans" w:cs="IBM Plex Sans" w:eastAsia="IBM Plex Sans" w:hAnsi="IBM Plex Sans"/>
-        </w:rPr>
-      </w:pPr>
-      <w:r>
-        <w:rPr>
-          <w:rFonts w:ascii="IBM Plex Sans" w:cs="IBM Plex Sans" w:eastAsia="IBM Plex Sans" w:hAnsi="IBM Plex Sans"/>
-          <w:rtl w:val="0"/>
-        </w:rPr>
-        <w:t xml:space="preserve">  matriz_ligamento  JSONB,            -- binario (0/1), derivado automáticamente</w:t>
-      </w:r>
-    </w:p>
-    <w:p>
-      <w:pPr>
-        <w:spacing w:after="0" w:before="0" w:line="240" w:lineRule="auto"/>
-        <w:jc w:val="both"/>
-        <w:rPr>
-          <w:rFonts w:ascii="IBM Plex Sans" w:cs="IBM Plex Sans" w:eastAsia="IBM Plex Sans" w:hAnsi="IBM Plex Sans"/>
-        </w:rPr>
-      </w:pPr>
-      <w:r>
-        <w:rPr>
-          <w:rFonts w:ascii="IBM Plex Sans" w:cs="IBM Plex Sans" w:eastAsia="IBM Plex Sans" w:hAnsi="IBM Plex Sans"/>
-          <w:rtl w:val="0"/>
-        </w:rPr>
-        <w:t xml:space="preserve">  colores_filas     JSONB,            -- color de hilo por fila</w:t>
-      </w:r>
-    </w:p>
-    <w:p>
-      <w:pPr>
-        <w:spacing w:after="0" w:before="0" w:line="240" w:lineRule="auto"/>
-        <w:jc w:val="both"/>
-        <w:rPr>
-          <w:rFonts w:ascii="IBM Plex Sans" w:cs="IBM Plex Sans" w:eastAsia="IBM Plex Sans" w:hAnsi="IBM Plex Sans"/>
-        </w:rPr>
-      </w:pPr>
-      <w:r>
-        <w:rPr>
-          <w:rFonts w:ascii="IBM Plex Sans" w:cs="IBM Plex Sans" w:eastAsia="IBM Plex Sans" w:hAnsi="IBM Plex Sans"/>
-          <w:rtl w:val="0"/>
-        </w:rPr>
-        <w:t xml:space="preserve">  metadata          JSONB,            -- ej: {"tipo": "Tafetán"}</w:t>
-      </w:r>
-    </w:p>
-    <w:p>
-      <w:pPr>
-        <w:spacing w:after="0" w:before="0" w:line="240" w:lineRule="auto"/>
-        <w:jc w:val="both"/>
-        <w:rPr>
-          <w:rFonts w:ascii="IBM Plex Sans" w:cs="IBM Plex Sans" w:eastAsia="IBM Plex Sans" w:hAnsi="IBM Plex Sans"/>
-        </w:rPr>
-      </w:pPr>
-      <w:r>
-        <w:rPr>
-          <w:rFonts w:ascii="IBM Plex Sans" w:cs="IBM Plex Sans" w:eastAsia="IBM Plex Sans" w:hAnsi="IBM Plex Sans"/>
-          <w:rtl w:val="0"/>
-        </w:rPr>
-        <w:t xml:space="preserve">  creado_at         TIMESTAMPTZ NOT NULL DEFAULT now(),</w:t>
-      </w:r>
-    </w:p>
-    <w:p>
-      <w:pPr>
-        <w:spacing w:after="0" w:before="0" w:line="240" w:lineRule="auto"/>
-        <w:jc w:val="both"/>
-        <w:rPr>
-          <w:rFonts w:ascii="IBM Plex Sans" w:cs="IBM Plex Sans" w:eastAsia="IBM Plex Sans" w:hAnsi="IBM Plex Sans"/>
-        </w:rPr>
-      </w:pPr>
-      <w:r>
-        <w:rPr>
-          <w:rFonts w:ascii="IBM Plex Sans" w:cs="IBM Plex Sans" w:eastAsia="IBM Plex Sans" w:hAnsi="IBM Plex Sans"/>
-          <w:rtl w:val="0"/>
-        </w:rPr>
-        <w:t xml:space="preserve">  modificado_at     TIMESTAMPTZ NOT NULL DEFAULT now()</w:t>
+        <w:t xml:space="preserve">CREATE TABLE patrones (</w:t>
       </w:r>
     </w:p>
     <w:p>
@@ -5162,21 +5002,7 @@
           <w:sz w:val="16"/>
           <w:rtl w:val="0"/>
         </w:rPr>
-        <w:t>);</w:t>
-      </w:r>
-    </w:p>
-    <w:p>
-      <w:pPr>
-        <w:spacing w:after="0" w:before="0" w:line="240" w:lineRule="auto"/>
-        <w:rPr>
-          <w:rFonts w:ascii="IBM Plex Sans" w:cs="IBM Plex Sans" w:eastAsia="IBM Plex Sans" w:hAnsi="IBM Plex Sans"/>
-        </w:rPr>
-      </w:pPr>
-      <w:r>
-        <w:rPr>
-          <w:rFonts w:ascii="IBM Plex Sans" w:hAnsi="IBM Plex Sans" w:cs="IBM Plex Sans" w:eastAsia="IBM Plex Sans"/>
-          <w:rtl w:val="0"/>
-        </w:rPr>
+        <w:t xml:space="preserve">  id                     SERIAL PRIMARY KEY,</w:t>
       </w:r>
     </w:p>
     <w:p>
@@ -5194,119 +5020,7 @@
           <w:sz w:val="16"/>
           <w:rtl w:val="0"/>
         </w:rPr>
-        <w:t>CREATE TABLE telares (</w:t>
-      </w:r>
-    </w:p>
-    <w:p>
-      <w:pPr>
-        <w:spacing w:after="0" w:before="0" w:line="240" w:lineRule="auto"/>
-        <w:jc w:val="both"/>
-        <w:rPr>
-          <w:rFonts w:ascii="IBM Plex Sans" w:cs="IBM Plex Sans" w:eastAsia="IBM Plex Sans" w:hAnsi="IBM Plex Sans"/>
-        </w:rPr>
-      </w:pPr>
-      <w:r>
-        <w:rPr>
-          <w:rFonts w:ascii="IBM Plex Sans" w:cs="IBM Plex Sans" w:eastAsia="IBM Plex Sans" w:hAnsi="IBM Plex Sans"/>
-          <w:rtl w:val="0"/>
-        </w:rPr>
-        <w:t xml:space="preserve">  id                SERIAL PRIMARY KEY,</w:t>
-      </w:r>
-    </w:p>
-    <w:p>
-      <w:pPr>
-        <w:spacing w:after="0" w:before="0" w:line="240" w:lineRule="auto"/>
-        <w:jc w:val="both"/>
-        <w:rPr>
-          <w:rFonts w:ascii="IBM Plex Sans" w:cs="IBM Plex Sans" w:eastAsia="IBM Plex Sans" w:hAnsi="IBM Plex Sans"/>
-        </w:rPr>
-      </w:pPr>
-      <w:r>
-        <w:rPr>
-          <w:rFonts w:ascii="IBM Plex Sans" w:cs="IBM Plex Sans" w:eastAsia="IBM Plex Sans" w:hAnsi="IBM Plex Sans"/>
-          <w:rtl w:val="0"/>
-        </w:rPr>
-        <w:t xml:space="preserve">  codigo            TEXT NOT NULL UNIQUE,   -- ej: "TELAR-01"</w:t>
-      </w:r>
-    </w:p>
-    <w:p>
-      <w:pPr>
-        <w:spacing w:after="0" w:before="0" w:line="240" w:lineRule="auto"/>
-        <w:jc w:val="both"/>
-        <w:rPr>
-          <w:rFonts w:ascii="IBM Plex Sans" w:cs="IBM Plex Sans" w:eastAsia="IBM Plex Sans" w:hAnsi="IBM Plex Sans"/>
-        </w:rPr>
-      </w:pPr>
-      <w:r>
-        <w:rPr>
-          <w:rFonts w:ascii="IBM Plex Sans" w:cs="IBM Plex Sans" w:eastAsia="IBM Plex Sans" w:hAnsi="IBM Plex Sans"/>
-          <w:rtl w:val="0"/>
-        </w:rPr>
-        <w:t xml:space="preserve">  nombre            TEXT,</w:t>
-      </w:r>
-    </w:p>
-    <w:p>
-      <w:pPr>
-        <w:spacing w:after="0" w:before="0" w:line="240" w:lineRule="auto"/>
-        <w:jc w:val="both"/>
-        <w:rPr>
-          <w:rFonts w:ascii="IBM Plex Sans" w:cs="IBM Plex Sans" w:eastAsia="IBM Plex Sans" w:hAnsi="IBM Plex Sans"/>
-        </w:rPr>
-      </w:pPr>
-      <w:r>
-        <w:rPr>
-          <w:rFonts w:ascii="IBM Plex Sans" w:cs="IBM Plex Sans" w:eastAsia="IBM Plex Sans" w:hAnsi="IBM Plex Sans"/>
-          <w:rtl w:val="0"/>
-        </w:rPr>
-        <w:t xml:space="preserve">  estado            TEXT NOT NULL DEFAULT 'apagado'</w:t>
-      </w:r>
-    </w:p>
-    <w:p>
-      <w:pPr>
-        <w:spacing w:after="0" w:before="0" w:line="240" w:lineRule="auto"/>
-        <w:jc w:val="both"/>
-        <w:rPr>
-          <w:rFonts w:ascii="IBM Plex Sans" w:cs="IBM Plex Sans" w:eastAsia="IBM Plex Sans" w:hAnsi="IBM Plex Sans"/>
-        </w:rPr>
-      </w:pPr>
-      <w:r>
-        <w:rPr>
-          <w:rFonts w:ascii="IBM Plex Sans" w:cs="IBM Plex Sans" w:eastAsia="IBM Plex Sans" w:hAnsi="IBM Plex Sans"/>
-          <w:rtl w:val="0"/>
-        </w:rPr>
-        <w:t xml:space="preserve">                      CHECK (estado IN ('apagado','tejiendo','pausado','error')),</w:t>
-      </w:r>
-    </w:p>
-    <w:p>
-      <w:pPr>
-        <w:spacing w:after="0" w:before="0" w:line="240" w:lineRule="auto"/>
-        <w:jc w:val="both"/>
-        <w:rPr>
-          <w:rFonts w:ascii="IBM Plex Sans" w:cs="IBM Plex Sans" w:eastAsia="IBM Plex Sans" w:hAnsi="IBM Plex Sans"/>
-        </w:rPr>
-      </w:pPr>
-      <w:r>
-        <w:rPr>
-          <w:rFonts w:ascii="IBM Plex Sans" w:cs="IBM Plex Sans" w:eastAsia="IBM Plex Sans" w:hAnsi="IBM Plex Sans"/>
-          <w:rtl w:val="0"/>
-        </w:rPr>
-        <w:t xml:space="preserve">  patron_actual_id  INTEGER REFERENCES patrones(id) ON DELETE SET NULL,</w:t>
-      </w:r>
-    </w:p>
-    <w:p>
-      <w:pPr>
-        <w:spacing w:after="0" w:before="0" w:line="240" w:lineRule="auto"/>
-        <w:jc w:val="both"/>
-        <w:rPr>
-          <w:rFonts w:ascii="IBM Plex Sans" w:cs="IBM Plex Sans" w:eastAsia="IBM Plex Sans" w:hAnsi="IBM Plex Sans"/>
-        </w:rPr>
-      </w:pPr>
-      <w:r>
-        <w:rPr>
-          <w:rFonts w:ascii="IBM Plex Sans" w:cs="IBM Plex Sans" w:eastAsia="IBM Plex Sans" w:hAnsi="IBM Plex Sans"/>
-          <w:rtl w:val="0"/>
-        </w:rPr>
-        <w:t xml:space="preserve">  creado_at         TIMESTAMPTZ NOT NULL DEFAULT now()</w:t>
+        <w:t xml:space="preserve">  nombre                 TEXT NOT NULL UNIQUE,</w:t>
       </w:r>
     </w:p>
     <w:p>
@@ -5324,21 +5038,7 @@
           <w:sz w:val="16"/>
           <w:rtl w:val="0"/>
         </w:rPr>
-        <w:t>);</w:t>
-      </w:r>
-    </w:p>
-    <w:p>
-      <w:pPr>
-        <w:spacing w:after="0" w:before="0" w:line="240" w:lineRule="auto"/>
-        <w:rPr>
-          <w:rFonts w:ascii="IBM Plex Sans" w:cs="IBM Plex Sans" w:eastAsia="IBM Plex Sans" w:hAnsi="IBM Plex Sans"/>
-        </w:rPr>
-      </w:pPr>
-      <w:r>
-        <w:rPr>
-          <w:rFonts w:ascii="IBM Plex Sans" w:hAnsi="IBM Plex Sans" w:cs="IBM Plex Sans" w:eastAsia="IBM Plex Sans"/>
-          <w:rtl w:val="0"/>
-        </w:rPr>
+        <w:t xml:space="preserve">  filas                  INTEGER NOT NULL CHECK (filas BETWEEN 1 AND 300),</w:t>
       </w:r>
     </w:p>
     <w:p>
@@ -5356,199 +5056,7 @@
           <w:sz w:val="16"/>
           <w:rtl w:val="0"/>
         </w:rPr>
-        <w:t>CREATE TABLE historial_produccion (</w:t>
-      </w:r>
-    </w:p>
-    <w:p>
-      <w:pPr>
-        <w:spacing w:after="0" w:before="0" w:line="240" w:lineRule="auto"/>
-        <w:jc w:val="both"/>
-        <w:rPr>
-          <w:rFonts w:ascii="IBM Plex Sans" w:cs="IBM Plex Sans" w:eastAsia="IBM Plex Sans" w:hAnsi="IBM Plex Sans"/>
-        </w:rPr>
-      </w:pPr>
-      <w:r>
-        <w:rPr>
-          <w:rFonts w:ascii="IBM Plex Sans" w:cs="IBM Plex Sans" w:eastAsia="IBM Plex Sans" w:hAnsi="IBM Plex Sans"/>
-          <w:rtl w:val="0"/>
-        </w:rPr>
-        <w:t xml:space="preserve">  id                   SERIAL PRIMARY KEY,</w:t>
-      </w:r>
-    </w:p>
-    <w:p>
-      <w:pPr>
-        <w:spacing w:after="0" w:before="0" w:line="240" w:lineRule="auto"/>
-        <w:jc w:val="both"/>
-        <w:rPr>
-          <w:rFonts w:ascii="IBM Plex Sans" w:cs="IBM Plex Sans" w:eastAsia="IBM Plex Sans" w:hAnsi="IBM Plex Sans"/>
-        </w:rPr>
-      </w:pPr>
-      <w:r>
-        <w:rPr>
-          <w:rFonts w:ascii="IBM Plex Sans" w:cs="IBM Plex Sans" w:eastAsia="IBM Plex Sans" w:hAnsi="IBM Plex Sans"/>
-          <w:rtl w:val="0"/>
-        </w:rPr>
-        <w:t xml:space="preserve">  telar_id             INTEGER NOT NULL REFERENCES telares(id),</w:t>
-      </w:r>
-    </w:p>
-    <w:p>
-      <w:pPr>
-        <w:spacing w:after="0" w:before="0" w:line="240" w:lineRule="auto"/>
-        <w:jc w:val="both"/>
-        <w:rPr>
-          <w:rFonts w:ascii="IBM Plex Sans" w:cs="IBM Plex Sans" w:eastAsia="IBM Plex Sans" w:hAnsi="IBM Plex Sans"/>
-        </w:rPr>
-      </w:pPr>
-      <w:r>
-        <w:rPr>
-          <w:rFonts w:ascii="IBM Plex Sans" w:cs="IBM Plex Sans" w:eastAsia="IBM Plex Sans" w:hAnsi="IBM Plex Sans"/>
-          <w:rtl w:val="0"/>
-        </w:rPr>
-        <w:t xml:space="preserve">  patron_id            INTEGER NOT NULL REFERENCES patrones(id),</w:t>
-      </w:r>
-    </w:p>
-    <w:p>
-      <w:pPr>
-        <w:spacing w:after="0" w:before="0" w:line="240" w:lineRule="auto"/>
-        <w:jc w:val="both"/>
-        <w:rPr>
-          <w:rFonts w:ascii="IBM Plex Sans" w:cs="IBM Plex Sans" w:eastAsia="IBM Plex Sans" w:hAnsi="IBM Plex Sans"/>
-        </w:rPr>
-      </w:pPr>
-      <w:r>
-        <w:rPr>
-          <w:rFonts w:ascii="IBM Plex Sans" w:cs="IBM Plex Sans" w:eastAsia="IBM Plex Sans" w:hAnsi="IBM Plex Sans"/>
-          <w:rtl w:val="0"/>
-        </w:rPr>
-        <w:t xml:space="preserve">  fecha_inicio         TIMESTAMPTZ NOT NULL DEFAULT now(),</w:t>
-      </w:r>
-    </w:p>
-    <w:p>
-      <w:pPr>
-        <w:spacing w:after="0" w:before="0" w:line="240" w:lineRule="auto"/>
-        <w:jc w:val="both"/>
-        <w:rPr>
-          <w:rFonts w:ascii="IBM Plex Sans" w:cs="IBM Plex Sans" w:eastAsia="IBM Plex Sans" w:hAnsi="IBM Plex Sans"/>
-        </w:rPr>
-      </w:pPr>
-      <w:r>
-        <w:rPr>
-          <w:rFonts w:ascii="IBM Plex Sans" w:cs="IBM Plex Sans" w:eastAsia="IBM Plex Sans" w:hAnsi="IBM Plex Sans"/>
-          <w:rtl w:val="0"/>
-        </w:rPr>
-        <w:t xml:space="preserve">  fecha_fin            TIMESTAMPTZ,        -- NULL mientras está en curso</w:t>
-      </w:r>
-    </w:p>
-    <w:p>
-      <w:pPr>
-        <w:spacing w:after="0" w:before="0" w:line="240" w:lineRule="auto"/>
-        <w:jc w:val="both"/>
-        <w:rPr>
-          <w:rFonts w:ascii="IBM Plex Sans" w:cs="IBM Plex Sans" w:eastAsia="IBM Plex Sans" w:hAnsi="IBM Plex Sans"/>
-        </w:rPr>
-      </w:pPr>
-      <w:r>
-        <w:rPr>
-          <w:rFonts w:ascii="IBM Plex Sans" w:cs="IBM Plex Sans" w:eastAsia="IBM Plex Sans" w:hAnsi="IBM Plex Sans"/>
-          <w:rtl w:val="0"/>
-        </w:rPr>
-        <w:t xml:space="preserve">  pasadas_totales      INTEGER DEFAULT 0,</w:t>
-      </w:r>
-    </w:p>
-    <w:p>
-      <w:pPr>
-        <w:spacing w:after="0" w:before="0" w:line="240" w:lineRule="auto"/>
-        <w:jc w:val="both"/>
-        <w:rPr>
-          <w:rFonts w:ascii="IBM Plex Sans" w:cs="IBM Plex Sans" w:eastAsia="IBM Plex Sans" w:hAnsi="IBM Plex Sans"/>
-        </w:rPr>
-      </w:pPr>
-      <w:r>
-        <w:rPr>
-          <w:rFonts w:ascii="IBM Plex Sans" w:cs="IBM Plex Sans" w:eastAsia="IBM Plex Sans" w:hAnsi="IBM Plex Sans"/>
-          <w:rtl w:val="0"/>
-        </w:rPr>
-        <w:t xml:space="preserve">  fila_actual          INTEGER DEFAULT 0,  -- posición exacta para retroceder</w:t>
-      </w:r>
-    </w:p>
-    <w:p>
-      <w:pPr>
-        <w:spacing w:after="0" w:before="0" w:line="240" w:lineRule="auto"/>
-        <w:jc w:val="both"/>
-        <w:rPr>
-          <w:rFonts w:ascii="IBM Plex Sans" w:cs="IBM Plex Sans" w:eastAsia="IBM Plex Sans" w:hAnsi="IBM Plex Sans"/>
-        </w:rPr>
-      </w:pPr>
-      <w:r>
-        <w:rPr>
-          <w:rFonts w:ascii="IBM Plex Sans" w:cs="IBM Plex Sans" w:eastAsia="IBM Plex Sans" w:hAnsi="IBM Plex Sans"/>
-          <w:rtl w:val="0"/>
-        </w:rPr>
-        <w:t xml:space="preserve">  columna_actual       INTEGER DEFAULT 0,</w:t>
-      </w:r>
-    </w:p>
-    <w:p>
-      <w:pPr>
-        <w:spacing w:after="0" w:before="0" w:line="240" w:lineRule="auto"/>
-        <w:jc w:val="both"/>
-        <w:rPr>
-          <w:rFonts w:ascii="IBM Plex Sans" w:cs="IBM Plex Sans" w:eastAsia="IBM Plex Sans" w:hAnsi="IBM Plex Sans"/>
-        </w:rPr>
-      </w:pPr>
-      <w:r>
-        <w:rPr>
-          <w:rFonts w:ascii="IBM Plex Sans" w:cs="IBM Plex Sans" w:eastAsia="IBM Plex Sans" w:hAnsi="IBM Plex Sans"/>
-          <w:rtl w:val="0"/>
-        </w:rPr>
-        <w:t xml:space="preserve">  pasada_actual        INTEGER DEFAULT 0,</w:t>
-      </w:r>
-    </w:p>
-    <w:p>
-      <w:pPr>
-        <w:spacing w:after="0" w:before="0" w:line="240" w:lineRule="auto"/>
-        <w:jc w:val="both"/>
-        <w:rPr>
-          <w:rFonts w:ascii="IBM Plex Sans" w:cs="IBM Plex Sans" w:eastAsia="IBM Plex Sans" w:hAnsi="IBM Plex Sans"/>
-        </w:rPr>
-      </w:pPr>
-      <w:r>
-        <w:rPr>
-          <w:rFonts w:ascii="IBM Plex Sans" w:cs="IBM Plex Sans" w:eastAsia="IBM Plex Sans" w:hAnsi="IBM Plex Sans"/>
-          <w:rtl w:val="0"/>
-        </w:rPr>
-        <w:t xml:space="preserve">  vueltas_completadas  INTEGER DEFAULT 0,  -- el tejido no tiene "final": es un bucle</w:t>
-      </w:r>
-    </w:p>
-    <w:p>
-      <w:pPr>
-        <w:spacing w:after="0" w:before="0" w:line="240" w:lineRule="auto"/>
-        <w:jc w:val="both"/>
-        <w:rPr>
-          <w:rFonts w:ascii="IBM Plex Sans" w:cs="IBM Plex Sans" w:eastAsia="IBM Plex Sans" w:hAnsi="IBM Plex Sans"/>
-        </w:rPr>
-      </w:pPr>
-      <w:r>
-        <w:rPr>
-          <w:rFonts w:ascii="IBM Plex Sans" w:cs="IBM Plex Sans" w:eastAsia="IBM Plex Sans" w:hAnsi="IBM Plex Sans"/>
-          <w:rtl w:val="0"/>
-        </w:rPr>
-        <w:t xml:space="preserve">  estado               TEXT NOT NULL DEFAULT 'en_curso'</w:t>
-      </w:r>
-    </w:p>
-    <w:p>
-      <w:pPr>
-        <w:spacing w:after="0" w:before="0" w:line="240" w:lineRule="auto"/>
-        <w:jc w:val="both"/>
-        <w:rPr>
-          <w:rFonts w:ascii="IBM Plex Sans" w:cs="IBM Plex Sans" w:eastAsia="IBM Plex Sans" w:hAnsi="IBM Plex Sans"/>
-        </w:rPr>
-      </w:pPr>
-      <w:r>
-        <w:rPr>
-          <w:rFonts w:ascii="IBM Plex Sans" w:cs="IBM Plex Sans" w:eastAsia="IBM Plex Sans" w:hAnsi="IBM Plex Sans"/>
-          <w:rtl w:val="0"/>
-        </w:rPr>
-        <w:t xml:space="preserve">                          CHECK (estado IN ('en_curso','finalizado','detenido_manual'))</w:t>
+        <w:t xml:space="preserve">  columnas               INTEGER NOT NULL CHECK (columnas BETWEEN 1 AND 8),  -- una por bobina</w:t>
       </w:r>
     </w:p>
     <w:p>
@@ -5566,21 +5074,7 @@
           <w:sz w:val="16"/>
           <w:rtl w:val="0"/>
         </w:rPr>
-        <w:t>);</w:t>
-      </w:r>
-    </w:p>
-    <w:p>
-      <w:pPr>
-        <w:spacing w:after="0" w:before="0" w:line="240" w:lineRule="auto"/>
-        <w:rPr>
-          <w:rFonts w:ascii="IBM Plex Sans" w:cs="IBM Plex Sans" w:eastAsia="IBM Plex Sans" w:hAnsi="IBM Plex Sans"/>
-        </w:rPr>
-      </w:pPr>
-      <w:r>
-        <w:rPr>
-          <w:rFonts w:ascii="IBM Plex Sans" w:hAnsi="IBM Plex Sans" w:cs="IBM Plex Sans" w:eastAsia="IBM Plex Sans"/>
-          <w:rtl w:val="0"/>
-        </w:rPr>
+        <w:t xml:space="preserve">  matriz_pasadas         JSONB NOT NULL,   -- una fila por combinación; celda 1 = la bobina se activa</w:t>
       </w:r>
     </w:p>
     <w:p>
@@ -5598,103 +5092,7 @@
           <w:sz w:val="16"/>
           <w:rtl w:val="0"/>
         </w:rPr>
-        <w:t>CREATE TABLE errores_log (</w:t>
-      </w:r>
-    </w:p>
-    <w:p>
-      <w:pPr>
-        <w:spacing w:after="0" w:before="0" w:line="240" w:lineRule="auto"/>
-        <w:jc w:val="both"/>
-        <w:rPr>
-          <w:rFonts w:ascii="IBM Plex Sans" w:cs="IBM Plex Sans" w:eastAsia="IBM Plex Sans" w:hAnsi="IBM Plex Sans"/>
-        </w:rPr>
-      </w:pPr>
-      <w:r>
-        <w:rPr>
-          <w:rFonts w:ascii="IBM Plex Sans" w:cs="IBM Plex Sans" w:eastAsia="IBM Plex Sans" w:hAnsi="IBM Plex Sans"/>
-          <w:rtl w:val="0"/>
-        </w:rPr>
-        <w:t xml:space="preserve">  id          SERIAL PRIMARY KEY,</w:t>
-      </w:r>
-    </w:p>
-    <w:p>
-      <w:pPr>
-        <w:spacing w:after="0" w:before="0" w:line="240" w:lineRule="auto"/>
-        <w:jc w:val="both"/>
-        <w:rPr>
-          <w:rFonts w:ascii="IBM Plex Sans" w:cs="IBM Plex Sans" w:eastAsia="IBM Plex Sans" w:hAnsi="IBM Plex Sans"/>
-        </w:rPr>
-      </w:pPr>
-      <w:r>
-        <w:rPr>
-          <w:rFonts w:ascii="IBM Plex Sans" w:cs="IBM Plex Sans" w:eastAsia="IBM Plex Sans" w:hAnsi="IBM Plex Sans"/>
-          <w:rtl w:val="0"/>
-        </w:rPr>
-        <w:t xml:space="preserve">  telar_id    INTEGER REFERENCES telares(id),</w:t>
-      </w:r>
-    </w:p>
-    <w:p>
-      <w:pPr>
-        <w:spacing w:after="0" w:before="0" w:line="240" w:lineRule="auto"/>
-        <w:jc w:val="both"/>
-        <w:rPr>
-          <w:rFonts w:ascii="IBM Plex Sans" w:cs="IBM Plex Sans" w:eastAsia="IBM Plex Sans" w:hAnsi="IBM Plex Sans"/>
-        </w:rPr>
-      </w:pPr>
-      <w:r>
-        <w:rPr>
-          <w:rFonts w:ascii="IBM Plex Sans" w:cs="IBM Plex Sans" w:eastAsia="IBM Plex Sans" w:hAnsi="IBM Plex Sans"/>
-          <w:rtl w:val="0"/>
-        </w:rPr>
-        <w:t xml:space="preserve">  titulo      TEXT,</w:t>
-      </w:r>
-    </w:p>
-    <w:p>
-      <w:pPr>
-        <w:spacing w:after="0" w:before="0" w:line="240" w:lineRule="auto"/>
-        <w:jc w:val="both"/>
-        <w:rPr>
-          <w:rFonts w:ascii="IBM Plex Sans" w:cs="IBM Plex Sans" w:eastAsia="IBM Plex Sans" w:hAnsi="IBM Plex Sans"/>
-        </w:rPr>
-      </w:pPr>
-      <w:r>
-        <w:rPr>
-          <w:rFonts w:ascii="IBM Plex Sans" w:cs="IBM Plex Sans" w:eastAsia="IBM Plex Sans" w:hAnsi="IBM Plex Sans"/>
-          <w:rtl w:val="0"/>
-        </w:rPr>
-        <w:t xml:space="preserve">  mensaje     TEXT,</w:t>
-      </w:r>
-    </w:p>
-    <w:p>
-      <w:pPr>
-        <w:spacing w:after="0" w:before="0" w:line="240" w:lineRule="auto"/>
-        <w:jc w:val="both"/>
-        <w:rPr>
-          <w:rFonts w:ascii="IBM Plex Sans" w:cs="IBM Plex Sans" w:eastAsia="IBM Plex Sans" w:hAnsi="IBM Plex Sans"/>
-        </w:rPr>
-      </w:pPr>
-      <w:r>
-        <w:rPr>
-          <w:rFonts w:ascii="IBM Plex Sans" w:cs="IBM Plex Sans" w:eastAsia="IBM Plex Sans" w:hAnsi="IBM Plex Sans"/>
-          <w:rtl w:val="0"/>
-        </w:rPr>
-        <w:t xml:space="preserve">  codigo      TEXT,</w:t>
-      </w:r>
-    </w:p>
-    <w:p>
-      <w:pPr>
-        <w:spacing w:after="0" w:before="0" w:line="240" w:lineRule="auto"/>
-        <w:jc w:val="both"/>
-        <w:rPr>
-          <w:rFonts w:ascii="IBM Plex Sans" w:cs="IBM Plex Sans" w:eastAsia="IBM Plex Sans" w:hAnsi="IBM Plex Sans"/>
-        </w:rPr>
-      </w:pPr>
-      <w:r>
-        <w:rPr>
-          <w:rFonts w:ascii="IBM Plex Sans" w:cs="IBM Plex Sans" w:eastAsia="IBM Plex Sans" w:hAnsi="IBM Plex Sans"/>
-          <w:rtl w:val="0"/>
-        </w:rPr>
-        <w:t xml:space="preserve">  creado_at   TIMESTAMPTZ NOT NULL DEFAULT now()</w:t>
+        <w:t xml:space="preserve">  matriz_ligamento       JSONB,            -- binario (0/1), derivado automáticamente</w:t>
       </w:r>
     </w:p>
     <w:p>
@@ -5712,21 +5110,7 @@
           <w:sz w:val="16"/>
           <w:rtl w:val="0"/>
         </w:rPr>
-        <w:t>);</w:t>
-      </w:r>
-    </w:p>
-    <w:p>
-      <w:pPr>
-        <w:spacing w:after="0" w:before="0" w:line="240" w:lineRule="auto"/>
-        <w:rPr>
-          <w:rFonts w:ascii="IBM Plex Sans" w:cs="IBM Plex Sans" w:eastAsia="IBM Plex Sans" w:hAnsi="IBM Plex Sans"/>
-        </w:rPr>
-      </w:pPr>
-      <w:r>
-        <w:rPr>
-          <w:rFonts w:ascii="IBM Plex Sans" w:hAnsi="IBM Plex Sans" w:cs="IBM Plex Sans" w:eastAsia="IBM Plex Sans"/>
-          <w:rtl w:val="0"/>
-        </w:rPr>
+        <w:t xml:space="preserve">  repeticiones_por_fila  INTEGER[],        -- pasadas seguidas de cada fila (1 a 9999)</w:t>
       </w:r>
     </w:p>
     <w:p>
@@ -5744,7 +5128,7 @@
           <w:sz w:val="16"/>
           <w:rtl w:val="0"/>
         </w:rPr>
-        <w:t>-- Login biométrico (WebAuthn), la huella NUNCA se guarda ni viaja al</w:t>
+        <w:t xml:space="preserve">  colores_filas          JSONB,            -- color de hilo por fila (#RRGGBB)</w:t>
       </w:r>
     </w:p>
     <w:p>
@@ -5762,7 +5146,7 @@
           <w:sz w:val="16"/>
           <w:rtl w:val="0"/>
         </w:rPr>
-        <w:t>-- servidor: solo se almacenan las llaves públicas de los dispositivos.</w:t>
+        <w:t xml:space="preserve">  metadata               JSONB,            -- ej: {"tipo": "Tafetán"}</w:t>
       </w:r>
     </w:p>
     <w:p>
@@ -5780,103 +5164,7 @@
           <w:sz w:val="16"/>
           <w:rtl w:val="0"/>
         </w:rPr>
-        <w:t>CREATE TABLE usuarios (</w:t>
-      </w:r>
-    </w:p>
-    <w:p>
-      <w:pPr>
-        <w:spacing w:after="0" w:before="0" w:line="240" w:lineRule="auto"/>
-        <w:jc w:val="both"/>
-        <w:rPr>
-          <w:rFonts w:ascii="IBM Plex Sans" w:cs="IBM Plex Sans" w:eastAsia="IBM Plex Sans" w:hAnsi="IBM Plex Sans"/>
-        </w:rPr>
-      </w:pPr>
-      <w:r>
-        <w:rPr>
-          <w:rFonts w:ascii="IBM Plex Sans" w:cs="IBM Plex Sans" w:eastAsia="IBM Plex Sans" w:hAnsi="IBM Plex Sans"/>
-          <w:rtl w:val="0"/>
-        </w:rPr>
-        <w:t xml:space="preserve">  id            SERIAL PRIMARY KEY,</w:t>
-      </w:r>
-    </w:p>
-    <w:p>
-      <w:pPr>
-        <w:spacing w:after="0" w:before="0" w:line="240" w:lineRule="auto"/>
-        <w:jc w:val="both"/>
-        <w:rPr>
-          <w:rFonts w:ascii="IBM Plex Sans" w:cs="IBM Plex Sans" w:eastAsia="IBM Plex Sans" w:hAnsi="IBM Plex Sans"/>
-        </w:rPr>
-      </w:pPr>
-      <w:r>
-        <w:rPr>
-          <w:rFonts w:ascii="IBM Plex Sans" w:cs="IBM Plex Sans" w:eastAsia="IBM Plex Sans" w:hAnsi="IBM Plex Sans"/>
-          <w:rtl w:val="0"/>
-        </w:rPr>
-        <w:t xml:space="preserve">  usuario       TEXT NOT NULL UNIQUE,</w:t>
-      </w:r>
-    </w:p>
-    <w:p>
-      <w:pPr>
-        <w:spacing w:after="0" w:before="0" w:line="240" w:lineRule="auto"/>
-        <w:jc w:val="both"/>
-        <w:rPr>
-          <w:rFonts w:ascii="IBM Plex Sans" w:cs="IBM Plex Sans" w:eastAsia="IBM Plex Sans" w:hAnsi="IBM Plex Sans"/>
-        </w:rPr>
-      </w:pPr>
-      <w:r>
-        <w:rPr>
-          <w:rFonts w:ascii="IBM Plex Sans" w:cs="IBM Plex Sans" w:eastAsia="IBM Plex Sans" w:hAnsi="IBM Plex Sans"/>
-          <w:rtl w:val="0"/>
-        </w:rPr>
-        <w:t xml:space="preserve">  nombre        TEXT,</w:t>
-      </w:r>
-    </w:p>
-    <w:p>
-      <w:pPr>
-        <w:spacing w:after="0" w:before="0" w:line="240" w:lineRule="auto"/>
-        <w:jc w:val="both"/>
-        <w:rPr>
-          <w:rFonts w:ascii="IBM Plex Sans" w:cs="IBM Plex Sans" w:eastAsia="IBM Plex Sans" w:hAnsi="IBM Plex Sans"/>
-        </w:rPr>
-      </w:pPr>
-      <w:r>
-        <w:rPr>
-          <w:rFonts w:ascii="IBM Plex Sans" w:cs="IBM Plex Sans" w:eastAsia="IBM Plex Sans" w:hAnsi="IBM Plex Sans"/>
-          <w:rtl w:val="0"/>
-        </w:rPr>
-        <w:t xml:space="preserve">  webauthn_id   TEXT NOT NULL UNIQUE,</w:t>
-      </w:r>
-    </w:p>
-    <w:p>
-      <w:pPr>
-        <w:spacing w:after="0" w:before="0" w:line="240" w:lineRule="auto"/>
-        <w:jc w:val="both"/>
-        <w:rPr>
-          <w:rFonts w:ascii="IBM Plex Sans" w:cs="IBM Plex Sans" w:eastAsia="IBM Plex Sans" w:hAnsi="IBM Plex Sans"/>
-        </w:rPr>
-      </w:pPr>
-      <w:r>
-        <w:rPr>
-          <w:rFonts w:ascii="IBM Plex Sans" w:cs="IBM Plex Sans" w:eastAsia="IBM Plex Sans" w:hAnsi="IBM Plex Sans"/>
-          <w:rtl w:val="0"/>
-        </w:rPr>
-        <w:t xml:space="preserve">  recovery_hash TEXT,</w:t>
-      </w:r>
-    </w:p>
-    <w:p>
-      <w:pPr>
-        <w:spacing w:after="0" w:before="0" w:line="240" w:lineRule="auto"/>
-        <w:jc w:val="both"/>
-        <w:rPr>
-          <w:rFonts w:ascii="IBM Plex Sans" w:cs="IBM Plex Sans" w:eastAsia="IBM Plex Sans" w:hAnsi="IBM Plex Sans"/>
-        </w:rPr>
-      </w:pPr>
-      <w:r>
-        <w:rPr>
-          <w:rFonts w:ascii="IBM Plex Sans" w:cs="IBM Plex Sans" w:eastAsia="IBM Plex Sans" w:hAnsi="IBM Plex Sans"/>
-          <w:rtl w:val="0"/>
-        </w:rPr>
-        <w:t xml:space="preserve">  creado_at     TIMESTAMPTZ NOT NULL DEFAULT now()</w:t>
+        <w:t xml:space="preserve">  metros_por_pasada      NUMERIC(10,6),    -- lo carga el operario; para pasar pasadas a metros</w:t>
       </w:r>
     </w:p>
     <w:p>
@@ -5894,21 +5182,7 @@
           <w:sz w:val="16"/>
           <w:rtl w:val="0"/>
         </w:rPr>
-        <w:t>);</w:t>
-      </w:r>
-    </w:p>
-    <w:p>
-      <w:pPr>
-        <w:spacing w:after="0" w:before="0" w:line="240" w:lineRule="auto"/>
-        <w:rPr>
-          <w:rFonts w:ascii="IBM Plex Sans" w:cs="IBM Plex Sans" w:eastAsia="IBM Plex Sans" w:hAnsi="IBM Plex Sans"/>
-        </w:rPr>
-      </w:pPr>
-      <w:r>
-        <w:rPr>
-          <w:rFonts w:ascii="IBM Plex Sans" w:hAnsi="IBM Plex Sans" w:cs="IBM Plex Sans" w:eastAsia="IBM Plex Sans"/>
-          <w:rtl w:val="0"/>
-        </w:rPr>
+        <w:t xml:space="preserve">  creado_por_invitado    BOOLEAN NOT NULL DEFAULT false,</w:t>
       </w:r>
     </w:p>
     <w:p>
@@ -5926,103 +5200,7 @@
           <w:sz w:val="16"/>
           <w:rtl w:val="0"/>
         </w:rPr>
-        <w:t>CREATE TABLE credenciales_biometricas (</w:t>
-      </w:r>
-    </w:p>
-    <w:p>
-      <w:pPr>
-        <w:spacing w:after="0" w:before="0" w:line="240" w:lineRule="auto"/>
-        <w:jc w:val="both"/>
-        <w:rPr>
-          <w:rFonts w:ascii="IBM Plex Sans" w:cs="IBM Plex Sans" w:eastAsia="IBM Plex Sans" w:hAnsi="IBM Plex Sans"/>
-        </w:rPr>
-      </w:pPr>
-      <w:r>
-        <w:rPr>
-          <w:rFonts w:ascii="IBM Plex Sans" w:cs="IBM Plex Sans" w:eastAsia="IBM Plex Sans" w:hAnsi="IBM Plex Sans"/>
-          <w:rtl w:val="0"/>
-        </w:rPr>
-        <w:t xml:space="preserve">  id            SERIAL PRIMARY KEY,</w:t>
-      </w:r>
-    </w:p>
-    <w:p>
-      <w:pPr>
-        <w:spacing w:after="0" w:before="0" w:line="240" w:lineRule="auto"/>
-        <w:jc w:val="both"/>
-        <w:rPr>
-          <w:rFonts w:ascii="IBM Plex Sans" w:cs="IBM Plex Sans" w:eastAsia="IBM Plex Sans" w:hAnsi="IBM Plex Sans"/>
-        </w:rPr>
-      </w:pPr>
-      <w:r>
-        <w:rPr>
-          <w:rFonts w:ascii="IBM Plex Sans" w:cs="IBM Plex Sans" w:eastAsia="IBM Plex Sans" w:hAnsi="IBM Plex Sans"/>
-          <w:rtl w:val="0"/>
-        </w:rPr>
-        <w:t xml:space="preserve">  usuario_id    INTEGER NOT NULL REFERENCES usuarios(id) ON DELETE CASCADE,</w:t>
-      </w:r>
-    </w:p>
-    <w:p>
-      <w:pPr>
-        <w:spacing w:after="0" w:before="0" w:line="240" w:lineRule="auto"/>
-        <w:jc w:val="both"/>
-        <w:rPr>
-          <w:rFonts w:ascii="IBM Plex Sans" w:cs="IBM Plex Sans" w:eastAsia="IBM Plex Sans" w:hAnsi="IBM Plex Sans"/>
-        </w:rPr>
-      </w:pPr>
-      <w:r>
-        <w:rPr>
-          <w:rFonts w:ascii="IBM Plex Sans" w:cs="IBM Plex Sans" w:eastAsia="IBM Plex Sans" w:hAnsi="IBM Plex Sans"/>
-          <w:rtl w:val="0"/>
-        </w:rPr>
-        <w:t xml:space="preserve">  credential_id TEXT NOT NULL UNIQUE,</w:t>
-      </w:r>
-    </w:p>
-    <w:p>
-      <w:pPr>
-        <w:spacing w:after="0" w:before="0" w:line="240" w:lineRule="auto"/>
-        <w:jc w:val="both"/>
-        <w:rPr>
-          <w:rFonts w:ascii="IBM Plex Sans" w:cs="IBM Plex Sans" w:eastAsia="IBM Plex Sans" w:hAnsi="IBM Plex Sans"/>
-        </w:rPr>
-      </w:pPr>
-      <w:r>
-        <w:rPr>
-          <w:rFonts w:ascii="IBM Plex Sans" w:cs="IBM Plex Sans" w:eastAsia="IBM Plex Sans" w:hAnsi="IBM Plex Sans"/>
-          <w:rtl w:val="0"/>
-        </w:rPr>
-        <w:t xml:space="preserve">  public_key    TEXT NOT NULL,</w:t>
-      </w:r>
-    </w:p>
-    <w:p>
-      <w:pPr>
-        <w:spacing w:after="0" w:before="0" w:line="240" w:lineRule="auto"/>
-        <w:jc w:val="both"/>
-        <w:rPr>
-          <w:rFonts w:ascii="IBM Plex Sans" w:cs="IBM Plex Sans" w:eastAsia="IBM Plex Sans" w:hAnsi="IBM Plex Sans"/>
-        </w:rPr>
-      </w:pPr>
-      <w:r>
-        <w:rPr>
-          <w:rFonts w:ascii="IBM Plex Sans" w:cs="IBM Plex Sans" w:eastAsia="IBM Plex Sans" w:hAnsi="IBM Plex Sans"/>
-          <w:rtl w:val="0"/>
-        </w:rPr>
-        <w:t xml:space="preserve">  counter       BIGINT NOT NULL DEFAULT 0,</w:t>
-      </w:r>
-    </w:p>
-    <w:p>
-      <w:pPr>
-        <w:spacing w:after="0" w:before="0" w:line="240" w:lineRule="auto"/>
-        <w:jc w:val="both"/>
-        <w:rPr>
-          <w:rFonts w:ascii="IBM Plex Sans" w:cs="IBM Plex Sans" w:eastAsia="IBM Plex Sans" w:hAnsi="IBM Plex Sans"/>
-        </w:rPr>
-      </w:pPr>
-      <w:r>
-        <w:rPr>
-          <w:rFonts w:ascii="IBM Plex Sans" w:cs="IBM Plex Sans" w:eastAsia="IBM Plex Sans" w:hAnsi="IBM Plex Sans"/>
-          <w:rtl w:val="0"/>
-        </w:rPr>
-        <w:t xml:space="preserve">  creado_at     TIMESTAMPTZ NOT NULL DEFAULT now()</w:t>
+        <w:t xml:space="preserve">  creado_at              TIMESTAMPTZ NOT NULL DEFAULT now(),</w:t>
       </w:r>
     </w:p>
     <w:p>
@@ -6040,21 +5218,1249 @@
           <w:sz w:val="16"/>
           <w:rtl w:val="0"/>
         </w:rPr>
-        <w:t>);</w:t>
+        <w:t xml:space="preserve">  modificado_at          TIMESTAMPTZ NOT NULL DEFAULT now()</w:t>
       </w:r>
     </w:p>
     <w:p>
       <w:pPr>
         <w:spacing w:after="0" w:before="0" w:line="240" w:lineRule="auto"/>
-        <w:rPr>
-          <w:rFonts w:ascii="IBM Plex Sans" w:cs="IBM Plex Sans" w:eastAsia="IBM Plex Sans" w:hAnsi="IBM Plex Sans"/>
-        </w:rPr>
-      </w:pPr>
-      <w:r>
-        <w:rPr>
-          <w:rFonts w:ascii="IBM Plex Sans" w:hAnsi="IBM Plex Sans" w:cs="IBM Plex Sans" w:eastAsia="IBM Plex Sans"/>
-          <w:rtl w:val="0"/>
-        </w:rPr>
+        <w:jc w:val="left"/>
+        <w:rPr>
+          <w:rFonts w:ascii="IBM Plex Sans" w:cs="IBM Plex Sans" w:eastAsia="IBM Plex Sans" w:hAnsi="IBM Plex Sans"/>
+        </w:rPr>
+        <w:shd w:fill="F2F0EC"/>
+      </w:pPr>
+      <w:r>
+        <w:rPr>
+          <w:rFonts w:ascii="Consolas" w:cs="Consolas" w:eastAsia="Consolas" w:hAnsi="Consolas"/>
+          <w:sz w:val="16"/>
+          <w:rtl w:val="0"/>
+        </w:rPr>
+        <w:t xml:space="preserve">);</w:t>
+      </w:r>
+    </w:p>
+    <w:p>
+      <w:pPr>
+        <w:spacing w:after="0" w:before="0" w:line="240" w:lineRule="auto"/>
+        <w:jc w:val="left"/>
+        <w:rPr>
+          <w:rFonts w:ascii="IBM Plex Sans" w:cs="IBM Plex Sans" w:eastAsia="IBM Plex Sans" w:hAnsi="IBM Plex Sans"/>
+        </w:rPr>
+        <w:shd w:fill="F2F0EC"/>
+      </w:pPr>
+      <w:r>
+        <w:rPr>
+          <w:rFonts w:ascii="Consolas" w:cs="Consolas" w:eastAsia="Consolas" w:hAnsi="Consolas"/>
+          <w:sz w:val="16"/>
+          <w:rtl w:val="0"/>
+        </w:rPr>
+        <w:t xml:space="preserve">CREATE TABLE telares (</w:t>
+      </w:r>
+    </w:p>
+    <w:p>
+      <w:pPr>
+        <w:spacing w:after="0" w:before="0" w:line="240" w:lineRule="auto"/>
+        <w:jc w:val="left"/>
+        <w:rPr>
+          <w:rFonts w:ascii="IBM Plex Sans" w:cs="IBM Plex Sans" w:eastAsia="IBM Plex Sans" w:hAnsi="IBM Plex Sans"/>
+        </w:rPr>
+        <w:shd w:fill="F2F0EC"/>
+      </w:pPr>
+      <w:r>
+        <w:rPr>
+          <w:rFonts w:ascii="Consolas" w:cs="Consolas" w:eastAsia="Consolas" w:hAnsi="Consolas"/>
+          <w:sz w:val="16"/>
+          <w:rtl w:val="0"/>
+        </w:rPr>
+        <w:t xml:space="preserve">  id                     SERIAL PRIMARY KEY,</w:t>
+      </w:r>
+    </w:p>
+    <w:p>
+      <w:pPr>
+        <w:spacing w:after="0" w:before="0" w:line="240" w:lineRule="auto"/>
+        <w:jc w:val="left"/>
+        <w:rPr>
+          <w:rFonts w:ascii="IBM Plex Sans" w:cs="IBM Plex Sans" w:eastAsia="IBM Plex Sans" w:hAnsi="IBM Plex Sans"/>
+        </w:rPr>
+        <w:shd w:fill="F2F0EC"/>
+      </w:pPr>
+      <w:r>
+        <w:rPr>
+          <w:rFonts w:ascii="Consolas" w:cs="Consolas" w:eastAsia="Consolas" w:hAnsi="Consolas"/>
+          <w:sz w:val="16"/>
+          <w:rtl w:val="0"/>
+        </w:rPr>
+        <w:t xml:space="preserve">  codigo                 TEXT NOT NULL UNIQUE,   -- ej: "TELAR-01"</w:t>
+      </w:r>
+    </w:p>
+    <w:p>
+      <w:pPr>
+        <w:spacing w:after="0" w:before="0" w:line="240" w:lineRule="auto"/>
+        <w:jc w:val="left"/>
+        <w:rPr>
+          <w:rFonts w:ascii="IBM Plex Sans" w:cs="IBM Plex Sans" w:eastAsia="IBM Plex Sans" w:hAnsi="IBM Plex Sans"/>
+        </w:rPr>
+        <w:shd w:fill="F2F0EC"/>
+      </w:pPr>
+      <w:r>
+        <w:rPr>
+          <w:rFonts w:ascii="Consolas" w:cs="Consolas" w:eastAsia="Consolas" w:hAnsi="Consolas"/>
+          <w:sz w:val="16"/>
+          <w:rtl w:val="0"/>
+        </w:rPr>
+        <w:t xml:space="preserve">  nombre                 TEXT,</w:t>
+      </w:r>
+    </w:p>
+    <w:p>
+      <w:pPr>
+        <w:spacing w:after="0" w:before="0" w:line="240" w:lineRule="auto"/>
+        <w:jc w:val="left"/>
+        <w:rPr>
+          <w:rFonts w:ascii="IBM Plex Sans" w:cs="IBM Plex Sans" w:eastAsia="IBM Plex Sans" w:hAnsi="IBM Plex Sans"/>
+        </w:rPr>
+        <w:shd w:fill="F2F0EC"/>
+      </w:pPr>
+      <w:r>
+        <w:rPr>
+          <w:rFonts w:ascii="Consolas" w:cs="Consolas" w:eastAsia="Consolas" w:hAnsi="Consolas"/>
+          <w:sz w:val="16"/>
+          <w:rtl w:val="0"/>
+        </w:rPr>
+        <w:t xml:space="preserve">  estado                 TEXT NOT NULL DEFAULT 'apagado'</w:t>
+      </w:r>
+    </w:p>
+    <w:p>
+      <w:pPr>
+        <w:spacing w:after="0" w:before="0" w:line="240" w:lineRule="auto"/>
+        <w:jc w:val="left"/>
+        <w:rPr>
+          <w:rFonts w:ascii="IBM Plex Sans" w:cs="IBM Plex Sans" w:eastAsia="IBM Plex Sans" w:hAnsi="IBM Plex Sans"/>
+        </w:rPr>
+        <w:shd w:fill="F2F0EC"/>
+      </w:pPr>
+      <w:r>
+        <w:rPr>
+          <w:rFonts w:ascii="Consolas" w:cs="Consolas" w:eastAsia="Consolas" w:hAnsi="Consolas"/>
+          <w:sz w:val="16"/>
+          <w:rtl w:val="0"/>
+        </w:rPr>
+        <w:t xml:space="preserve">                           CHECK (estado IN ('apagado','tejiendo','pausado','error')),</w:t>
+      </w:r>
+    </w:p>
+    <w:p>
+      <w:pPr>
+        <w:spacing w:after="0" w:before="0" w:line="240" w:lineRule="auto"/>
+        <w:jc w:val="left"/>
+        <w:rPr>
+          <w:rFonts w:ascii="IBM Plex Sans" w:cs="IBM Plex Sans" w:eastAsia="IBM Plex Sans" w:hAnsi="IBM Plex Sans"/>
+        </w:rPr>
+        <w:shd w:fill="F2F0EC"/>
+      </w:pPr>
+      <w:r>
+        <w:rPr>
+          <w:rFonts w:ascii="Consolas" w:cs="Consolas" w:eastAsia="Consolas" w:hAnsi="Consolas"/>
+          <w:sz w:val="16"/>
+          <w:rtl w:val="0"/>
+        </w:rPr>
+        <w:t xml:space="preserve">  motivo_pausa           TEXT,                   -- 'sin_senal' | 'reinicio' | NULL</w:t>
+      </w:r>
+    </w:p>
+    <w:p>
+      <w:pPr>
+        <w:spacing w:after="0" w:before="0" w:line="240" w:lineRule="auto"/>
+        <w:jc w:val="left"/>
+        <w:rPr>
+          <w:rFonts w:ascii="IBM Plex Sans" w:cs="IBM Plex Sans" w:eastAsia="IBM Plex Sans" w:hAnsi="IBM Plex Sans"/>
+        </w:rPr>
+        <w:shd w:fill="F2F0EC"/>
+      </w:pPr>
+      <w:r>
+        <w:rPr>
+          <w:rFonts w:ascii="Consolas" w:cs="Consolas" w:eastAsia="Consolas" w:hAnsi="Consolas"/>
+          <w:sz w:val="16"/>
+          <w:rtl w:val="0"/>
+        </w:rPr>
+        <w:t xml:space="preserve">  patron_actual_id       INTEGER REFERENCES patrones(id) ON DELETE SET NULL,</w:t>
+      </w:r>
+    </w:p>
+    <w:p>
+      <w:pPr>
+        <w:spacing w:after="0" w:before="0" w:line="240" w:lineRule="auto"/>
+        <w:jc w:val="left"/>
+        <w:rPr>
+          <w:rFonts w:ascii="IBM Plex Sans" w:cs="IBM Plex Sans" w:eastAsia="IBM Plex Sans" w:hAnsi="IBM Plex Sans"/>
+        </w:rPr>
+        <w:shd w:fill="F2F0EC"/>
+      </w:pPr>
+      <w:r>
+        <w:rPr>
+          <w:rFonts w:ascii="Consolas" w:cs="Consolas" w:eastAsia="Consolas" w:hAnsi="Consolas"/>
+          <w:sz w:val="16"/>
+          <w:rtl w:val="0"/>
+        </w:rPr>
+        <w:t xml:space="preserve">  elementos_seleccion    INTEGER NOT NULL DEFAULT 4,   -- bobinas de la máquina</w:t>
+      </w:r>
+    </w:p>
+    <w:p>
+      <w:pPr>
+        <w:spacing w:after="0" w:before="0" w:line="240" w:lineRule="auto"/>
+        <w:jc w:val="left"/>
+        <w:rPr>
+          <w:rFonts w:ascii="IBM Plex Sans" w:cs="IBM Plex Sans" w:eastAsia="IBM Plex Sans" w:hAnsi="IBM Plex Sans"/>
+        </w:rPr>
+        <w:shd w:fill="F2F0EC"/>
+      </w:pPr>
+      <w:r>
+        <w:rPr>
+          <w:rFonts w:ascii="Consolas" w:cs="Consolas" w:eastAsia="Consolas" w:hAnsi="Consolas"/>
+          <w:sz w:val="16"/>
+          <w:rtl w:val="0"/>
+        </w:rPr>
+        <w:t xml:space="preserve">  ultimo_ping_esp32      TIMESTAMPTZ,            -- "ESP32 conectado"</w:t>
+      </w:r>
+    </w:p>
+    <w:p>
+      <w:pPr>
+        <w:spacing w:after="0" w:before="0" w:line="240" w:lineRule="auto"/>
+        <w:jc w:val="left"/>
+        <w:rPr>
+          <w:rFonts w:ascii="IBM Plex Sans" w:cs="IBM Plex Sans" w:eastAsia="IBM Plex Sans" w:hAnsi="IBM Plex Sans"/>
+        </w:rPr>
+        <w:shd w:fill="F2F0EC"/>
+      </w:pPr>
+      <w:r>
+        <w:rPr>
+          <w:rFonts w:ascii="Consolas" w:cs="Consolas" w:eastAsia="Consolas" w:hAnsi="Consolas"/>
+          <w:sz w:val="16"/>
+          <w:rtl w:val="0"/>
+        </w:rPr>
+        <w:t xml:space="preserve">  ultimo_reporte_sensor  TIMESTAMPTZ,            -- señal de vida del Nivel 2</w:t>
+      </w:r>
+    </w:p>
+    <w:p>
+      <w:pPr>
+        <w:spacing w:after="0" w:before="0" w:line="240" w:lineRule="auto"/>
+        <w:jc w:val="left"/>
+        <w:rPr>
+          <w:rFonts w:ascii="IBM Plex Sans" w:cs="IBM Plex Sans" w:eastAsia="IBM Plex Sans" w:hAnsi="IBM Plex Sans"/>
+        </w:rPr>
+        <w:shd w:fill="F2F0EC"/>
+      </w:pPr>
+      <w:r>
+        <w:rPr>
+          <w:rFonts w:ascii="Consolas" w:cs="Consolas" w:eastAsia="Consolas" w:hAnsi="Consolas"/>
+          <w:sz w:val="16"/>
+          <w:rtl w:val="0"/>
+        </w:rPr>
+        <w:t xml:space="preserve">  retroceder_seq         INTEGER NOT NULL DEFAULT 0,   -- orden de Retroceder para el ESP32</w:t>
+      </w:r>
+    </w:p>
+    <w:p>
+      <w:pPr>
+        <w:spacing w:after="0" w:before="0" w:line="240" w:lineRule="auto"/>
+        <w:jc w:val="left"/>
+        <w:rPr>
+          <w:rFonts w:ascii="IBM Plex Sans" w:cs="IBM Plex Sans" w:eastAsia="IBM Plex Sans" w:hAnsi="IBM Plex Sans"/>
+        </w:rPr>
+        <w:shd w:fill="F2F0EC"/>
+      </w:pPr>
+      <w:r>
+        <w:rPr>
+          <w:rFonts w:ascii="Consolas" w:cs="Consolas" w:eastAsia="Consolas" w:hAnsi="Consolas"/>
+          <w:sz w:val="16"/>
+          <w:rtl w:val="0"/>
+        </w:rPr>
+        <w:t xml:space="preserve">  retrocesos_contados    INTEGER NOT NULL DEFAULT 0,   -- retrocesos hechos (web + botonera)</w:t>
+      </w:r>
+    </w:p>
+    <w:p>
+      <w:pPr>
+        <w:spacing w:after="0" w:before="0" w:line="240" w:lineRule="auto"/>
+        <w:jc w:val="left"/>
+        <w:rPr>
+          <w:rFonts w:ascii="IBM Plex Sans" w:cs="IBM Plex Sans" w:eastAsia="IBM Plex Sans" w:hAnsi="IBM Plex Sans"/>
+        </w:rPr>
+        <w:shd w:fill="F2F0EC"/>
+      </w:pPr>
+      <w:r>
+        <w:rPr>
+          <w:rFonts w:ascii="Consolas" w:cs="Consolas" w:eastAsia="Consolas" w:hAnsi="Consolas"/>
+          <w:sz w:val="16"/>
+          <w:rtl w:val="0"/>
+        </w:rPr>
+        <w:t xml:space="preserve">  posicion_incierta      BOOLEAN NOT NULL DEFAULT false,</w:t>
+      </w:r>
+    </w:p>
+    <w:p>
+      <w:pPr>
+        <w:spacing w:after="0" w:before="0" w:line="240" w:lineRule="auto"/>
+        <w:jc w:val="left"/>
+        <w:rPr>
+          <w:rFonts w:ascii="IBM Plex Sans" w:cs="IBM Plex Sans" w:eastAsia="IBM Plex Sans" w:hAnsi="IBM Plex Sans"/>
+        </w:rPr>
+        <w:shd w:fill="F2F0EC"/>
+      </w:pPr>
+      <w:r>
+        <w:rPr>
+          <w:rFonts w:ascii="Consolas" w:cs="Consolas" w:eastAsia="Consolas" w:hAnsi="Consolas"/>
+          <w:sz w:val="16"/>
+          <w:rtl w:val="0"/>
+        </w:rPr>
+        <w:t xml:space="preserve">  ultimo_evento_manual   TIMESTAMPTZ,</w:t>
+      </w:r>
+    </w:p>
+    <w:p>
+      <w:pPr>
+        <w:spacing w:after="0" w:before="0" w:line="240" w:lineRule="auto"/>
+        <w:jc w:val="left"/>
+        <w:rPr>
+          <w:rFonts w:ascii="IBM Plex Sans" w:cs="IBM Plex Sans" w:eastAsia="IBM Plex Sans" w:hAnsi="IBM Plex Sans"/>
+        </w:rPr>
+        <w:shd w:fill="F2F0EC"/>
+      </w:pPr>
+      <w:r>
+        <w:rPr>
+          <w:rFonts w:ascii="Consolas" w:cs="Consolas" w:eastAsia="Consolas" w:hAnsi="Consolas"/>
+          <w:sz w:val="16"/>
+          <w:rtl w:val="0"/>
+        </w:rPr>
+        <w:t xml:space="preserve">  ultimo_evento_manual_tipo TEXT,                -- 'marcha' | 'pausa' | 'retroceder' | 'reinicio'</w:t>
+      </w:r>
+    </w:p>
+    <w:p>
+      <w:pPr>
+        <w:spacing w:after="0" w:before="0" w:line="240" w:lineRule="auto"/>
+        <w:jc w:val="left"/>
+        <w:rPr>
+          <w:rFonts w:ascii="IBM Plex Sans" w:cs="IBM Plex Sans" w:eastAsia="IBM Plex Sans" w:hAnsi="IBM Plex Sans"/>
+        </w:rPr>
+        <w:shd w:fill="F2F0EC"/>
+      </w:pPr>
+      <w:r>
+        <w:rPr>
+          <w:rFonts w:ascii="Consolas" w:cs="Consolas" w:eastAsia="Consolas" w:hAnsi="Consolas"/>
+          <w:sz w:val="16"/>
+          <w:rtl w:val="0"/>
+        </w:rPr>
+        <w:t xml:space="preserve">  creado_at              TIMESTAMPTZ NOT NULL DEFAULT now()</w:t>
+      </w:r>
+    </w:p>
+    <w:p>
+      <w:pPr>
+        <w:spacing w:after="0" w:before="0" w:line="240" w:lineRule="auto"/>
+        <w:jc w:val="left"/>
+        <w:rPr>
+          <w:rFonts w:ascii="IBM Plex Sans" w:cs="IBM Plex Sans" w:eastAsia="IBM Plex Sans" w:hAnsi="IBM Plex Sans"/>
+        </w:rPr>
+        <w:shd w:fill="F2F0EC"/>
+      </w:pPr>
+      <w:r>
+        <w:rPr>
+          <w:rFonts w:ascii="Consolas" w:cs="Consolas" w:eastAsia="Consolas" w:hAnsi="Consolas"/>
+          <w:sz w:val="16"/>
+          <w:rtl w:val="0"/>
+        </w:rPr>
+        <w:t xml:space="preserve">);</w:t>
+      </w:r>
+    </w:p>
+    <w:p>
+      <w:pPr>
+        <w:spacing w:after="0" w:before="0" w:line="240" w:lineRule="auto"/>
+        <w:jc w:val="left"/>
+        <w:rPr>
+          <w:rFonts w:ascii="IBM Plex Sans" w:cs="IBM Plex Sans" w:eastAsia="IBM Plex Sans" w:hAnsi="IBM Plex Sans"/>
+        </w:rPr>
+        <w:shd w:fill="F2F0EC"/>
+      </w:pPr>
+      <w:r>
+        <w:rPr>
+          <w:rFonts w:ascii="Consolas" w:cs="Consolas" w:eastAsia="Consolas" w:hAnsi="Consolas"/>
+          <w:sz w:val="16"/>
+          <w:rtl w:val="0"/>
+        </w:rPr>
+        <w:t xml:space="preserve">CREATE TABLE historial_produccion (</w:t>
+      </w:r>
+    </w:p>
+    <w:p>
+      <w:pPr>
+        <w:spacing w:after="0" w:before="0" w:line="240" w:lineRule="auto"/>
+        <w:jc w:val="left"/>
+        <w:rPr>
+          <w:rFonts w:ascii="IBM Plex Sans" w:cs="IBM Plex Sans" w:eastAsia="IBM Plex Sans" w:hAnsi="IBM Plex Sans"/>
+        </w:rPr>
+        <w:shd w:fill="F2F0EC"/>
+      </w:pPr>
+      <w:r>
+        <w:rPr>
+          <w:rFonts w:ascii="Consolas" w:cs="Consolas" w:eastAsia="Consolas" w:hAnsi="Consolas"/>
+          <w:sz w:val="16"/>
+          <w:rtl w:val="0"/>
+        </w:rPr>
+        <w:t xml:space="preserve">  id                     SERIAL PRIMARY KEY,</w:t>
+      </w:r>
+    </w:p>
+    <w:p>
+      <w:pPr>
+        <w:spacing w:after="0" w:before="0" w:line="240" w:lineRule="auto"/>
+        <w:jc w:val="left"/>
+        <w:rPr>
+          <w:rFonts w:ascii="IBM Plex Sans" w:cs="IBM Plex Sans" w:eastAsia="IBM Plex Sans" w:hAnsi="IBM Plex Sans"/>
+        </w:rPr>
+        <w:shd w:fill="F2F0EC"/>
+      </w:pPr>
+      <w:r>
+        <w:rPr>
+          <w:rFonts w:ascii="Consolas" w:cs="Consolas" w:eastAsia="Consolas" w:hAnsi="Consolas"/>
+          <w:sz w:val="16"/>
+          <w:rtl w:val="0"/>
+        </w:rPr>
+        <w:t xml:space="preserve">  telar_id               INTEGER NOT NULL REFERENCES telares(id),</w:t>
+      </w:r>
+    </w:p>
+    <w:p>
+      <w:pPr>
+        <w:spacing w:after="0" w:before="0" w:line="240" w:lineRule="auto"/>
+        <w:jc w:val="left"/>
+        <w:rPr>
+          <w:rFonts w:ascii="IBM Plex Sans" w:cs="IBM Plex Sans" w:eastAsia="IBM Plex Sans" w:hAnsi="IBM Plex Sans"/>
+        </w:rPr>
+        <w:shd w:fill="F2F0EC"/>
+      </w:pPr>
+      <w:r>
+        <w:rPr>
+          <w:rFonts w:ascii="Consolas" w:cs="Consolas" w:eastAsia="Consolas" w:hAnsi="Consolas"/>
+          <w:sz w:val="16"/>
+          <w:rtl w:val="0"/>
+        </w:rPr>
+        <w:t xml:space="preserve">  patron_id              INTEGER NOT NULL REFERENCES patrones(id),</w:t>
+      </w:r>
+    </w:p>
+    <w:p>
+      <w:pPr>
+        <w:spacing w:after="0" w:before="0" w:line="240" w:lineRule="auto"/>
+        <w:jc w:val="left"/>
+        <w:rPr>
+          <w:rFonts w:ascii="IBM Plex Sans" w:cs="IBM Plex Sans" w:eastAsia="IBM Plex Sans" w:hAnsi="IBM Plex Sans"/>
+        </w:rPr>
+        <w:shd w:fill="F2F0EC"/>
+      </w:pPr>
+      <w:r>
+        <w:rPr>
+          <w:rFonts w:ascii="Consolas" w:cs="Consolas" w:eastAsia="Consolas" w:hAnsi="Consolas"/>
+          <w:sz w:val="16"/>
+          <w:rtl w:val="0"/>
+        </w:rPr>
+        <w:t xml:space="preserve">  fecha_inicio           TIMESTAMPTZ NOT NULL DEFAULT now(),</w:t>
+      </w:r>
+    </w:p>
+    <w:p>
+      <w:pPr>
+        <w:spacing w:after="0" w:before="0" w:line="240" w:lineRule="auto"/>
+        <w:jc w:val="left"/>
+        <w:rPr>
+          <w:rFonts w:ascii="IBM Plex Sans" w:cs="IBM Plex Sans" w:eastAsia="IBM Plex Sans" w:hAnsi="IBM Plex Sans"/>
+        </w:rPr>
+        <w:shd w:fill="F2F0EC"/>
+      </w:pPr>
+      <w:r>
+        <w:rPr>
+          <w:rFonts w:ascii="Consolas" w:cs="Consolas" w:eastAsia="Consolas" w:hAnsi="Consolas"/>
+          <w:sz w:val="16"/>
+          <w:rtl w:val="0"/>
+        </w:rPr>
+        <w:t xml:space="preserve">  fecha_fin              TIMESTAMPTZ,            -- NULL mientras está en curso</w:t>
+      </w:r>
+    </w:p>
+    <w:p>
+      <w:pPr>
+        <w:spacing w:after="0" w:before="0" w:line="240" w:lineRule="auto"/>
+        <w:jc w:val="left"/>
+        <w:rPr>
+          <w:rFonts w:ascii="IBM Plex Sans" w:cs="IBM Plex Sans" w:eastAsia="IBM Plex Sans" w:hAnsi="IBM Plex Sans"/>
+        </w:rPr>
+        <w:shd w:fill="F2F0EC"/>
+      </w:pPr>
+      <w:r>
+        <w:rPr>
+          <w:rFonts w:ascii="Consolas" w:cs="Consolas" w:eastAsia="Consolas" w:hAnsi="Consolas"/>
+          <w:sz w:val="16"/>
+          <w:rtl w:val="0"/>
+        </w:rPr>
+        <w:t xml:space="preserve">  fila_actual            INTEGER DEFAULT 0,      -- posición exacta: la fila...</w:t>
+      </w:r>
+    </w:p>
+    <w:p>
+      <w:pPr>
+        <w:spacing w:after="0" w:before="0" w:line="240" w:lineRule="auto"/>
+        <w:jc w:val="left"/>
+        <w:rPr>
+          <w:rFonts w:ascii="IBM Plex Sans" w:cs="IBM Plex Sans" w:eastAsia="IBM Plex Sans" w:hAnsi="IBM Plex Sans"/>
+        </w:rPr>
+        <w:shd w:fill="F2F0EC"/>
+      </w:pPr>
+      <w:r>
+        <w:rPr>
+          <w:rFonts w:ascii="Consolas" w:cs="Consolas" w:eastAsia="Consolas" w:hAnsi="Consolas"/>
+          <w:sz w:val="16"/>
+          <w:rtl w:val="0"/>
+        </w:rPr>
+        <w:t xml:space="preserve">  repeticion_en_fila     INTEGER NOT NULL DEFAULT 0,   -- ...y cuántas pasadas de ella van</w:t>
+      </w:r>
+    </w:p>
+    <w:p>
+      <w:pPr>
+        <w:spacing w:after="0" w:before="0" w:line="240" w:lineRule="auto"/>
+        <w:jc w:val="left"/>
+        <w:rPr>
+          <w:rFonts w:ascii="IBM Plex Sans" w:cs="IBM Plex Sans" w:eastAsia="IBM Plex Sans" w:hAnsi="IBM Plex Sans"/>
+        </w:rPr>
+        <w:shd w:fill="F2F0EC"/>
+      </w:pPr>
+      <w:r>
+        <w:rPr>
+          <w:rFonts w:ascii="Consolas" w:cs="Consolas" w:eastAsia="Consolas" w:hAnsi="Consolas"/>
+          <w:sz w:val="16"/>
+          <w:rtl w:val="0"/>
+        </w:rPr>
+        <w:t xml:space="preserve">  vueltas_completadas    INTEGER DEFAULT 0,      -- el tejido no tiene "final": es un bucle</w:t>
+      </w:r>
+    </w:p>
+    <w:p>
+      <w:pPr>
+        <w:spacing w:after="0" w:before="0" w:line="240" w:lineRule="auto"/>
+        <w:jc w:val="left"/>
+        <w:rPr>
+          <w:rFonts w:ascii="IBM Plex Sans" w:cs="IBM Plex Sans" w:eastAsia="IBM Plex Sans" w:hAnsi="IBM Plex Sans"/>
+        </w:rPr>
+        <w:shd w:fill="F2F0EC"/>
+      </w:pPr>
+      <w:r>
+        <w:rPr>
+          <w:rFonts w:ascii="Consolas" w:cs="Consolas" w:eastAsia="Consolas" w:hAnsi="Consolas"/>
+          <w:sz w:val="16"/>
+          <w:rtl w:val="0"/>
+        </w:rPr>
+        <w:t xml:space="preserve">  pasadas_totales        INTEGER DEFAULT 0,      -- estimadas por el reloj de la web</w:t>
+      </w:r>
+    </w:p>
+    <w:p>
+      <w:pPr>
+        <w:spacing w:after="0" w:before="0" w:line="240" w:lineRule="auto"/>
+        <w:jc w:val="left"/>
+        <w:rPr>
+          <w:rFonts w:ascii="IBM Plex Sans" w:cs="IBM Plex Sans" w:eastAsia="IBM Plex Sans" w:hAnsi="IBM Plex Sans"/>
+        </w:rPr>
+        <w:shd w:fill="F2F0EC"/>
+      </w:pPr>
+      <w:r>
+        <w:rPr>
+          <w:rFonts w:ascii="Consolas" w:cs="Consolas" w:eastAsia="Consolas" w:hAnsi="Consolas"/>
+          <w:sz w:val="16"/>
+          <w:rtl w:val="0"/>
+        </w:rPr>
+        <w:t xml:space="preserve">  pasadas_sensor         INTEGER NOT NULL DEFAULT 0,   -- medidas por el sensor (Nivel 2)</w:t>
+      </w:r>
+    </w:p>
+    <w:p>
+      <w:pPr>
+        <w:spacing w:after="0" w:before="0" w:line="240" w:lineRule="auto"/>
+        <w:jc w:val="left"/>
+        <w:rPr>
+          <w:rFonts w:ascii="IBM Plex Sans" w:cs="IBM Plex Sans" w:eastAsia="IBM Plex Sans" w:hAnsi="IBM Plex Sans"/>
+        </w:rPr>
+        <w:shd w:fill="F2F0EC"/>
+      </w:pPr>
+      <w:r>
+        <w:rPr>
+          <w:rFonts w:ascii="Consolas" w:cs="Consolas" w:eastAsia="Consolas" w:hAnsi="Consolas"/>
+          <w:sz w:val="16"/>
+          <w:rtl w:val="0"/>
+        </w:rPr>
+        <w:t xml:space="preserve">  conteo_validado        BOOLEAN NOT NULL DEFAULT false,</w:t>
+      </w:r>
+    </w:p>
+    <w:p>
+      <w:pPr>
+        <w:spacing w:after="0" w:before="0" w:line="240" w:lineRule="auto"/>
+        <w:jc w:val="left"/>
+        <w:rPr>
+          <w:rFonts w:ascii="IBM Plex Sans" w:cs="IBM Plex Sans" w:eastAsia="IBM Plex Sans" w:hAnsi="IBM Plex Sans"/>
+        </w:rPr>
+        <w:shd w:fill="F2F0EC"/>
+      </w:pPr>
+      <w:r>
+        <w:rPr>
+          <w:rFonts w:ascii="Consolas" w:cs="Consolas" w:eastAsia="Consolas" w:hAnsi="Consolas"/>
+          <w:sz w:val="16"/>
+          <w:rtl w:val="0"/>
+        </w:rPr>
+        <w:t xml:space="preserve">  estado                 TEXT NOT NULL DEFAULT 'en_curso'</w:t>
+      </w:r>
+    </w:p>
+    <w:p>
+      <w:pPr>
+        <w:spacing w:after="0" w:before="0" w:line="240" w:lineRule="auto"/>
+        <w:jc w:val="left"/>
+        <w:rPr>
+          <w:rFonts w:ascii="IBM Plex Sans" w:cs="IBM Plex Sans" w:eastAsia="IBM Plex Sans" w:hAnsi="IBM Plex Sans"/>
+        </w:rPr>
+        <w:shd w:fill="F2F0EC"/>
+      </w:pPr>
+      <w:r>
+        <w:rPr>
+          <w:rFonts w:ascii="Consolas" w:cs="Consolas" w:eastAsia="Consolas" w:hAnsi="Consolas"/>
+          <w:sz w:val="16"/>
+          <w:rtl w:val="0"/>
+        </w:rPr>
+        <w:t xml:space="preserve">                           CHECK (estado IN ('en_curso','finalizado','detenido_manual'))</w:t>
+      </w:r>
+    </w:p>
+    <w:p>
+      <w:pPr>
+        <w:spacing w:after="0" w:before="0" w:line="240" w:lineRule="auto"/>
+        <w:jc w:val="left"/>
+        <w:rPr>
+          <w:rFonts w:ascii="IBM Plex Sans" w:cs="IBM Plex Sans" w:eastAsia="IBM Plex Sans" w:hAnsi="IBM Plex Sans"/>
+        </w:rPr>
+        <w:shd w:fill="F2F0EC"/>
+      </w:pPr>
+      <w:r>
+        <w:rPr>
+          <w:rFonts w:ascii="Consolas" w:cs="Consolas" w:eastAsia="Consolas" w:hAnsi="Consolas"/>
+          <w:sz w:val="16"/>
+          <w:rtl w:val="0"/>
+        </w:rPr>
+        <w:t xml:space="preserve">  -- (más columna_actual, pasada_actual, alertas_disparadas y pasadas_objetivo)</w:t>
+      </w:r>
+    </w:p>
+    <w:p>
+      <w:pPr>
+        <w:spacing w:after="0" w:before="0" w:line="240" w:lineRule="auto"/>
+        <w:jc w:val="left"/>
+        <w:rPr>
+          <w:rFonts w:ascii="IBM Plex Sans" w:cs="IBM Plex Sans" w:eastAsia="IBM Plex Sans" w:hAnsi="IBM Plex Sans"/>
+        </w:rPr>
+        <w:shd w:fill="F2F0EC"/>
+      </w:pPr>
+      <w:r>
+        <w:rPr>
+          <w:rFonts w:ascii="Consolas" w:cs="Consolas" w:eastAsia="Consolas" w:hAnsi="Consolas"/>
+          <w:sz w:val="16"/>
+          <w:rtl w:val="0"/>
+        </w:rPr>
+        <w:t xml:space="preserve">);</w:t>
+      </w:r>
+    </w:p>
+    <w:p>
+      <w:pPr>
+        <w:spacing w:after="0" w:before="0" w:line="240" w:lineRule="auto"/>
+        <w:jc w:val="left"/>
+        <w:rPr>
+          <w:rFonts w:ascii="IBM Plex Sans" w:cs="IBM Plex Sans" w:eastAsia="IBM Plex Sans" w:hAnsi="IBM Plex Sans"/>
+        </w:rPr>
+        <w:shd w:fill="F2F0EC"/>
+      </w:pPr>
+      <w:r>
+        <w:rPr>
+          <w:rFonts w:ascii="Consolas" w:cs="Consolas" w:eastAsia="Consolas" w:hAnsi="Consolas"/>
+          <w:sz w:val="16"/>
+          <w:rtl w:val="0"/>
+        </w:rPr>
+        <w:t xml:space="preserve">-- Una sola producción abierta por telar:</w:t>
+      </w:r>
+    </w:p>
+    <w:p>
+      <w:pPr>
+        <w:spacing w:after="0" w:before="0" w:line="240" w:lineRule="auto"/>
+        <w:jc w:val="left"/>
+        <w:rPr>
+          <w:rFonts w:ascii="IBM Plex Sans" w:cs="IBM Plex Sans" w:eastAsia="IBM Plex Sans" w:hAnsi="IBM Plex Sans"/>
+        </w:rPr>
+        <w:shd w:fill="F2F0EC"/>
+      </w:pPr>
+      <w:r>
+        <w:rPr>
+          <w:rFonts w:ascii="Consolas" w:cs="Consolas" w:eastAsia="Consolas" w:hAnsi="Consolas"/>
+          <w:sz w:val="16"/>
+          <w:rtl w:val="0"/>
+        </w:rPr>
+        <w:t xml:space="preserve">CREATE UNIQUE INDEX idx_historial_en_curso ON historial_produccion (telar_id)</w:t>
+      </w:r>
+    </w:p>
+    <w:p>
+      <w:pPr>
+        <w:spacing w:after="0" w:before="0" w:line="240" w:lineRule="auto"/>
+        <w:jc w:val="left"/>
+        <w:rPr>
+          <w:rFonts w:ascii="IBM Plex Sans" w:cs="IBM Plex Sans" w:eastAsia="IBM Plex Sans" w:hAnsi="IBM Plex Sans"/>
+        </w:rPr>
+        <w:shd w:fill="F2F0EC"/>
+      </w:pPr>
+      <w:r>
+        <w:rPr>
+          <w:rFonts w:ascii="Consolas" w:cs="Consolas" w:eastAsia="Consolas" w:hAnsi="Consolas"/>
+          <w:sz w:val="16"/>
+          <w:rtl w:val="0"/>
+        </w:rPr>
+        <w:t xml:space="preserve">  WHERE estado = 'en_curso';</w:t>
+      </w:r>
+    </w:p>
+    <w:p>
+      <w:pPr>
+        <w:spacing w:after="0" w:before="0" w:line="240" w:lineRule="auto"/>
+        <w:jc w:val="left"/>
+        <w:rPr>
+          <w:rFonts w:ascii="IBM Plex Sans" w:cs="IBM Plex Sans" w:eastAsia="IBM Plex Sans" w:hAnsi="IBM Plex Sans"/>
+        </w:rPr>
+        <w:shd w:fill="F2F0EC"/>
+      </w:pPr>
+      <w:r>
+        <w:rPr>
+          <w:rFonts w:ascii="Consolas" w:cs="Consolas" w:eastAsia="Consolas" w:hAnsi="Consolas"/>
+          <w:sz w:val="16"/>
+          <w:rtl w:val="0"/>
+        </w:rPr>
+        <w:t xml:space="preserve">CREATE TABLE errores_log (</w:t>
+      </w:r>
+    </w:p>
+    <w:p>
+      <w:pPr>
+        <w:spacing w:after="0" w:before="0" w:line="240" w:lineRule="auto"/>
+        <w:jc w:val="left"/>
+        <w:rPr>
+          <w:rFonts w:ascii="IBM Plex Sans" w:cs="IBM Plex Sans" w:eastAsia="IBM Plex Sans" w:hAnsi="IBM Plex Sans"/>
+        </w:rPr>
+        <w:shd w:fill="F2F0EC"/>
+      </w:pPr>
+      <w:r>
+        <w:rPr>
+          <w:rFonts w:ascii="Consolas" w:cs="Consolas" w:eastAsia="Consolas" w:hAnsi="Consolas"/>
+          <w:sz w:val="16"/>
+          <w:rtl w:val="0"/>
+        </w:rPr>
+        <w:t xml:space="preserve">  id          SERIAL PRIMARY KEY,</w:t>
+      </w:r>
+    </w:p>
+    <w:p>
+      <w:pPr>
+        <w:spacing w:after="0" w:before="0" w:line="240" w:lineRule="auto"/>
+        <w:jc w:val="left"/>
+        <w:rPr>
+          <w:rFonts w:ascii="IBM Plex Sans" w:cs="IBM Plex Sans" w:eastAsia="IBM Plex Sans" w:hAnsi="IBM Plex Sans"/>
+        </w:rPr>
+        <w:shd w:fill="F2F0EC"/>
+      </w:pPr>
+      <w:r>
+        <w:rPr>
+          <w:rFonts w:ascii="Consolas" w:cs="Consolas" w:eastAsia="Consolas" w:hAnsi="Consolas"/>
+          <w:sz w:val="16"/>
+          <w:rtl w:val="0"/>
+        </w:rPr>
+        <w:t xml:space="preserve">  telar_id    INTEGER REFERENCES telares(id),</w:t>
+      </w:r>
+    </w:p>
+    <w:p>
+      <w:pPr>
+        <w:spacing w:after="0" w:before="0" w:line="240" w:lineRule="auto"/>
+        <w:jc w:val="left"/>
+        <w:rPr>
+          <w:rFonts w:ascii="IBM Plex Sans" w:cs="IBM Plex Sans" w:eastAsia="IBM Plex Sans" w:hAnsi="IBM Plex Sans"/>
+        </w:rPr>
+        <w:shd w:fill="F2F0EC"/>
+      </w:pPr>
+      <w:r>
+        <w:rPr>
+          <w:rFonts w:ascii="Consolas" w:cs="Consolas" w:eastAsia="Consolas" w:hAnsi="Consolas"/>
+          <w:sz w:val="16"/>
+          <w:rtl w:val="0"/>
+        </w:rPr>
+        <w:t xml:space="preserve">  titulo      TEXT,</w:t>
+      </w:r>
+    </w:p>
+    <w:p>
+      <w:pPr>
+        <w:spacing w:after="0" w:before="0" w:line="240" w:lineRule="auto"/>
+        <w:jc w:val="left"/>
+        <w:rPr>
+          <w:rFonts w:ascii="IBM Plex Sans" w:cs="IBM Plex Sans" w:eastAsia="IBM Plex Sans" w:hAnsi="IBM Plex Sans"/>
+        </w:rPr>
+        <w:shd w:fill="F2F0EC"/>
+      </w:pPr>
+      <w:r>
+        <w:rPr>
+          <w:rFonts w:ascii="Consolas" w:cs="Consolas" w:eastAsia="Consolas" w:hAnsi="Consolas"/>
+          <w:sz w:val="16"/>
+          <w:rtl w:val="0"/>
+        </w:rPr>
+        <w:t xml:space="preserve">  mensaje     TEXT,</w:t>
+      </w:r>
+    </w:p>
+    <w:p>
+      <w:pPr>
+        <w:spacing w:after="0" w:before="0" w:line="240" w:lineRule="auto"/>
+        <w:jc w:val="left"/>
+        <w:rPr>
+          <w:rFonts w:ascii="IBM Plex Sans" w:cs="IBM Plex Sans" w:eastAsia="IBM Plex Sans" w:hAnsi="IBM Plex Sans"/>
+        </w:rPr>
+        <w:shd w:fill="F2F0EC"/>
+      </w:pPr>
+      <w:r>
+        <w:rPr>
+          <w:rFonts w:ascii="Consolas" w:cs="Consolas" w:eastAsia="Consolas" w:hAnsi="Consolas"/>
+          <w:sz w:val="16"/>
+          <w:rtl w:val="0"/>
+        </w:rPr>
+        <w:t xml:space="preserve">  codigo      TEXT,</w:t>
+      </w:r>
+    </w:p>
+    <w:p>
+      <w:pPr>
+        <w:spacing w:after="0" w:before="0" w:line="240" w:lineRule="auto"/>
+        <w:jc w:val="left"/>
+        <w:rPr>
+          <w:rFonts w:ascii="IBM Plex Sans" w:cs="IBM Plex Sans" w:eastAsia="IBM Plex Sans" w:hAnsi="IBM Plex Sans"/>
+        </w:rPr>
+        <w:shd w:fill="F2F0EC"/>
+      </w:pPr>
+      <w:r>
+        <w:rPr>
+          <w:rFonts w:ascii="Consolas" w:cs="Consolas" w:eastAsia="Consolas" w:hAnsi="Consolas"/>
+          <w:sz w:val="16"/>
+          <w:rtl w:val="0"/>
+        </w:rPr>
+        <w:t xml:space="preserve">  creado_at   TIMESTAMPTZ NOT NULL DEFAULT now()</w:t>
+      </w:r>
+    </w:p>
+    <w:p>
+      <w:pPr>
+        <w:spacing w:after="0" w:before="0" w:line="240" w:lineRule="auto"/>
+        <w:jc w:val="left"/>
+        <w:rPr>
+          <w:rFonts w:ascii="IBM Plex Sans" w:cs="IBM Plex Sans" w:eastAsia="IBM Plex Sans" w:hAnsi="IBM Plex Sans"/>
+        </w:rPr>
+        <w:shd w:fill="F2F0EC"/>
+      </w:pPr>
+      <w:r>
+        <w:rPr>
+          <w:rFonts w:ascii="Consolas" w:cs="Consolas" w:eastAsia="Consolas" w:hAnsi="Consolas"/>
+          <w:sz w:val="16"/>
+          <w:rtl w:val="0"/>
+        </w:rPr>
+        <w:t xml:space="preserve">);</w:t>
+      </w:r>
+    </w:p>
+    <w:p>
+      <w:pPr>
+        <w:spacing w:after="0" w:before="0" w:line="240" w:lineRule="auto"/>
+        <w:jc w:val="left"/>
+        <w:rPr>
+          <w:rFonts w:ascii="IBM Plex Sans" w:cs="IBM Plex Sans" w:eastAsia="IBM Plex Sans" w:hAnsi="IBM Plex Sans"/>
+        </w:rPr>
+        <w:shd w:fill="F2F0EC"/>
+      </w:pPr>
+      <w:r>
+        <w:rPr>
+          <w:rFonts w:ascii="Consolas" w:cs="Consolas" w:eastAsia="Consolas" w:hAnsi="Consolas"/>
+          <w:sz w:val="16"/>
+          <w:rtl w:val="0"/>
+        </w:rPr>
+        <w:t xml:space="preserve">-- Login biométrico (WebAuthn): la huella NUNCA se guarda ni viaja al</w:t>
+      </w:r>
+    </w:p>
+    <w:p>
+      <w:pPr>
+        <w:spacing w:after="0" w:before="0" w:line="240" w:lineRule="auto"/>
+        <w:jc w:val="left"/>
+        <w:rPr>
+          <w:rFonts w:ascii="IBM Plex Sans" w:cs="IBM Plex Sans" w:eastAsia="IBM Plex Sans" w:hAnsi="IBM Plex Sans"/>
+        </w:rPr>
+        <w:shd w:fill="F2F0EC"/>
+      </w:pPr>
+      <w:r>
+        <w:rPr>
+          <w:rFonts w:ascii="Consolas" w:cs="Consolas" w:eastAsia="Consolas" w:hAnsi="Consolas"/>
+          <w:sz w:val="16"/>
+          <w:rtl w:val="0"/>
+        </w:rPr>
+        <w:t xml:space="preserve">-- servidor; solo se almacenan las llaves públicas de los dispositivos.</w:t>
+      </w:r>
+    </w:p>
+    <w:p>
+      <w:pPr>
+        <w:spacing w:after="0" w:before="0" w:line="240" w:lineRule="auto"/>
+        <w:jc w:val="left"/>
+        <w:rPr>
+          <w:rFonts w:ascii="IBM Plex Sans" w:cs="IBM Plex Sans" w:eastAsia="IBM Plex Sans" w:hAnsi="IBM Plex Sans"/>
+        </w:rPr>
+        <w:shd w:fill="F2F0EC"/>
+      </w:pPr>
+      <w:r>
+        <w:rPr>
+          <w:rFonts w:ascii="Consolas" w:cs="Consolas" w:eastAsia="Consolas" w:hAnsi="Consolas"/>
+          <w:sz w:val="16"/>
+          <w:rtl w:val="0"/>
+        </w:rPr>
+        <w:t xml:space="preserve">CREATE TABLE usuarios (</w:t>
+      </w:r>
+    </w:p>
+    <w:p>
+      <w:pPr>
+        <w:spacing w:after="0" w:before="0" w:line="240" w:lineRule="auto"/>
+        <w:jc w:val="left"/>
+        <w:rPr>
+          <w:rFonts w:ascii="IBM Plex Sans" w:cs="IBM Plex Sans" w:eastAsia="IBM Plex Sans" w:hAnsi="IBM Plex Sans"/>
+        </w:rPr>
+        <w:shd w:fill="F2F0EC"/>
+      </w:pPr>
+      <w:r>
+        <w:rPr>
+          <w:rFonts w:ascii="Consolas" w:cs="Consolas" w:eastAsia="Consolas" w:hAnsi="Consolas"/>
+          <w:sz w:val="16"/>
+          <w:rtl w:val="0"/>
+        </w:rPr>
+        <w:t xml:space="preserve">  id             SERIAL PRIMARY KEY,</w:t>
+      </w:r>
+    </w:p>
+    <w:p>
+      <w:pPr>
+        <w:spacing w:after="0" w:before="0" w:line="240" w:lineRule="auto"/>
+        <w:jc w:val="left"/>
+        <w:rPr>
+          <w:rFonts w:ascii="IBM Plex Sans" w:cs="IBM Plex Sans" w:eastAsia="IBM Plex Sans" w:hAnsi="IBM Plex Sans"/>
+        </w:rPr>
+        <w:shd w:fill="F2F0EC"/>
+      </w:pPr>
+      <w:r>
+        <w:rPr>
+          <w:rFonts w:ascii="Consolas" w:cs="Consolas" w:eastAsia="Consolas" w:hAnsi="Consolas"/>
+          <w:sz w:val="16"/>
+          <w:rtl w:val="0"/>
+        </w:rPr>
+        <w:t xml:space="preserve">  usuario        TEXT NOT NULL UNIQUE,           -- se busca sin distinguir mayúsculas</w:t>
+      </w:r>
+    </w:p>
+    <w:p>
+      <w:pPr>
+        <w:spacing w:after="0" w:before="0" w:line="240" w:lineRule="auto"/>
+        <w:jc w:val="left"/>
+        <w:rPr>
+          <w:rFonts w:ascii="IBM Plex Sans" w:cs="IBM Plex Sans" w:eastAsia="IBM Plex Sans" w:hAnsi="IBM Plex Sans"/>
+        </w:rPr>
+        <w:shd w:fill="F2F0EC"/>
+      </w:pPr>
+      <w:r>
+        <w:rPr>
+          <w:rFonts w:ascii="Consolas" w:cs="Consolas" w:eastAsia="Consolas" w:hAnsi="Consolas"/>
+          <w:sz w:val="16"/>
+          <w:rtl w:val="0"/>
+        </w:rPr>
+        <w:t xml:space="preserve">  nombre         TEXT,</w:t>
+      </w:r>
+    </w:p>
+    <w:p>
+      <w:pPr>
+        <w:spacing w:after="0" w:before="0" w:line="240" w:lineRule="auto"/>
+        <w:jc w:val="left"/>
+        <w:rPr>
+          <w:rFonts w:ascii="IBM Plex Sans" w:cs="IBM Plex Sans" w:eastAsia="IBM Plex Sans" w:hAnsi="IBM Plex Sans"/>
+        </w:rPr>
+        <w:shd w:fill="F2F0EC"/>
+      </w:pPr>
+      <w:r>
+        <w:rPr>
+          <w:rFonts w:ascii="Consolas" w:cs="Consolas" w:eastAsia="Consolas" w:hAnsi="Consolas"/>
+          <w:sz w:val="16"/>
+          <w:rtl w:val="0"/>
+        </w:rPr>
+        <w:t xml:space="preserve">  webauthn_id    TEXT NOT NULL UNIQUE,</w:t>
+      </w:r>
+    </w:p>
+    <w:p>
+      <w:pPr>
+        <w:spacing w:after="0" w:before="0" w:line="240" w:lineRule="auto"/>
+        <w:jc w:val="left"/>
+        <w:rPr>
+          <w:rFonts w:ascii="IBM Plex Sans" w:cs="IBM Plex Sans" w:eastAsia="IBM Plex Sans" w:hAnsi="IBM Plex Sans"/>
+        </w:rPr>
+        <w:shd w:fill="F2F0EC"/>
+      </w:pPr>
+      <w:r>
+        <w:rPr>
+          <w:rFonts w:ascii="Consolas" w:cs="Consolas" w:eastAsia="Consolas" w:hAnsi="Consolas"/>
+          <w:sz w:val="16"/>
+          <w:rtl w:val="0"/>
+        </w:rPr>
+        <w:t xml:space="preserve">  recovery_code  TEXT,                           -- código de recuperación CIFRADO (AES-256-GCM)</w:t>
+      </w:r>
+    </w:p>
+    <w:p>
+      <w:pPr>
+        <w:spacing w:after="0" w:before="0" w:line="240" w:lineRule="auto"/>
+        <w:jc w:val="left"/>
+        <w:rPr>
+          <w:rFonts w:ascii="IBM Plex Sans" w:cs="IBM Plex Sans" w:eastAsia="IBM Plex Sans" w:hAnsi="IBM Plex Sans"/>
+        </w:rPr>
+        <w:shd w:fill="F2F0EC"/>
+      </w:pPr>
+      <w:r>
+        <w:rPr>
+          <w:rFonts w:ascii="Consolas" w:cs="Consolas" w:eastAsia="Consolas" w:hAnsi="Consolas"/>
+          <w:sz w:val="16"/>
+          <w:rtl w:val="0"/>
+        </w:rPr>
+        <w:t xml:space="preserve">  recovery_hash  TEXT,</w:t>
+      </w:r>
+    </w:p>
+    <w:p>
+      <w:pPr>
+        <w:spacing w:after="0" w:before="0" w:line="240" w:lineRule="auto"/>
+        <w:jc w:val="left"/>
+        <w:rPr>
+          <w:rFonts w:ascii="IBM Plex Sans" w:cs="IBM Plex Sans" w:eastAsia="IBM Plex Sans" w:hAnsi="IBM Plex Sans"/>
+        </w:rPr>
+        <w:shd w:fill="F2F0EC"/>
+      </w:pPr>
+      <w:r>
+        <w:rPr>
+          <w:rFonts w:ascii="Consolas" w:cs="Consolas" w:eastAsia="Consolas" w:hAnsi="Consolas"/>
+          <w:sz w:val="16"/>
+          <w:rtl w:val="0"/>
+        </w:rPr>
+        <w:t xml:space="preserve">  creado_at      TIMESTAMPTZ NOT NULL DEFAULT now(),</w:t>
+      </w:r>
+    </w:p>
+    <w:p>
+      <w:pPr>
+        <w:spacing w:after="0" w:before="0" w:line="240" w:lineRule="auto"/>
+        <w:jc w:val="left"/>
+        <w:rPr>
+          <w:rFonts w:ascii="IBM Plex Sans" w:cs="IBM Plex Sans" w:eastAsia="IBM Plex Sans" w:hAnsi="IBM Plex Sans"/>
+        </w:rPr>
+        <w:shd w:fill="F2F0EC"/>
+      </w:pPr>
+      <w:r>
+        <w:rPr>
+          <w:rFonts w:ascii="Consolas" w:cs="Consolas" w:eastAsia="Consolas" w:hAnsi="Consolas"/>
+          <w:sz w:val="16"/>
+          <w:rtl w:val="0"/>
+        </w:rPr>
+        <w:t xml:space="preserve">  ultimo_acceso  TIMESTAMPTZ</w:t>
+      </w:r>
+    </w:p>
+    <w:p>
+      <w:pPr>
+        <w:spacing w:after="0" w:before="0" w:line="240" w:lineRule="auto"/>
+        <w:jc w:val="left"/>
+        <w:rPr>
+          <w:rFonts w:ascii="IBM Plex Sans" w:cs="IBM Plex Sans" w:eastAsia="IBM Plex Sans" w:hAnsi="IBM Plex Sans"/>
+        </w:rPr>
+        <w:shd w:fill="F2F0EC"/>
+      </w:pPr>
+      <w:r>
+        <w:rPr>
+          <w:rFonts w:ascii="Consolas" w:cs="Consolas" w:eastAsia="Consolas" w:hAnsi="Consolas"/>
+          <w:sz w:val="16"/>
+          <w:rtl w:val="0"/>
+        </w:rPr>
+        <w:t xml:space="preserve">);</w:t>
+      </w:r>
+    </w:p>
+    <w:p>
+      <w:pPr>
+        <w:spacing w:after="0" w:before="0" w:line="240" w:lineRule="auto"/>
+        <w:jc w:val="left"/>
+        <w:rPr>
+          <w:rFonts w:ascii="IBM Plex Sans" w:cs="IBM Plex Sans" w:eastAsia="IBM Plex Sans" w:hAnsi="IBM Plex Sans"/>
+        </w:rPr>
+        <w:shd w:fill="F2F0EC"/>
+      </w:pPr>
+      <w:r>
+        <w:rPr>
+          <w:rFonts w:ascii="Consolas" w:cs="Consolas" w:eastAsia="Consolas" w:hAnsi="Consolas"/>
+          <w:sz w:val="16"/>
+          <w:rtl w:val="0"/>
+        </w:rPr>
+        <w:t xml:space="preserve">CREATE TABLE credenciales_biometricas (</w:t>
+      </w:r>
+    </w:p>
+    <w:p>
+      <w:pPr>
+        <w:spacing w:after="0" w:before="0" w:line="240" w:lineRule="auto"/>
+        <w:jc w:val="left"/>
+        <w:rPr>
+          <w:rFonts w:ascii="IBM Plex Sans" w:cs="IBM Plex Sans" w:eastAsia="IBM Plex Sans" w:hAnsi="IBM Plex Sans"/>
+        </w:rPr>
+        <w:shd w:fill="F2F0EC"/>
+      </w:pPr>
+      <w:r>
+        <w:rPr>
+          <w:rFonts w:ascii="Consolas" w:cs="Consolas" w:eastAsia="Consolas" w:hAnsi="Consolas"/>
+          <w:sz w:val="16"/>
+          <w:rtl w:val="0"/>
+        </w:rPr>
+        <w:t xml:space="preserve">  id             SERIAL PRIMARY KEY,</w:t>
+      </w:r>
+    </w:p>
+    <w:p>
+      <w:pPr>
+        <w:spacing w:after="0" w:before="0" w:line="240" w:lineRule="auto"/>
+        <w:jc w:val="left"/>
+        <w:rPr>
+          <w:rFonts w:ascii="IBM Plex Sans" w:cs="IBM Plex Sans" w:eastAsia="IBM Plex Sans" w:hAnsi="IBM Plex Sans"/>
+        </w:rPr>
+        <w:shd w:fill="F2F0EC"/>
+      </w:pPr>
+      <w:r>
+        <w:rPr>
+          <w:rFonts w:ascii="Consolas" w:cs="Consolas" w:eastAsia="Consolas" w:hAnsi="Consolas"/>
+          <w:sz w:val="16"/>
+          <w:rtl w:val="0"/>
+        </w:rPr>
+        <w:t xml:space="preserve">  usuario_id     INTEGER NOT NULL REFERENCES usuarios(id) ON DELETE CASCADE,</w:t>
+      </w:r>
+    </w:p>
+    <w:p>
+      <w:pPr>
+        <w:spacing w:after="0" w:before="0" w:line="240" w:lineRule="auto"/>
+        <w:jc w:val="left"/>
+        <w:rPr>
+          <w:rFonts w:ascii="IBM Plex Sans" w:cs="IBM Plex Sans" w:eastAsia="IBM Plex Sans" w:hAnsi="IBM Plex Sans"/>
+        </w:rPr>
+        <w:shd w:fill="F2F0EC"/>
+      </w:pPr>
+      <w:r>
+        <w:rPr>
+          <w:rFonts w:ascii="Consolas" w:cs="Consolas" w:eastAsia="Consolas" w:hAnsi="Consolas"/>
+          <w:sz w:val="16"/>
+          <w:rtl w:val="0"/>
+        </w:rPr>
+        <w:t xml:space="preserve">  credential_id  TEXT NOT NULL UNIQUE,</w:t>
+      </w:r>
+    </w:p>
+    <w:p>
+      <w:pPr>
+        <w:spacing w:after="0" w:before="0" w:line="240" w:lineRule="auto"/>
+        <w:jc w:val="left"/>
+        <w:rPr>
+          <w:rFonts w:ascii="IBM Plex Sans" w:cs="IBM Plex Sans" w:eastAsia="IBM Plex Sans" w:hAnsi="IBM Plex Sans"/>
+        </w:rPr>
+        <w:shd w:fill="F2F0EC"/>
+      </w:pPr>
+      <w:r>
+        <w:rPr>
+          <w:rFonts w:ascii="Consolas" w:cs="Consolas" w:eastAsia="Consolas" w:hAnsi="Consolas"/>
+          <w:sz w:val="16"/>
+          <w:rtl w:val="0"/>
+        </w:rPr>
+        <w:t xml:space="preserve">  public_key     TEXT NOT NULL,</w:t>
+      </w:r>
+    </w:p>
+    <w:p>
+      <w:pPr>
+        <w:spacing w:after="0" w:before="0" w:line="240" w:lineRule="auto"/>
+        <w:jc w:val="left"/>
+        <w:rPr>
+          <w:rFonts w:ascii="IBM Plex Sans" w:cs="IBM Plex Sans" w:eastAsia="IBM Plex Sans" w:hAnsi="IBM Plex Sans"/>
+        </w:rPr>
+        <w:shd w:fill="F2F0EC"/>
+      </w:pPr>
+      <w:r>
+        <w:rPr>
+          <w:rFonts w:ascii="Consolas" w:cs="Consolas" w:eastAsia="Consolas" w:hAnsi="Consolas"/>
+          <w:sz w:val="16"/>
+          <w:rtl w:val="0"/>
+        </w:rPr>
+        <w:t xml:space="preserve">  counter        BIGINT NOT NULL DEFAULT 0,</w:t>
+      </w:r>
+    </w:p>
+    <w:p>
+      <w:pPr>
+        <w:spacing w:after="0" w:before="0" w:line="240" w:lineRule="auto"/>
+        <w:jc w:val="left"/>
+        <w:rPr>
+          <w:rFonts w:ascii="IBM Plex Sans" w:cs="IBM Plex Sans" w:eastAsia="IBM Plex Sans" w:hAnsi="IBM Plex Sans"/>
+        </w:rPr>
+        <w:shd w:fill="F2F0EC"/>
+      </w:pPr>
+      <w:r>
+        <w:rPr>
+          <w:rFonts w:ascii="Consolas" w:cs="Consolas" w:eastAsia="Consolas" w:hAnsi="Consolas"/>
+          <w:sz w:val="16"/>
+          <w:rtl w:val="0"/>
+        </w:rPr>
+        <w:t xml:space="preserve">  creado_at      TIMESTAMPTZ NOT NULL DEFAULT now()</w:t>
+      </w:r>
+    </w:p>
+    <w:p>
+      <w:pPr>
+        <w:spacing w:after="0" w:before="0" w:line="240" w:lineRule="auto"/>
+        <w:jc w:val="left"/>
+        <w:rPr>
+          <w:rFonts w:ascii="IBM Plex Sans" w:cs="IBM Plex Sans" w:eastAsia="IBM Plex Sans" w:hAnsi="IBM Plex Sans"/>
+        </w:rPr>
+        <w:shd w:fill="F2F0EC"/>
+      </w:pPr>
+      <w:r>
+        <w:rPr>
+          <w:rFonts w:ascii="Consolas" w:cs="Consolas" w:eastAsia="Consolas" w:hAnsi="Consolas"/>
+          <w:sz w:val="16"/>
+          <w:rtl w:val="0"/>
+        </w:rPr>
+        <w:t xml:space="preserve">);</w:t>
+      </w:r>
+    </w:p>
+    <w:p>
+      <w:pPr>
+        <w:spacing w:after="0" w:before="0" w:line="240" w:lineRule="auto"/>
+        <w:jc w:val="left"/>
+        <w:rPr>
+          <w:rFonts w:ascii="IBM Plex Sans" w:cs="IBM Plex Sans" w:eastAsia="IBM Plex Sans" w:hAnsi="IBM Plex Sans"/>
+        </w:rPr>
+        <w:shd w:fill="F2F0EC"/>
+      </w:pPr>
+      <w:r>
+        <w:rPr>
+          <w:rFonts w:ascii="Consolas" w:cs="Consolas" w:eastAsia="Consolas" w:hAnsi="Consolas"/>
+          <w:sz w:val="16"/>
+          <w:rtl w:val="0"/>
+        </w:rPr>
+        <w:t xml:space="preserve">-- Además: desafios_webauthn (vencen a los 5 minutos), invitaciones (vencen a</w:t>
+      </w:r>
+    </w:p>
+    <w:p>
+      <w:pPr>
+        <w:spacing w:after="0" w:before="0" w:line="240" w:lineRule="auto"/>
+        <w:jc w:val="left"/>
+        <w:rPr>
+          <w:rFonts w:ascii="IBM Plex Sans" w:cs="IBM Plex Sans" w:eastAsia="IBM Plex Sans" w:hAnsi="IBM Plex Sans"/>
+        </w:rPr>
+        <w:shd w:fill="F2F0EC"/>
+      </w:pPr>
+      <w:r>
+        <w:rPr>
+          <w:rFonts w:ascii="Consolas" w:cs="Consolas" w:eastAsia="Consolas" w:hAnsi="Consolas"/>
+          <w:sz w:val="16"/>
+          <w:rtl w:val="0"/>
+        </w:rPr>
+        <w:t xml:space="preserve">-- los 7 días, se guardan hasheadas) y migraciones_aplicadas. Definición completa</w:t>
+      </w:r>
+    </w:p>
+    <w:p>
+      <w:pPr>
+        <w:spacing w:after="0" w:before="0" w:line="240" w:lineRule="auto"/>
+        <w:jc w:val="left"/>
+        <w:rPr>
+          <w:rFonts w:ascii="IBM Plex Sans" w:cs="IBM Plex Sans" w:eastAsia="IBM Plex Sans" w:hAnsi="IBM Plex Sans"/>
+        </w:rPr>
+        <w:shd w:fill="F2F0EC"/>
+      </w:pPr>
+      <w:r>
+        <w:rPr>
+          <w:rFonts w:ascii="Consolas" w:cs="Consolas" w:eastAsia="Consolas" w:hAnsi="Consolas"/>
+          <w:sz w:val="16"/>
+          <w:rtl w:val="0"/>
+        </w:rPr>
+        <w:t xml:space="preserve">-- en database/01_base_de_datos_completa.sql.</w:t>
       </w:r>
     </w:p>
     <w:p>
@@ -6202,7 +6608,7 @@
           <w:rFonts w:ascii="IBM Plex Sans" w:cs="IBM Plex Sans" w:eastAsia="IBM Plex Sans" w:hAnsi="IBM Plex Sans"/>
           <w:rtl w:val="0"/>
         </w:rPr>
-        <w:t>En la aplicación web, la grilla del editor guarda en matriz_pasadas los valores enteros de cada celda (0, 1, 2, 3…). Cada FILA de la matriz equivale a una PASADA del telar, y las columnas de esa fila son los elementos que se seleccionan de forma simultánea en esa pasada. Un valor mayor a 1 indica que la fila entera se repite esa cantidad de veces antes de pasar a la siguiente, tomándose el mayor valor de la fila: una fila se repite completa, no puede repetirse parcialmente. Una fila sin ningún valor activo sigue siendo una pasada válida, en la que simplemente no se activa ningún elemento. El campo matriz_ligamento guarda la misma grilla en formato binario, para la representación visual del dibujo.</w:t>
+        <w:t>En la aplicación web, cada celda de la grilla del editor vale 0 o 1: la bobina de esa columna se activa o no. Cada FILA de matriz_pasadas es una combinación de bobinas que se activan de forma simultánea, y se teje durante tantas pasadas seguidas como indique su número en repeticiones_por_fila (de 1 a 9999; sin ese dato, una pasada por fila). Así una fila con 100 repeticiones son 100 pasadas de la misma combinación, sin tener que dibujar 100 filas iguales. Una fila sin ninguna celda activa sigue siendo una pasada válida, en la que no se activa ninguna bobina. El campo matriz_ligamento guarda la misma grilla en formato binario, para la representación visual del dibujo.</w:t>
       </w:r>
     </w:p>
     <w:p>
@@ -6506,6 +6912,24 @@
           <w:rtl w:val="0"/>
         </w:rPr>
         <w:t xml:space="preserve">  ],</w:t>
+      </w:r>
+    </w:p>
+    <w:p>
+      <w:pPr>
+        <w:spacing w:after="0" w:before="0" w:lineRule="auto"/>
+        <w:jc w:val="left"/>
+        <w:rPr>
+          <w:rFonts w:ascii="IBM Plex Sans" w:cs="IBM Plex Sans" w:eastAsia="IBM Plex Sans" w:hAnsi="IBM Plex Sans"/>
+        </w:rPr>
+        <w:shd w:fill="F2F0EC"/>
+      </w:pPr>
+      <w:r>
+        <w:rPr>
+          <w:rFonts w:ascii="Consolas" w:cs="Consolas" w:eastAsia="Consolas" w:hAnsi="Consolas"/>
+          <w:sz w:val="16"/>
+          <w:rtl w:val="0"/>
+        </w:rPr>
+        <w:t xml:space="preserve">  "repeticiones_por_fila": [1, 1, 1, 1],</w:t>
       </w:r>
     </w:p>
     <w:p>
@@ -7043,7 +7467,7 @@
           <w:rFonts w:ascii="IBM Plex Sans" w:cs="IBM Plex Sans" w:eastAsia="IBM Plex Sans" w:hAnsi="IBM Plex Sans"/>
           <w:rtl w:val="0"/>
         </w:rPr>
-        <w:t>El firmware del ESP32 se acopla al backend propio (Node.js/Express) exclusivamente por HTTP: sondea el endpoint GET /api/telares/8?origen=esp32 cada 2,5 s (8 es el id del telar en la base, TELAR_ID en el firmware) para conocer el estado deseado del telar y reporta fallas por POST /api/errores. No existe integración con Firebase ni con bases de datos de series temporales externas: toda la persistencia vive en la misma base PostgreSQL (Neon) que usa la web.</w:t>
+        <w:t>El firmware del ESP32 se acopla al backend propio (Node.js/Express) exclusivamente por HTTP: sondea el endpoint GET /api/telares/8?origen=esp32 cada 2,5 s (8 es el id del telar en la base, TELAR_ID en el firmware) para conocer el estado deseado del telar avisa los usos manuales de la botonera por POST /api/telares/8/evento-fisico y reporta fallas por POST /api/errores. No existe integración con Firebase ni con bases de datos de series temporales externas: toda la persistencia vive en la misma base PostgreSQL (Neon) que usa la web.</w:t>
       </w:r>
     </w:p>
     <w:p>
@@ -7159,7 +7583,7 @@
           <w:rFonts w:ascii="IBM Plex Sans" w:cs="IBM Plex Sans" w:eastAsia="IBM Plex Sans" w:hAnsi="IBM Plex Sans"/>
           <w:rtl w:val="0"/>
         </w:rPr>
-        <w:t>El sondeo del ESP32 al backend (Nivel 1) es simple: consulta el estado del telar (apagado/tejiendo/pausado/error) y, ante un cambio, dispara un pulso de 300 ms en el relé de Marcha o de Pausa correspondiente. Para el Nivel 2 (control de las bobinas de selección), la secuencia completa del patrón se descarga una única vez a memoria del ESP32 y se ejecuta localmente pasada a pasada, sin depender de la red; el avance se reporta al backend en una cola acotada a 500 registros para no saturar el servidor tras una caída prolongada de conectividad. La siguiente tabla resume los endpoints principales que consumen el ESP32 y la web:</w:t>
+        <w:t>El sondeo del ESP32 al backend (Nivel 1) es simple: consulta el estado del telar (apagado/tejiendo/pausado/error) y, ante un cambio, dispara un pulso de 300 ms en el relé de Marcha o de Pausa correspondiente; cada pedido de Retroceder desde la web da un pulso en su relé, siempre después de la Pausa. Para el Nivel 2 (control de las bobinas de selección), la secuencia completa del patrón se descarga una única vez a memoria del ESP32 y se ejecuta localmente pasada a pasada, sin depender de la red; el avance se reporta al backend como conteo acumulado (cada segundo mientras teje y una vez más al detenerse): si un reporte se pierde por la red, el siguiente trae el número correcto igual. La siguiente tabla resume los endpoints principales que consumen el ESP32 y la web:</w:t>
       </w:r>
     </w:p>
     <w:tbl>
@@ -7463,7 +7887,7 @@
                 <w:rFonts w:ascii="IBM Plex Sans" w:cs="IBM Plex Sans" w:eastAsia="IBM Plex Sans" w:hAnsi="IBM Plex Sans"/>
                 <w:rtl w:val="0"/>
               </w:rPr>
-              <w:t>Avanza N pasos (fire-and-forget); nunca “termina”, vuelve a la fila 0 y suma vueltas_completadas.</w:t>
+              <w:t>Avanza la posición por reloj (una pasada cada 200 ms) mientras no haya sensor; nunca “termina”, vuelve a la fila 0 y suma vueltas_completadas. Con el sensor activo responde 409 y la posición la lleva el ESP32.</w:t>
             </w:r>
           </w:p>
         </w:tc>
@@ -7536,7 +7960,7 @@
                 <w:rFonts w:ascii="IBM Plex Sans" w:cs="IBM Plex Sans" w:eastAsia="IBM Plex Sans" w:hAnsi="IBM Plex Sans"/>
                 <w:rtl w:val="0"/>
               </w:rPr>
-              <w:t>Retrocede una pasada completa (RF08); devuelve al_inicio: true si no se puede retroceder más.</w:t>
+              <w:t>Retrocede una pasada completa (RF08); desde la primera fila vuelve a la última (el dibujo es un lazo) y lo indica con al_inicio: true.</w:t>
             </w:r>
           </w:p>
         </w:tc>
@@ -8727,7 +9151,7 @@
                 <w:rFonts w:ascii="IBM Plex Sans" w:hAnsi="IBM Plex Sans" w:cs="IBM Plex Sans" w:eastAsia="IBM Plex Sans"/>
                 <w:sz w:val="17"/>
               </w:rPr>
-              <w:t>Acciones rápidas de limpiar grilla, invertir valores y repetir bloques, para acelerar el trabajo del operario.</w:t>
+              <w:t>Limpiar la grilla, repeticiones por fila (una fila se teje hasta 9999 pasadas seguidas sin dibujarla de nuevo), simulador de color de hilo y ficha técnica en PDF, para acelerar el trabajo del operario.</w:t>
             </w:r>
           </w:p>
         </w:tc>
@@ -9263,7 +9687,7 @@
                 <w:rFonts w:ascii="IBM Plex Sans" w:hAnsi="IBM Plex Sans" w:cs="IBM Plex Sans" w:eastAsia="IBM Plex Sans"/>
                 <w:sz w:val="17"/>
               </w:rPr>
-              <w:t>Permite retroceder el tejido una pasada completa: pausa la ejecución, mueve la posición una fila atrás y pulsa el relé de Retroceder del telar.</w:t>
+              <w:t>Permite retroceder el tejido una pasada completa: pausa la ejecución, mueve la posición una pasada atrás y pulsa el relé de Retroceder del telar.</w:t>
             </w:r>
           </w:p>
         </w:tc>
@@ -9575,7 +9999,7 @@
                 <w:rFonts w:ascii="IBM Plex Sans" w:hAnsi="IBM Plex Sans" w:cs="IBM Plex Sans" w:eastAsia="IBM Plex Sans"/>
                 <w:sz w:val="17"/>
               </w:rPr>
-              <w:t>En implementación</w:t>
+              <w:t>Implementado</w:t>
             </w:r>
           </w:p>
         </w:tc>
@@ -12996,7 +13420,7 @@
           <w:rFonts w:ascii="IBM Plex Sans" w:cs="IBM Plex Sans" w:eastAsia="IBM Plex Sans" w:hAnsi="IBM Plex Sans"/>
           <w:rtl w:val="0"/>
         </w:rPr>
-        <w:t>El microcontrolador ESP32-WROOM-32 se comunica exclusivamente por Wi-Fi con el backend propio (Node.js/Express) mediante peticiones HTTP/REST en JSON: sondea GET /api/telares/8?origen=esp32 cada 2,5 s (8 es el id del telar en la base, TELAR_ID en el firmware) para conocer el estado deseado del telar y reporta fallas con POST /api/errores. El backend, es el único intermediario entre el ESP32, la web y la base de datos PostgreSQL alojada en Neon; no se utiliza MQTT, WebSockets ni ningún broker intermedio en el stack actual.</w:t>
+        <w:t>El microcontrolador ESP32-WROOM-32 se comunica exclusivamente por Wi-Fi con el backend propio (Node.js/Express) mediante peticiones HTTP/REST en JSON: sondea GET /api/telares/8?origen=esp32 cada 2,5 s (8 es el id del telar en la base, TELAR_ID en el firmware) para conocer el estado deseado del telar, avisa los usos manuales de la botonera con POST /api/telares/8/evento-fisico y reporta fallas con POST /api/errores. El backend, es el único intermediario entre el ESP32, la web y la base de datos PostgreSQL alojada en Neon; no se utiliza MQTT, WebSockets ni ningún broker intermedio en el stack actual.</w:t>
       </w:r>
     </w:p>
     <w:p>
@@ -14047,7 +14471,7 @@
                 <w:rFonts w:ascii="IBM Plex Sans" w:hAnsi="IBM Plex Sans" w:cs="IBM Plex Sans" w:eastAsia="IBM Plex Sans"/>
                 <w:sz w:val="17"/>
               </w:rPr>
-              <w:t>a definir</w:t>
+              <w:t>GPIO 35</w:t>
             </w:r>
           </w:p>
         </w:tc>
@@ -14313,7 +14737,7 @@
                 <w:rFonts w:ascii="IBM Plex Sans" w:hAnsi="IBM Plex Sans" w:cs="IBM Plex Sans" w:eastAsia="IBM Plex Sans"/>
                 <w:sz w:val="17"/>
               </w:rPr>
-              <w:t>Depende de medir las bobinas instaladas y de localizar el punto de intervención de la señal.</w:t>
+              <w:t>El punto de intervención ya está definido (la señal de cada lector óptico). Falta medir la salida de un lector y armar y probar los Bloques C y D.</w:t>
             </w:r>
           </w:p>
         </w:tc>
@@ -15061,7 +15485,7 @@
           <w:rFonts w:ascii="IBM Plex Sans" w:cs="IBM Plex Sans" w:eastAsia="IBM Plex Sans" w:hAnsi="IBM Plex Sans"/>
           <w:rtl w:val="0"/>
         </w:rPr>
-        <w:t>El ESP32 opera estrictamente a 3,3V, mientras que las señales nativas del telar trabajan bajo el estándar de 24V, exigiendo etapas intermedias de acondicionamiento y aislamiento. El chip genera calor interno por el uso constante del Wi-Fi y debido a eso, debe colocarse en un gabinete adecuadamente ventilado y separado de las fuentes de mayor ruido electromagnético (EMI) de los motores, para evitar reseteos provocados por picos inductivos. Las pistas de potencia de la PCB deben tener un grosor mínimo de 0,8 mm a 1 mm para mitigar caídas de tensión.</w:t>
+        <w:t>El ESP32 opera estrictamente a 3,3V, mientras que las señales nativas del telar trabajan bajo el estándar de 24V, exigiendo etapas intermedias de acondicionamiento y aislamiento. El chip genera calor interno por el uso constante del Wi-Fi y debido a eso, debe colocarse en un gabinete adecuadamente ventilado y separado de las fuentes de mayor ruido electromagnético (EMI) de los motores, para evitar reseteos provocados por picos inductivos. Las conexiones de 5 V y masa de la placa se hacen con cable o puentes de estaño de 0,8 mm a 1 mm, para evitar caídas de tensión cuando enganchan los relés.</w:t>
       </w:r>
     </w:p>
     <w:p>
@@ -15098,7 +15522,7 @@
           <w:rFonts w:ascii="IBM Plex Sans" w:cs="IBM Plex Sans" w:eastAsia="IBM Plex Sans" w:hAnsi="IBM Plex Sans"/>
           <w:rtl w:val="0"/>
         </w:rPr>
-        <w:t xml:space="preserve">Las señales de control de 24V nativas del telar interactuarán con la PCB del ESP32 de forma aislada mediante optoacopladores rápidos (PC817) para independizar las masas de los motores y proteger el circuito digital. Las interconexiones externas utilizarán cable multifilar de 1 mm² (el unifilar rígido se corta por fatiga ante la vibración del entorno textil), sin blindaje: la señal de contacto seco a 24 V tiene inmunidad de sobra, el telar no cuenta con variador de frecuencia y su electrónica está alojada en una caja metálica que contiene el ruido en su origen. El nodo emplea borneras de conexión atornillables instaladas directamente en la placa para la alimentación y el direccionamiento seguro de las señales lógicas hacia las etapas de potencia, manteniendo todo el cableado protegido dentro del gabinete principal. </w:t>
+        <w:t xml:space="preserve">Las señales de control de 24V nativas del telar interactúan con la placa del ESP32 de forma aislada mediante optoacopladores rápidos (PC817) para independizar las masas de los motores y proteger el circuito digital. Las interconexiones externas utilizarán cable multifilar de 1 mm² (el unifilar rígido se corta por fatiga ante la vibración del entorno textil), sin blindaje: la señal de contacto seco a 24 V tiene inmunidad de sobra, el telar no cuenta con variador de frecuencia y su electrónica está alojada en una caja metálica que contiene el ruido en su origen. El nodo emplea borneras de conexión atornillables instaladas directamente en la placa para la alimentación y el direccionamiento seguro de las señales lógicas hacia las etapas de potencia, manteniendo todo el cableado protegido dentro del gabinete principal. </w:t>
       </w:r>
     </w:p>
     <w:p>
@@ -15326,7 +15750,7 @@
           <w:rFonts w:ascii="IBM Plex Sans" w:cs="IBM Plex Sans" w:eastAsia="IBM Plex Sans" w:hAnsi="IBM Plex Sans"/>
           <w:rtl w:val="0"/>
         </w:rPr>
-        <w:t>Microcontrolador ESP32-WROOM-32 (Soldado directo a pistas, en tablero separado IP65), con código C++ protegido por temporizador de hardware de 15 s, encargado de sondear por Wi-Fi/HTTP el estado del telar en el backend cada 2,5 s y accionar los relés de Marcha/Pausa.</w:t>
+        <w:t>Microcontrolador ESP32-WROOM-32 (Soldado directo a pistas, en tablero separado IP65), con código C++ protegido por temporizador de hardware de 15 s, encargado de sondear por Wi-Fi/HTTP el estado del telar en el backend cada 2,5 s y accionar los relés de Marcha, Pausa y Retroceder.</w:t>
       </w:r>
     </w:p>
     <w:p>
@@ -15600,7 +16024,7 @@
           <w:rFonts w:ascii="IBM Plex Sans" w:cs="IBM Plex Sans" w:eastAsia="IBM Plex Sans" w:hAnsi="IBM Plex Sans"/>
           <w:rtl w:val="0"/>
         </w:rPr>
-        <w:t>Plano de masa continuo en la PCB con separación estricta entre la zona digital 3.3 V y la de potencia 24V.</w:t>
+        <w:t>Placa universal perforada con la zona de 3,3 V separada de la de los relés, y una sola referencia de masa para todo el nodo, evitando bucles de masa (ground loops). Los 24 V del telar no llegan a la placa: quedan del otro lado de los relés y de los optoacopladores.</w:t>
       </w:r>
     </w:p>
     <w:p>
@@ -15621,7 +16045,7 @@
           <w:rFonts w:ascii="IBM Plex Sans" w:cs="IBM Plex Sans" w:eastAsia="IBM Plex Sans" w:hAnsi="IBM Plex Sans"/>
           <w:rtl w:val="0"/>
         </w:rPr>
-        <w:t>Uso de filtros LC pasivos en las líneas de alimentación del ESP32 y una referencia de masa única para todo el nodo, evitando bucles de masa (ground loops).</w:t>
+        <w:t>Desacople de la alimentación: un capacitor electrolítico de 470 µF en el bus de 5 V, que sostiene la tensión cuando engancha un relé, y capacitores cerámicos de 100 nF junto al ESP32 y junto a cada módulo de relé.</w:t>
       </w:r>
       <w:r>
         <w:rPr>
@@ -19116,7 +19540,7 @@
                 <w:rFonts w:ascii="IBM Plex Sans" w:hAnsi="IBM Plex Sans"/>
                 <w:sz w:val="17"/>
               </w:rPr>
-              <w:t>Pausa el tejido, mueve la posición una fila atrás, lo refleja en pantalla y pulsa el relé del telar.</w:t>
+              <w:t>Pausa el tejido, mueve la posición una pasada atrás, lo refleja en pantalla y pulsa el relé del telar.</w:t>
             </w:r>
           </w:p>
         </w:tc>
@@ -19226,7 +19650,7 @@
                 <w:rFonts w:ascii="IBM Plex Sans" w:hAnsi="IBM Plex Sans"/>
                 <w:sz w:val="17"/>
               </w:rPr>
-              <w:t>En curso</w:t>
+              <w:t>Terminado</w:t>
             </w:r>
           </w:p>
         </w:tc>
@@ -19396,7 +19820,7 @@
           <w:rFonts w:ascii="IBM Plex Sans" w:cs="IBM Plex Sans" w:eastAsia="IBM Plex Sans" w:hAnsi="IBM Plex Sans"/>
           <w:rtl w:val="0"/>
         </w:rPr>
-        <w:t xml:space="preserve"> Repositorio centralizado para el control de versiones del firmware C++ y los archivos de diseño de la placa KiCad, donde cada miembro debe estar registrado como colaborador activo e incluir la descripción técnica estructurada en el archivos informativos. </w:t>
+        <w:t xml:space="preserve"> Repositorio centralizado para el control de versiones del firmware C++, el backend, la web y la documentación, donde cada miembro debe estar registrado como colaborador activo e incluir la descripción técnica estructurada en el archivos informativos. </w:t>
       </w:r>
     </w:p>
     <w:p>
@@ -20213,7 +20637,7 @@
                 <w:color w:val="1f1f1f"/>
                 <w:rtl w:val="0"/>
               </w:rPr>
-              <w:t>Espressif ESP32-WROOM-32U</w:t>
+              <w:t>Espressif ESP32-WROOM-32</w:t>
             </w:r>
           </w:p>
         </w:tc>
@@ -21558,7 +21982,7 @@
           <w:bCs w:val="1"/>
           <w:rtl w:val="0"/>
         </w:rPr>
-        <w:t>Ficha técnica descargable: implementado. Reúne en un PDF los datos del dibujo (nombre, dimensiones, matriz, repeticiones de cada fila y colores) junto con las instrucciones de tejido, exportable desde la propia biblioteca.</w:t>
+        <w:t>Ficha técnica descargable: implementado. Reúne en un PDF los datos del dibujo (nombre, dimensiones, matriz, repeticiones de cada fila y colores) junto con las instrucciones de tejido, que se descarga desde el editor.</w:t>
       </w:r>
       <w:r>
         <w:rPr>

</xml_diff>

<commit_message>
Documentación: tramos intercalados y telar en la vista previa (manual web, documentación de proyecto, READMEs)
Co-Authored-By: Claude Opus 5.5 <noreply@anthropic.com>
Claude-Session: https://claude.ai/code/session_01QiY8ZZNAM9gwPKiqSkCaaj
</commit_message>
<xml_diff>
--- a/documentacion_proyecto/Documentación_de_Proyecto.docx
+++ b/documentacion_proyecto/Documentación_de_Proyecto.docx
@@ -4084,7 +4084,7 @@
           <w:color w:val="000000"/>
           <w:rtl w:val="0"/>
         </w:rPr>
-        <w:t>grilla interactiva donde cada fila lleva una sola bobina (una trama por pasada), que se teje en una o más pasadas seguidas, y cada columna es una bobina de selección: tocar una celda la activa o la desactiva para esa pasada. Al costado de cada fila se indica cuántas pasadas seguidas se teje. Arriba se definen las filas (1 a 300) y las columnas (1 a 8), el nombre del dibujo con su indicador de estado, y una barra con el estado del equipo del telar (conexión, tejido y conteo del sensor). Incluye las herramientas Limpiar, Intercalar (secuencias que alternan bobinas, por ejemplo 1, 3 y 2), el simulador de color de hilo, la ficha del dibujo (metros por pasada e hilado) y la descarga de la ficha técnica en PDF; los controles ▶, Pausa, Retroceder y Terminar trabajo (⏹), que resaltan la fila que se está tejiendo; y los botones Nuevo y Guardar.</w:t>
+        <w:t>grilla interactiva donde cada fila lleva una sola bobina (una trama por pasada), que se teje en una o más pasadas seguidas, y cada columna es una bobina de selección: tocar una celda la activa o la desactiva para esa pasada. Al costado de cada fila se indica cuántas pasadas seguidas se teje. Arriba se definen las filas (1 a 300) y las columnas (1 a 8), el nombre del dibujo con su indicador de estado, y una barra con el estado del equipo del telar (conexión, tejido y conteo del sensor). Incluye las herramientas Limpiar, Intercalar (tramos que alternan bobinas una por pasada, por ejemplo 1, 3, 4 y 2 durante 120 pasadas, en una sola fila), el simulador de color de hilo, la ficha del dibujo (metros por pasada e hilado) y la descarga de la ficha técnica en PDF; los controles ▶, Pausa, Retroceder y Terminar trabajo (⏹), que resaltan la fila que se está tejiendo; y los botones Nuevo y Guardar.</w:t>
       </w:r>
     </w:p>
     <w:p>
@@ -4471,7 +4471,7 @@
                 <w:rFonts w:ascii="IBM Plex Sans" w:cs="IBM Plex Sans" w:eastAsia="IBM Plex Sans" w:hAnsi="IBM Plex Sans"/>
                 <w:rtl w:val="0"/>
               </w:rPr>
-              <w:t>nombre, filas (1 a 300), columnas (1 a 8), matriz_pasadas (JSONB), matriz_ligamento (JSONB), repeticiones_por_fila, colores_filas (JSONB), metadata (JSONB), metros_por_pasada, hilado_peso_kg, hilado_metros_max, hilado_pasadas_base, creado_por_invitado</w:t>
+              <w:t>nombre, filas (1 a 300), columnas (1 a 8), matriz_pasadas (JSONB), matriz_ligamento (JSONB), repeticiones_por_fila, colores_filas (JSONB), metadata (JSONB), metros_por_pasada, secuencias_por_fila, hilado_peso_kg, hilado_metros_max, hilado_pasadas_base, creado_por_invitado</w:t>
             </w:r>
           </w:p>
         </w:tc>
@@ -5128,6 +5128,24 @@
           <w:sz w:val="16"/>
           <w:rtl w:val="0"/>
         </w:rPr>
+        <w:t xml:space="preserve">  secuencias_por_fila    JSONB,            -- tramo intercalado: orden de bobinas (o null)</w:t>
+      </w:r>
+    </w:p>
+    <w:p>
+      <w:pPr>
+        <w:spacing w:after="0" w:before="0" w:line="240" w:lineRule="auto"/>
+        <w:jc w:val="left"/>
+        <w:rPr>
+          <w:rFonts w:ascii="IBM Plex Sans" w:cs="IBM Plex Sans" w:eastAsia="IBM Plex Sans" w:hAnsi="IBM Plex Sans"/>
+        </w:rPr>
+        <w:shd w:fill="F2F0EC"/>
+      </w:pPr>
+      <w:r>
+        <w:rPr>
+          <w:rFonts w:ascii="Consolas" w:cs="Consolas" w:eastAsia="Consolas" w:hAnsi="Consolas"/>
+          <w:sz w:val="16"/>
+          <w:rtl w:val="0"/>
+        </w:rPr>
         <w:t xml:space="preserve">  colores_filas          JSONB,            -- color de hilo por fila (#RRGGBB)</w:t>
       </w:r>
     </w:p>
@@ -6662,7 +6680,7 @@
           <w:rFonts w:ascii="IBM Plex Sans" w:cs="IBM Plex Sans" w:eastAsia="IBM Plex Sans" w:hAnsi="IBM Plex Sans"/>
           <w:rtl w:val="0"/>
         </w:rPr>
-        <w:t>En la aplicación web, cada celda de la grilla del editor vale 0 o 1: la bobina de esa columna se activa o no. Cada FILA de matriz_pasadas lleva como máximo una bobina activa, porque en cada pasada entra una sola trama (el servidor rechaza una fila con dos), y se teje durante tantas pasadas seguidas como indique su número en repeticiones_por_fila (de 1 a 9999; sin ese dato, una pasada por fila). Así una fila con 100 repeticiones son 100 pasadas de la misma bobina, sin tener que dibujar 100 filas iguales. Una fila sin ninguna celda activa sigue siendo una pasada válida, en la que no se activa ninguna bobina. El campo matriz_ligamento guarda la misma grilla en formato binario, para la representación visual del dibujo.</w:t>
+        <w:t>En la aplicación web, cada celda de la grilla del editor vale 0 o 1: la bobina de esa columna se activa o no. Cada FILA de matriz_pasadas lleva como máximo una bobina activa, porque en cada pasada entra una sola trama (el servidor rechaza una fila con dos). La excepción es un tramo intercalado: secuencias_por_fila guarda para esa fila el orden de sus bobinas, por ejemplo [1, 3, 4, 2], y en cada pasada se activa la que sigue en ese orden; la fila marca exactamente esas bobinas, y se teje durante tantas pasadas seguidas como indique su número en repeticiones_por_fila (de 1 a 9999; sin ese dato, una pasada por fila). Así una fila con 100 repeticiones son 100 pasadas de la misma bobina, sin tener que dibujar 100 filas iguales. Una fila sin ninguna celda activa sigue siendo una pasada válida, en la que no se activa ninguna bobina. El campo matriz_ligamento guarda la misma grilla en formato binario, para la representación visual del dibujo.</w:t>
       </w:r>
     </w:p>
     <w:p>
@@ -9205,7 +9223,7 @@
                 <w:rFonts w:ascii="IBM Plex Sans" w:hAnsi="IBM Plex Sans" w:cs="IBM Plex Sans" w:eastAsia="IBM Plex Sans"/>
                 <w:sz w:val="17"/>
               </w:rPr>
-              <w:t>Limpiar la grilla, repeticiones por fila (una fila se teje hasta 9999 pasadas seguidas sin dibujarla de nuevo), Intercalar (arma secuencias que alternan bobinas, como 1, 3 y 2 repetidas N veces), simulador de color de hilo y ficha técnica en PDF, para acelerar el trabajo del operario.</w:t>
+              <w:t>Limpiar la grilla, repeticiones por fila (una fila se teje hasta 9999 pasadas seguidas sin dibujarla de nuevo), Intercalar (arma tramos que alternan bobinas una por pasada, como 1, 3, 4 y 2 durante 120 pasadas, en una sola fila), simulador de color de hilo y ficha técnica en PDF, para acelerar el trabajo del operario.</w:t>
             </w:r>
           </w:p>
         </w:tc>
@@ -12273,7 +12291,7 @@
           <w:rFonts w:ascii="IBM Plex Sans" w:cs="IBM Plex Sans" w:eastAsia="IBM Plex Sans" w:hAnsi="IBM Plex Sans"/>
           <w:rtl w:val="0"/>
         </w:rPr>
-        <w:t>Validación del tamaño (de 1 a 300 filas y de 1 a 8 columnas, una por bobina): un valor fuera de rango se informa y se corrige. Una sola bobina por fila: al marcar otra, la anterior se desmarca. Herramientas: Limpiar, Intercalar, simulador de color de hilo y ficha técnica en PDF.</w:t>
+        <w:t>Validación del tamaño (de 1 a 300 filas y de 1 a 8 columnas, una por bobina): un valor fuera de rango se informa y se corrige. Una sola bobina por fila: al marcar otra, la anterior se desmarca; un tramo intercalado alterna sus bobinas una por pasada. Herramientas: Limpiar, Intercalar, simulador de color de hilo y ficha técnica en PDF.</w:t>
       </w:r>
     </w:p>
     <w:p>
@@ -22036,7 +22054,7 @@
           <w:bCs w:val="1"/>
           <w:rtl w:val="0"/>
         </w:rPr>
-        <w:t>Ficha técnica descargable: implementado. Reúne en un PDF los datos del dibujo (nombre, dimensiones, matriz, repeticiones de cada fila y colores), la producción (metros tejidos, pasadas, metros que faltan y horas de máquina) y el hilado (peso, metros que alcanza a tejer, usado y restante), junto con las instrucciones de tejido; se descarga desde el editor. El hilado se carga en la ficha del dibujo (ícono de engranaje).</w:t>
+        <w:t>Ficha técnica descargable: implementado. Reúne en un PDF los datos del dibujo (nombre, dimensiones, matriz, repeticiones de cada fila y colores), la producción (metros tejidos, pasadas, metros que faltan y horas de máquina) y el hilado (peso, metros que alcanza a tejer, usado y restante) y una vista previa de la tela con el telar dibujado arriba, junto con las instrucciones de tejido; se descarga desde el editor. El hilado se carga en la ficha del dibujo (ícono de engranaje).</w:t>
       </w:r>
       <w:r>
         <w:rPr>

</xml_diff>

<commit_message>
Documentación: intercalados por grupos de filas (manual web, documentación de proyecto, manual de instalación, READMEs)
Co-Authored-By: Claude Opus 5.5 <noreply@anthropic.com>
Claude-Session: https://claude.ai/code/session_01QiY8ZZNAM9gwPKiqSkCaaj
</commit_message>
<xml_diff>
--- a/documentacion_proyecto/Documentación_de_Proyecto.docx
+++ b/documentacion_proyecto/Documentación_de_Proyecto.docx
@@ -4084,7 +4084,7 @@
           <w:color w:val="000000"/>
           <w:rtl w:val="0"/>
         </w:rPr>
-        <w:t>grilla interactiva donde cada fila lleva una sola bobina (una trama por pasada), que se teje en una o más pasadas seguidas, y cada columna es una bobina de selección: tocar una celda la activa o la desactiva para esa pasada. Al costado de cada fila se indica cuántas pasadas seguidas se teje. Arriba se definen las filas (1 a 300) y las columnas (1 a 8), el nombre del dibujo con su indicador de estado, y una barra con el estado del equipo del telar (conexión, tejido y conteo del sensor). Incluye las herramientas Limpiar, Intercalar (tramos que alternan bobinas una por pasada, por ejemplo 1, 3, 4 y 2 durante 120 pasadas, en una sola fila), el simulador de color de hilo, la ficha del dibujo (metros por pasada e hilado) y la descarga de la ficha técnica en PDF; los controles ▶, Pausa, Retroceder y Terminar trabajo (⏹), que resaltan la fila que se está tejiendo; y los botones Nuevo y Guardar.</w:t>
+        <w:t>grilla interactiva donde cada fila lleva una sola bobina (una trama por pasada), que se teje en una o más pasadas seguidas, y cada columna es una bobina de selección: tocar una celda la activa o la desactiva para esa pasada. Al costado de cada fila se indica cuántas pasadas seguidas se teje. Arriba se definen las filas (1 a 300) y las columnas (1 a 8), el nombre del dibujo con su indicador de estado, y una barra con el estado del equipo del telar (conexión, tejido y conteo del sensor). Incluye las herramientas Limpiar, Intercalar (agrupa filas seguidas, cada una con su bobina, para que se alternen pasada por pasada: por ejemplo las filas de las bobinas 1, 3, 4 y 2 durante 120 pasadas), el simulador de color de hilo, la ficha del dibujo (metros por pasada e hilado) y la descarga de la ficha técnica en PDF; los controles ▶, Pausa, Retroceder y Terminar trabajo (⏹), que resaltan la fila que se está tejiendo; y los botones Nuevo y Guardar.</w:t>
       </w:r>
     </w:p>
     <w:p>
@@ -4471,7 +4471,7 @@
                 <w:rFonts w:ascii="IBM Plex Sans" w:cs="IBM Plex Sans" w:eastAsia="IBM Plex Sans" w:hAnsi="IBM Plex Sans"/>
                 <w:rtl w:val="0"/>
               </w:rPr>
-              <w:t>nombre, filas (1 a 300), columnas (1 a 8), matriz_pasadas (JSONB), matriz_ligamento (JSONB), repeticiones_por_fila, colores_filas (JSONB), metadata (JSONB), metros_por_pasada, secuencias_por_fila, hilado_peso_kg, hilado_metros_max, hilado_pasadas_base, creado_por_invitado</w:t>
+              <w:t>nombre, filas (1 a 300), columnas (1 a 8), matriz_pasadas (JSONB), matriz_ligamento (JSONB), repeticiones_por_fila, colores_filas (JSONB), metadata (JSONB), metros_por_pasada, grupos_intercalados, hilado_peso_kg, hilado_metros_max, hilado_pasadas_base, creado_por_invitado</w:t>
             </w:r>
           </w:p>
         </w:tc>
@@ -5128,7 +5128,7 @@
           <w:sz w:val="16"/>
           <w:rtl w:val="0"/>
         </w:rPr>
-        <w:t xml:space="preserve">  secuencias_por_fila    JSONB,            -- tramo intercalado: orden de bobinas (o null)</w:t>
+        <w:t xml:space="preserve">  grupos_intercalados    JSONB,            -- filas intercaladas: [{desde, hasta, pasadas}]</w:t>
       </w:r>
     </w:p>
     <w:p>
@@ -6680,7 +6680,7 @@
           <w:rFonts w:ascii="IBM Plex Sans" w:cs="IBM Plex Sans" w:eastAsia="IBM Plex Sans" w:hAnsi="IBM Plex Sans"/>
           <w:rtl w:val="0"/>
         </w:rPr>
-        <w:t>En la aplicación web, cada celda de la grilla del editor vale 0 o 1: la bobina de esa columna se activa o no. Cada FILA de matriz_pasadas lleva como máximo una bobina activa, porque en cada pasada entra una sola trama (el servidor rechaza una fila con dos). La excepción es un tramo intercalado: secuencias_por_fila guarda para esa fila el orden de sus bobinas, por ejemplo [1, 3, 4, 2], y en cada pasada se activa la que sigue en ese orden; la fila marca exactamente esas bobinas, y se teje durante tantas pasadas seguidas como indique su número en repeticiones_por_fila (de 1 a 9999; sin ese dato, una pasada por fila). Así una fila con 100 repeticiones son 100 pasadas de la misma bobina, sin tener que dibujar 100 filas iguales. Una fila sin ninguna celda activa sigue siendo una pasada válida, en la que no se activa ninguna bobina. El campo matriz_ligamento guarda la misma grilla en formato binario, para la representación visual del dibujo.</w:t>
+        <w:t>En la aplicación web, cada celda de la grilla del editor vale 0 o 1: la bobina de esa columna se activa o no. Cada FILA de matriz_pasadas lleva como máximo una bobina activa, porque en cada pasada entra una sola trama (el servidor rechaza una fila con dos). Para alternar bobinas, grupos_intercalados agrupa filas seguidas ({desde, hasta, pasadas}, con índices desde 0): sus filas se recorren en orden, cada una sus repeticiones, hasta completar las pasadas del grupo; para la posición, el grupo cuenta como una sola fila larga que empieza en su primera fila. Cada fila común se teje durante tantas pasadas seguidas como indique su número en repeticiones_por_fila (de 1 a 9999; sin ese dato, una pasada por fila). Así una fila con 100 repeticiones son 100 pasadas de la misma bobina, sin tener que dibujar 100 filas iguales. Una fila sin ninguna celda activa sigue siendo una pasada válida, en la que no se activa ninguna bobina. El campo matriz_ligamento guarda la misma grilla en formato binario, para la representación visual del dibujo.</w:t>
       </w:r>
     </w:p>
     <w:p>
@@ -9223,7 +9223,7 @@
                 <w:rFonts w:ascii="IBM Plex Sans" w:hAnsi="IBM Plex Sans" w:cs="IBM Plex Sans" w:eastAsia="IBM Plex Sans"/>
                 <w:sz w:val="17"/>
               </w:rPr>
-              <w:t>Limpiar la grilla, repeticiones por fila (una fila se teje hasta 9999 pasadas seguidas sin dibujarla de nuevo), Intercalar (arma tramos que alternan bobinas una por pasada, como 1, 3, 4 y 2 durante 120 pasadas, en una sola fila), simulador de color de hilo y ficha técnica en PDF, para acelerar el trabajo del operario.</w:t>
+              <w:t>Limpiar la grilla, repeticiones por fila (una fila se teje hasta 9999 pasadas seguidas sin dibujarla de nuevo), Intercalar (agrupa filas seguidas para que se alternen pasada por pasada, como las de las bobinas 1, 3, 4 y 2 durante 120 pasadas), simulador de color de hilo y ficha técnica en PDF, para acelerar el trabajo del operario.</w:t>
             </w:r>
           </w:p>
         </w:tc>
@@ -12291,7 +12291,7 @@
           <w:rFonts w:ascii="IBM Plex Sans" w:cs="IBM Plex Sans" w:eastAsia="IBM Plex Sans" w:hAnsi="IBM Plex Sans"/>
           <w:rtl w:val="0"/>
         </w:rPr>
-        <w:t>Validación del tamaño (de 1 a 300 filas y de 1 a 8 columnas, una por bobina): un valor fuera de rango se informa y se corrige. Una sola bobina por fila: al marcar otra, la anterior se desmarca; un tramo intercalado alterna sus bobinas una por pasada. Herramientas: Limpiar, Intercalar, simulador de color de hilo y ficha técnica en PDF.</w:t>
+        <w:t>Validación del tamaño (de 1 a 300 filas y de 1 a 8 columnas, una por bobina): un valor fuera de rango se informa y se corrige. Una sola bobina por fila: al marcar otra, la anterior se desmarca; las filas de un intercalado se alternan pasada por pasada. Herramientas: Limpiar, Intercalar, simulador de color de hilo y ficha técnica en PDF.</w:t>
       </w:r>
     </w:p>
     <w:p>

</xml_diff>

<commit_message>
Sitios web de la documentación y los manuales, al día con los Word
Se suman a docs/sitios/ las versiones web de la Documentación de Proyecto
(web_doc/) y de los dos manuales de uso (manuales/), con su diseño y el
contenido actual de los Word: una bobina por fila, intercalados, hilado,
modo invitado, ficha en PDF, esquema y ejemplo JSON nuevos, capturas
nuevas y la demostración de la grilla con una sola bobina por fila.

Al comparar aparecieron errores que se corrigen también en los Word y
diagramas: el ejemplo JSON tenía dos bobinas por fila, los diagramas ERD
y DER_Negocio no tenían las columnas de las migraciones 020 y 022, la
tabla de interfaces nombraba una app que no existe, y los manuales
describían mal la pantalla de Inicio y dónde se ve el estado del telar.

Co-Authored-By: Claude Opus 5.5 <noreply@anthropic.com>
Claude-Session: https://claude.ai/code/session_01QiY8ZZNAM9gwPKiqSkCaaj
</commit_message>
<xml_diff>
--- a/documentacion_proyecto/Documentación_de_Proyecto.docx
+++ b/documentacion_proyecto/Documentación_de_Proyecto.docx
@@ -6731,7 +6731,7 @@
           <w:sz w:val="16"/>
           <w:rtl w:val="0"/>
         </w:rPr>
-        <w:t xml:space="preserve">  "nombre": "Tafetán simple",</w:t>
+        <w:t xml:space="preserve">  "nombre": "Dos bobinas alternadas",</w:t>
       </w:r>
     </w:p>
     <w:p>
@@ -6803,7 +6803,7 @@
           <w:sz w:val="16"/>
           <w:rtl w:val="0"/>
         </w:rPr>
-        <w:t xml:space="preserve">    [1, 0, 1, 0],</w:t>
+        <w:t xml:space="preserve">    [1, 0, 0, 0],</w:t>
       </w:r>
     </w:p>
     <w:p>
@@ -6821,7 +6821,7 @@
           <w:sz w:val="16"/>
           <w:rtl w:val="0"/>
         </w:rPr>
-        <w:t xml:space="preserve">    [0, 1, 0, 1],</w:t>
+        <w:t xml:space="preserve">    [0, 1, 0, 0],</w:t>
       </w:r>
     </w:p>
     <w:p>
@@ -6839,7 +6839,7 @@
           <w:sz w:val="16"/>
           <w:rtl w:val="0"/>
         </w:rPr>
-        <w:t xml:space="preserve">    [1, 0, 1, 0],</w:t>
+        <w:t xml:space="preserve">    [1, 0, 0, 0],</w:t>
       </w:r>
     </w:p>
     <w:p>
@@ -6857,7 +6857,7 @@
           <w:sz w:val="16"/>
           <w:rtl w:val="0"/>
         </w:rPr>
-        <w:t xml:space="preserve">    [0, 1, 0, 1]</w:t>
+        <w:t xml:space="preserve">    [0, 1, 0, 0]</w:t>
       </w:r>
     </w:p>
     <w:p>
@@ -6911,7 +6911,7 @@
           <w:sz w:val="16"/>
           <w:rtl w:val="0"/>
         </w:rPr>
-        <w:t xml:space="preserve">    [1, 0, 1, 0],</w:t>
+        <w:t xml:space="preserve">    [1, 0, 0, 0],</w:t>
       </w:r>
     </w:p>
     <w:p>
@@ -6929,7 +6929,7 @@
           <w:sz w:val="16"/>
           <w:rtl w:val="0"/>
         </w:rPr>
-        <w:t xml:space="preserve">    [0, 1, 0, 1],</w:t>
+        <w:t xml:space="preserve">    [0, 1, 0, 0],</w:t>
       </w:r>
     </w:p>
     <w:p>
@@ -6947,7 +6947,7 @@
           <w:sz w:val="16"/>
           <w:rtl w:val="0"/>
         </w:rPr>
-        <w:t xml:space="preserve">    [1, 0, 1, 0],</w:t>
+        <w:t xml:space="preserve">    [1, 0, 0, 0],</w:t>
       </w:r>
     </w:p>
     <w:p>
@@ -6965,7 +6965,7 @@
           <w:sz w:val="16"/>
           <w:rtl w:val="0"/>
         </w:rPr>
-        <w:t xml:space="preserve">    [0, 1, 0, 1]</w:t>
+        <w:t xml:space="preserve">    [0, 1, 0, 0]</w:t>
       </w:r>
     </w:p>
     <w:p>
@@ -13045,7 +13045,7 @@
                 <w:rFonts w:ascii="IBM Plex Sans" w:hAnsi="IBM Plex Sans" w:cs="IBM Plex Sans" w:eastAsia="IBM Plex Sans"/>
                 <w:sz w:val="17"/>
               </w:rPr>
-              <w:t>La página web, la app y el ESP32 consultan y modifican los datos exclusivamente por la API. Ningún cliente accede a la base de datos directamente.</w:t>
+              <w:t>La página web y el ESP32 consultan y modifican los datos exclusivamente por la API. Ningún cliente accede a la base de datos directamente.</w:t>
             </w:r>
           </w:p>
         </w:tc>

</xml_diff>

<commit_message>
Costos: valor por hora de Electrónica (30 USD) y Multimedios (27 USD)
Estimación de Costos y Modalidad de inversión recalculadas (presupuesto
$39.446.255), Figura 13 y sección 8 de la Documentación al día, planilla
del Gantt exportada con la pestaña de costos corregida, nota en la Bitácora.

Co-Authored-By: Claude Opus 5.5 <noreply@anthropic.com>
Claude-Session: https://claude.ai/code/session_01QiY8ZZNAM9gwPKiqSkCaaj
</commit_message>
<xml_diff>
--- a/documentacion_proyecto/Documentación_de_Proyecto.docx
+++ b/documentacion_proyecto/Documentación_de_Proyecto.docx
@@ -20910,7 +20910,7 @@
           <w:rFonts w:ascii="IBM Plex Sans" w:cs="IBM Plex Sans" w:eastAsia="IBM Plex Sans" w:hAnsi="IBM Plex Sans"/>
           <w:rtl w:val="0"/>
         </w:rPr>
-        <w:t>El presupuesto se organiza en cuatro bloques de compra y confirma que toda la arquitectura de software seleccionada es de uso libre, con costo de licenciamiento mensual de $0. Los valores corresponden a la revisión del 28/08/2026 y se mantienen actualizados en la planilla del equipo (Lista_de_componentes_Control_Trama.xlsx y Estimacion_Costos_Ganancia_Contrato_v4.docx).</w:t>
+        <w:t>El presupuesto se organiza en cuatro bloques de compra y confirma que toda la arquitectura de software seleccionada es de uso libre, con costo de licenciamiento mensual de $0. Los valores corresponden a la revisión del 19/10/2026 y se mantienen actualizados en la planilla del equipo (Lista_de_componentes_Control_Trama.xlsx y Estimacion_Costos_Ganancia_Contrato_v4.docx).</w:t>
       </w:r>
     </w:p>
     <w:p>
@@ -20983,7 +20983,7 @@
           <w:color w:val="606060"/>
           <w:sz w:val="18"/>
         </w:rPr>
-        <w:t>Figura 13. Estructura de costos del proyecto y esquema del servicio de mantenimiento.</w:t>
+        <w:t>Figura 13. Estructura de costos del proyecto.</w:t>
       </w:r>
     </w:p>
     <w:p>
@@ -21003,7 +21003,7 @@
           <w:bCs w:val="1"/>
           <w:rtl w:val="0"/>
         </w:rPr>
-        <w:t>Los componentes efectivamente adquiridos para el Bloque A suman $73.653, a los que se agregan $13.950 del Bloque C y $34.536 del Bloque D, totalizando $122.139 en materiales. Sumando los gastos operativos de $109.675 y el valor del trabajo del equipo, valuado en $29.411.089 según las tarifas del proyecto, el costo total asciende a $29.642.903. Aplicando el margen del 25 % previsto, el presupuesto final es de $37.053.629, con una ganancia proyectada de $7.410.726.</w:t>
+        <w:t>Los componentes efectivamente adquiridos para el Bloque A suman $73.653, a los que se agregan $13.950 del Bloque C y $34.536 del Bloque D, totalizando $122.139 en materiales. Sumando los gastos operativos de $109.675 y el valor del trabajo del equipo, valuado en $31.325.190 según las tarifas del proyecto, el costo total asciende a $31.557.004. Aplicando el margen del 25 % previsto, el presupuesto final es de $39.446.255, con una ganancia proyectada de $7.889.251.</w:t>
       </w:r>
     </w:p>
     <w:tbl>
@@ -21603,7 +21603,7 @@
         <w:rPr>
           <w:rFonts w:ascii="IBM Plex Sans" w:hAnsi="IBM Plex Sans" w:cs="IBM Plex Sans" w:eastAsia="IBM Plex Sans"/>
         </w:rPr>
-        <w:t>La estructura de costos muestra que el 99,2 % corresponde al trabajo del equipo y solo el 0,8 % ($231.814, materiales y gastos operativos) a dinero efectivamente desembolsado. Orden de compra recomendado: (1) Bloque A, ya adquirido e instalado en el telar; (2) la medición del lector óptico en el telar; y (3) lo que falta de los Bloques C y D (el sensor ya se compró y el relé LCA110 se probó en protoboard), cuya resistencia de protección depende de esa medición. La planilla completa, con el detalle por ítem y los precios de referencia, se mantiene en el archivo Lista_de_componentes_Control_Trama.xlsx de la carpeta compartida del equipo.</w:t>
+        <w:t>La estructura de costos muestra que el 99,3 % corresponde al trabajo del equipo y solo el 0,7 % ($231.814, materiales y gastos operativos) a dinero efectivamente desembolsado. Orden de compra recomendado: (1) Bloque A, ya adquirido e instalado en el telar; (2) la medición del lector óptico en el telar; y (3) lo que falta de los Bloques C y D (el sensor ya se compró y el relé LCA110 se probó en protoboard), cuya resistencia de protección depende de esa medición. La planilla completa, con el detalle por ítem y los precios de referencia, se mantiene en el archivo Lista_de_componentes_Control_Trama.xlsx de la carpeta compartida del equipo.</w:t>
       </w:r>
       <w:r>
         <w:rPr>
@@ -21638,7 +21638,7 @@
           <w:bCs w:val="1"/>
           <w:rtl w:val="0"/>
         </w:rPr>
-        <w:t>Costos de operación mensuales recurrentes: $0. El plan gratuito de Neon cubre las necesidades de un piloto de un solo telar sin costo de licenciamiento, y el despliegue del backend se realiza también sobre un plan sin cargo. A esto se suma el servicio de mantenimiento posterior a la garantía, detallado en la Estimación de Costos, que prevé un abono mensual de $129.625 y visitas de mantenimiento preventivo de $240.188 cada una.</w:t>
+        <w:t>Costos de operación mensuales recurrentes: $0. El plan gratuito de Neon cubre las necesidades de un piloto de un solo telar sin costo de licenciamiento, y el despliegue del backend se realiza también sobre un plan sin cargo. A esto se suma el servicio de mantenimiento posterior a la garantía, detallado en la Estimación de Costos, que prevé un abono mensual de $129.625 y visitas de mantenimiento preventivo de $228.750 cada una.</w:t>
       </w:r>
       <w:r>
         <w:rPr>

</xml_diff>

<commit_message>
Revisión: mensajes de solo sensado, avisos y documentos al día
- Los mensajes del servidor en solo sensado dicen entero qué hacer
  (terminar el trabajo es desde la página, no con la botonera).
- En solo sensado, tocar la grilla con el telar tejiendo manda a la
  botonera (la página no puede pausarlo). Prueba nueva.
- .env.example y guías de despliegue con CLIENTE_DIAS,
  CLIENTE_INTENTOS_MAX y lo que cifra RECOVERY_SECRET; /api/cliente/*
  entre las rutas sin sesión; 20 chequeos de coherencia.
- Manuales: la excepción de solo sensado donde se decía que la página
  siempre arranca, pausa o retrocede. Control de cambios 5.1.

Co-Authored-By: Claude Opus 5.5 <noreply@anthropic.com>
Claude-Session: https://claude.ai/code/session_01QiY8ZZNAM9gwPKiqSkCaaj
</commit_message>
<xml_diff>
--- a/documentacion_proyecto/Documentación_de_Proyecto.docx
+++ b/documentacion_proyecto/Documentación_de_Proyecto.docx
@@ -1062,6 +1062,96 @@
                 <w:sz w:val="17"/>
               </w:rPr>
               <w:t xml:space="preserve">Actualización con el avance de septiembre y octubre: el Nivel 1 quedó instalado y probado en el telar (19/09/2026); el telar tiene cuatro bobinas de selección, no seis; el Bloque D pasa al relé OptoMOS LCA110, con la conexión final en el lugar de cada lector óptico; el sensor de pasada y el relé de selección se probaron en protoboard (10/10/2026); el editor lleva una sola bobina por fila, con intercalados por grupos de filas, la ficha del dibujo con el hilado y la ficha técnica en PDF renovada; el sensado de la botonera pasa a una plaqueta impresa propia y el firmware descarta los avisos del encendido del telar; y se revisó todo el documento contra el sistema actual.</w:t>
+            </w:r>
+          </w:p>
+        </w:tc>
+      </w:tr>
+      <w:tr>
+        <w:tc>
+          <w:tcPr>
+            <w:tcW w:type="dxa" w:w="2209"/>
+          </w:tcPr>
+          <w:p>
+            <w:pPr>
+              <w:jc w:val="both"/>
+            </w:pPr>
+            <w:r>
+              <w:rPr>
+                <w:rFonts w:ascii="IBM Plex Sans" w:hAnsi="IBM Plex Sans" w:cs="IBM Plex Sans" w:eastAsia="IBM Plex Sans"/>
+              </w:rPr>
+            </w:r>
+            <w:r>
+              <w:rPr>
+                <w:rFonts w:ascii="IBM Plex Sans" w:hAnsi="IBM Plex Sans" w:cs="IBM Plex Sans" w:eastAsia="IBM Plex Sans"/>
+                <w:sz w:val="17"/>
+              </w:rPr>
+              <w:t xml:space="preserve">5.1</w:t>
+            </w:r>
+          </w:p>
+        </w:tc>
+        <w:tc>
+          <w:tcPr>
+            <w:tcW w:type="dxa" w:w="2209"/>
+          </w:tcPr>
+          <w:p>
+            <w:pPr>
+              <w:jc w:val="both"/>
+            </w:pPr>
+            <w:r>
+              <w:rPr>
+                <w:rFonts w:ascii="IBM Plex Sans" w:hAnsi="IBM Plex Sans" w:cs="IBM Plex Sans" w:eastAsia="IBM Plex Sans"/>
+              </w:rPr>
+            </w:r>
+            <w:r>
+              <w:rPr>
+                <w:rFonts w:ascii="IBM Plex Sans" w:hAnsi="IBM Plex Sans" w:cs="IBM Plex Sans" w:eastAsia="IBM Plex Sans"/>
+                <w:sz w:val="17"/>
+              </w:rPr>
+              <w:t xml:space="preserve">20 de octubre de 2026</w:t>
+            </w:r>
+          </w:p>
+        </w:tc>
+        <w:tc>
+          <w:tcPr>
+            <w:tcW w:type="dxa" w:w="2209"/>
+          </w:tcPr>
+          <w:p>
+            <w:pPr>
+              <w:jc w:val="both"/>
+            </w:pPr>
+            <w:r>
+              <w:rPr>
+                <w:rFonts w:ascii="IBM Plex Sans" w:hAnsi="IBM Plex Sans" w:cs="IBM Plex Sans" w:eastAsia="IBM Plex Sans"/>
+              </w:rPr>
+            </w:r>
+            <w:r>
+              <w:rPr>
+                <w:rFonts w:ascii="IBM Plex Sans" w:hAnsi="IBM Plex Sans" w:cs="IBM Plex Sans" w:eastAsia="IBM Plex Sans"/>
+                <w:sz w:val="17"/>
+              </w:rPr>
+              <w:t xml:space="preserve">Equipo de Proyecto (7mo Informática, Instituto Leonardo Murialdo)</w:t>
+            </w:r>
+          </w:p>
+        </w:tc>
+        <w:tc>
+          <w:tcPr>
+            <w:tcW w:type="dxa" w:w="2209"/>
+          </w:tcPr>
+          <w:p>
+            <w:pPr>
+              <w:jc w:val="both"/>
+            </w:pPr>
+            <w:r>
+              <w:rPr>
+                <w:rFonts w:ascii="IBM Plex Sans" w:hAnsi="IBM Plex Sans" w:cs="IBM Plex Sans" w:eastAsia="IBM Plex Sans"/>
+              </w:rPr>
+            </w:r>
+            <w:r>
+              <w:rPr>
+                <w:rFonts w:ascii="IBM Plex Sans" w:hAnsi="IBM Plex Sans" w:cs="IBM Plex Sans" w:eastAsia="IBM Plex Sans"/>
+                <w:sz w:val="17"/>
+              </w:rPr>
+              <w:t xml:space="preserve">Se reorganiza el cronograma (166 tareas: la instalación del Nivel 2 en la Etapa 07 y la presentación a los profesores, el 04/11/2026, en la Etapa 08); se fija el valor por hora de Electrónica (30 USD) y de Multimedios (27 USD) y se recalcula la estimación económica; y se suman dos funciones de la aplicación: el modo solo sensado (RF11) y la vista de solo lectura para los clientes, con una clave por tejido (RF12, Épica 5 y la tabla accesos_cliente del modelo de datos).</w:t>
             </w:r>
           </w:p>
         </w:tc>

</xml_diff>

<commit_message>
Revisión, vuelta 4: el cliente en la tabla de usuarios
- Documentación de Proyecto (Word y PDF), Tabla 4: el cliente de la
  fábrica, y el dueño verifica el avance en el editor y en las
  estadísticas (Inicio no lo muestra).
- LEEME: el nombre completo del Gantt.

Co-Authored-By: Claude Opus 5.5 <noreply@anthropic.com>
Claude-Session: https://claude.ai/code/session_01QiY8ZZNAM9gwPKiqSkCaaj
</commit_message>
<xml_diff>
--- a/documentacion_proyecto/Documentación_de_Proyecto.docx
+++ b/documentacion_proyecto/Documentación_de_Proyecto.docx
@@ -7787,7 +7787,7 @@
                 <w:rFonts w:ascii="IBM Plex Sans" w:hAnsi="IBM Plex Sans" w:cs="IBM Plex Sans" w:eastAsia="IBM Plex Sans"/>
                 <w:sz w:val="18"/>
               </w:rPr>
-              <w:t>Define qué dibujos se tejen y valida la producción. Usa la biblioteca para elegir el patrón y la consola de inicio para verificar el avance.</w:t>
+              <w:t>Define qué dibujos se tejen y valida la producción. Usa la biblioteca para elegir el dibujo, y el editor y las estadísticas de la biblioteca para verificar el avance.</w:t>
             </w:r>
           </w:p>
         </w:tc>
@@ -7992,6 +7992,74 @@
                 <w:sz w:val="18"/>
               </w:rPr>
               <w:t>Mantiene el software y el firmware, aplica las migraciones de base de datos y ejecuta el plan de respaldo y recuperación.</w:t>
+            </w:r>
+          </w:p>
+        </w:tc>
+      </w:tr>
+      <w:tr>
+        <w:tc>
+          <w:tcPr>
+            <w:tcW w:type="dxa" w:w="2946"/>
+          </w:tcPr>
+          <w:p>
+            <w:pPr>
+              <w:jc w:val="both"/>
+            </w:pPr>
+            <w:r>
+              <w:rPr>
+                <w:rFonts w:ascii="IBM Plex Sans" w:hAnsi="IBM Plex Sans" w:cs="IBM Plex Sans" w:eastAsia="IBM Plex Sans"/>
+              </w:rPr>
+            </w:r>
+            <w:r>
+              <w:rPr>
+                <w:rFonts w:ascii="IBM Plex Sans" w:hAnsi="IBM Plex Sans" w:cs="IBM Plex Sans" w:eastAsia="IBM Plex Sans"/>
+                <w:sz w:val="18"/>
+              </w:rPr>
+              <w:t xml:space="preserve">Cliente de la fábrica</w:t>
+            </w:r>
+          </w:p>
+        </w:tc>
+        <w:tc>
+          <w:tcPr>
+            <w:tcW w:type="dxa" w:w="2946"/>
+          </w:tcPr>
+          <w:p>
+            <w:pPr>
+              <w:jc w:val="both"/>
+            </w:pPr>
+            <w:r>
+              <w:rPr>
+                <w:rFonts w:ascii="IBM Plex Sans" w:hAnsi="IBM Plex Sans" w:cs="IBM Plex Sans" w:eastAsia="IBM Plex Sans"/>
+              </w:rPr>
+            </w:r>
+            <w:r>
+              <w:rPr>
+                <w:rFonts w:ascii="IBM Plex Sans" w:hAnsi="IBM Plex Sans" w:cs="IBM Plex Sans" w:eastAsia="IBM Plex Sans"/>
+                <w:sz w:val="18"/>
+              </w:rPr>
+              <w:t xml:space="preserve">Ninguna en particular: usa el navegador del celular o de la computadora, sin instalar nada ni registrarse.</w:t>
+            </w:r>
+          </w:p>
+        </w:tc>
+        <w:tc>
+          <w:tcPr>
+            <w:tcW w:type="dxa" w:w="2946"/>
+          </w:tcPr>
+          <w:p>
+            <w:pPr>
+              <w:jc w:val="both"/>
+            </w:pPr>
+            <w:r>
+              <w:rPr>
+                <w:rFonts w:ascii="IBM Plex Sans" w:hAnsi="IBM Plex Sans" w:cs="IBM Plex Sans" w:eastAsia="IBM Plex Sans"/>
+              </w:rPr>
+            </w:r>
+            <w:r>
+              <w:rPr>
+                <w:rFonts w:ascii="IBM Plex Sans" w:hAnsi="IBM Plex Sans" w:cs="IBM Plex Sans" w:eastAsia="IBM Plex Sans"/>
+                <w:sz w:val="18"/>
+              </w:rPr>
+              <w:t xml:space="preserve">Entra con la clave de su tejido, que le pasa la fábrica, y mira cómo va: si se está tejiendo, el avance de su pedido, los metros y la vista previa de la tela. No tiene usuario ni ningún control del telar.</w:t>
             </w:r>
           </w:p>
         </w:tc>

</xml_diff>

<commit_message>
Ingreso con pestañas «Personal» y «Clientes», y el «+» del intercalado más grande
El acceso de los clientes deja de ser un botón al pie de la pantalla de ingreso («Soy cliente: ver
mi tejido») y pasa a una pestaña «Clientes» arriba de todo, con la clave y «Ver mi pedido» en la
misma tarjeta. Las dos pestañas ocupan el mismo lugar, así que el selector no se mueve al cambiar.
El «+» que arma un intercalado pasa de 13 a 22 px y se ve más. La tarjeta de ingreso se desplaza si
no entra en un celular chico.

Manual de la página web (Word, PDF, sitio) con el punto 2.5 y once capturas nuevas; Documentación
de Proyecto y Bitácora al día.

Co-Authored-By: Claude Opus 5.5 <noreply@anthropic.com>
Claude-Session: https://claude.ai/code/session_01QiY8ZZNAM9gwPKiqSkCaaj
</commit_message>
<xml_diff>
--- a/documentacion_proyecto/Documentación_de_Proyecto.docx
+++ b/documentacion_proyecto/Documentación_de_Proyecto.docx
@@ -4429,7 +4429,7 @@
           <w:color w:val="000000"/>
           <w:rtl w:val="0"/>
         </w:rPr>
-        <w:t xml:space="preserve">pantalla aparte, de solo lectura, para los clientes de la fábrica. Se entra desde el ingreso, con «Soy cliente: ver mi tejido» y la clave de un tejido (la genera el operario en la ficha del dibujo), y muestra solo ese tejido: si se está tejiendo, por qué fila y pasada va, los metros tejidos y cuánto lleva del pedido, la vista previa de la tela y las últimas producciones. No tiene ningún control del telar.</w:t>
+        <w:t xml:space="preserve">pantalla aparte, de solo lectura, para los clientes de la fábrica. Se entra desde la pestaña «Clientes» de la pantalla de ingreso, con la clave de un tejido (la genera el operario en la ficha del dibujo), y muestra solo ese tejido: si se está tejiendo, por qué fila y pasada va, los metros tejidos y cuánto lleva del pedido, la vista previa de la tela y las últimas producciones. No tiene ningún control del telar.</w:t>
       </w:r>
     </w:p>
     <w:p>
@@ -13819,7 +13819,7 @@
           <w:rFonts w:ascii="IBM Plex Sans" w:cs="IBM Plex Sans" w:eastAsia="IBM Plex Sans" w:hAnsi="IBM Plex Sans"/>
           <w:rtl w:val="0"/>
         </w:rPr>
-        <w:t xml:space="preserve">Se entra desde el ingreso con «Soy cliente: ver mi tejido» y la clave del tejido, sin usuario ni huella.</w:t>
+        <w:t xml:space="preserve">Se entra desde la pestaña «Clientes» de la pantalla de ingreso, con la clave del tejido, sin usuario ni huella.</w:t>
       </w:r>
     </w:p>
     <w:p>

</xml_diff>

<commit_message>
Revisión de los zips: figuras 4 y 8 de la Documentación de Proyecto
La Figura 4 mostraba el ingreso viejo, con el botón de clientes al pie. La Figura 8 (el editor) no
salía en el PDF: su captura compartía párrafo con la de la Figura 7 y no entraban las dos. Ahora
cada una va en su párrafo, con capturas nuevas. CAMBIOS_REVISION con la revisión de los cuatro zips.

Co-Authored-By: Claude Opus 5.5 <noreply@anthropic.com>
Claude-Session: https://claude.ai/code/session_01QiY8ZZNAM9gwPKiqSkCaaj
</commit_message>
<xml_diff>
--- a/documentacion_proyecto/Documentación_de_Proyecto.docx
+++ b/documentacion_proyecto/Documentación_de_Proyecto.docx
@@ -14161,6 +14161,7 @@
     </w:p>
     <w:p>
       <w:pPr>
+        <w:keepNext/>
         <w:spacing w:before="0" w:lineRule="auto"/>
         <w:jc w:val="center"/>
         <w:rPr>
@@ -14219,6 +14220,35 @@
       </w:r>
       <w:r>
         <w:rPr>
+          <w:rtl w:val="0"/>
+        </w:rPr>
+      </w:r>
+    </w:p>
+    <w:p>
+      <w:pPr>
+        <w:jc w:val="center"/>
+      </w:pPr>
+      <w:r>
+        <w:rPr>
+          <w:rFonts w:ascii="IBM Plex Sans" w:hAnsi="IBM Plex Sans" w:cs="IBM Plex Sans" w:eastAsia="IBM Plex Sans"/>
+          <w:i/>
+          <w:color w:val="606060"/>
+          <w:sz w:val="18"/>
+        </w:rPr>
+        <w:t>Figura 7. Biblioteca de dibujos: listado de los dibujos guardados, con búsqueda y estadísticas.</w:t>
+      </w:r>
+    </w:p>
+    <w:p>
+      <w:pPr>
+        <w:keepNext/>
+        <w:spacing w:before="0" w:lineRule="auto"/>
+        <w:jc w:val="center"/>
+        <w:rPr>
+          <w:rFonts w:ascii="IBM Plex Sans" w:cs="IBM Plex Sans" w:eastAsia="IBM Plex Sans" w:hAnsi="IBM Plex Sans"/>
+        </w:rPr>
+      </w:pPr>
+      <w:r>
+        <w:rPr>
           <w:rFonts w:ascii="IBM Plex Sans" w:cs="IBM Plex Sans" w:eastAsia="IBM Plex Sans" w:hAnsi="IBM Plex Sans"/>
         </w:rPr>
         <w:drawing>
@@ -14253,25 +14283,6 @@
             </a:graphic>
           </wp:inline>
         </w:drawing>
-      </w:r>
-      <w:r>
-        <w:rPr>
-          <w:rtl w:val="0"/>
-        </w:rPr>
-      </w:r>
-    </w:p>
-    <w:p>
-      <w:pPr>
-        <w:jc w:val="center"/>
-      </w:pPr>
-      <w:r>
-        <w:rPr>
-          <w:rFonts w:ascii="IBM Plex Sans" w:hAnsi="IBM Plex Sans" w:cs="IBM Plex Sans" w:eastAsia="IBM Plex Sans"/>
-          <w:i/>
-          <w:color w:val="606060"/>
-          <w:sz w:val="18"/>
-        </w:rPr>
-        <w:t>Figura 7. Biblioteca de dibujos: listado de los dibujos guardados, con búsqueda y estadísticas.</w:t>
       </w:r>
     </w:p>
     <w:p>

</xml_diff>

<commit_message>
Revisión detallada, vuelta 2: README del backend y tabla de archivos del Estado
Co-Authored-By: Claude Opus 5.5 <noreply@anthropic.com>
Claude-Session: https://claude.ai/code/session_01QiY8ZZNAM9gwPKiqSkCaaj
</commit_message>
<xml_diff>
--- a/documentacion_proyecto/Documentación_de_Proyecto.docx
+++ b/documentacion_proyecto/Documentación_de_Proyecto.docx
@@ -22827,6 +22827,8 @@
             <w:r>
               <w:rPr>
                 <w:rFonts w:ascii="IBM Plex Sans" w:cs="IBM Plex Sans" w:eastAsia="IBM Plex Sans" w:hAnsi="IBM Plex Sans"/>
+                <w:sz w:val="20"/>
+                <w:szCs w:val="20"/>
                 <w:rtl w:val="0"/>
               </w:rPr>
               <w:t>BLOQUE DE COMPRA</w:t>
@@ -22853,6 +22855,8 @@
             <w:r>
               <w:rPr>
                 <w:rFonts w:ascii="IBM Plex Sans" w:cs="IBM Plex Sans" w:eastAsia="IBM Plex Sans" w:hAnsi="IBM Plex Sans"/>
+                <w:sz w:val="20"/>
+                <w:szCs w:val="20"/>
                 <w:rtl w:val="0"/>
               </w:rPr>
               <w:t>CONTENIDO</w:t>
@@ -22879,6 +22883,8 @@
             <w:r>
               <w:rPr>
                 <w:rFonts w:ascii="IBM Plex Sans" w:cs="IBM Plex Sans" w:eastAsia="IBM Plex Sans" w:hAnsi="IBM Plex Sans"/>
+                <w:sz w:val="20"/>
+                <w:szCs w:val="20"/>
                 <w:rtl w:val="0"/>
               </w:rPr>
               <w:t>CUÁNDO COMPRARLO</w:t>
@@ -22905,6 +22911,8 @@
             <w:r>
               <w:rPr>
                 <w:rFonts w:ascii="IBM Plex Sans" w:cs="IBM Plex Sans" w:eastAsia="IBM Plex Sans" w:hAnsi="IBM Plex Sans"/>
+                <w:sz w:val="20"/>
+                <w:szCs w:val="20"/>
                 <w:rtl w:val="0"/>
               </w:rPr>
               <w:t>¿GRATIS/PRESTADO?</w:t>
@@ -22930,6 +22938,8 @@
             <w:r>
               <w:rPr>
                 <w:rFonts w:ascii="IBM Plex Sans" w:cs="IBM Plex Sans" w:eastAsia="IBM Plex Sans" w:hAnsi="IBM Plex Sans"/>
+                <w:sz w:val="20"/>
+                <w:szCs w:val="20"/>
                 <w:rtl w:val="0"/>
               </w:rPr>
               <w:t xml:space="preserve">SUBTOTAL </w:t>

</xml_diff>

<commit_message>
Documentación de Proyecto sin los comentarios ya resueltos
Co-Authored-By: Claude Opus 5.5 <noreply@anthropic.com>
Claude-Session: https://claude.ai/code/session_01QiY8ZZNAM9gwPKiqSkCaaj
</commit_message>
<xml_diff>
--- a/documentacion_proyecto/Documentación_de_Proyecto.docx
+++ b/documentacion_proyecto/Documentación_de_Proyecto.docx
@@ -481,9 +481,7 @@
           <w:tag w:val="goog_rdk_0"/>
           <w:id w:val="-1690116994"/>
         </w:sdtPr>
-        <w:sdtContent>
-          <w:commentRangeStart w:id="0"/>
-        </w:sdtContent>
+        <w:sdtContent/>
       </w:sdt>
       <w:r>
         <w:rPr>
@@ -492,7 +490,6 @@
         </w:rPr>
         <w:t>1. Control de Cambios</w:t>
       </w:r>
-      <w:commentRangeEnd w:id="0"/>
       <w:r>
         <w:rPr>
           <w:rFonts w:ascii="Questrial" w:hAnsi="Questrial" w:cs="Questrial" w:eastAsia="Questrial"/>
@@ -2491,9 +2488,7 @@
           <w:tag w:val="goog_rdk_2"/>
           <w:id w:val="-1289148406"/>
         </w:sdtPr>
-        <w:sdtContent>
-          <w:commentRangeStart w:id="2"/>
-        </w:sdtContent>
+        <w:sdtContent/>
       </w:sdt>
       <w:r>
         <w:rPr>
@@ -2502,7 +2497,6 @@
         </w:rPr>
         <w:t>2.4. Definición, acrónimos y abreviaturas</w:t>
       </w:r>
-      <w:commentRangeEnd w:id="2"/>
       <w:r>
         <w:rPr>
           <w:rFonts w:ascii="Questrial" w:hAnsi="Questrial" w:cs="Questrial" w:eastAsia="Questrial"/>
@@ -3780,9 +3774,7 @@
           <w:tag w:val="goog_rdk_3"/>
           <w:id w:val="-739768586"/>
         </w:sdtPr>
-        <w:sdtContent>
-          <w:commentRangeStart w:id="3"/>
-        </w:sdtContent>
+        <w:sdtContent/>
       </w:sdt>
       <w:r>
         <w:rPr>
@@ -3791,7 +3783,6 @@
         </w:rPr>
         <w:t>Referencias</w:t>
       </w:r>
-      <w:commentRangeEnd w:id="3"/>
       <w:r>
         <w:rPr>
           <w:rFonts w:ascii="Questrial" w:hAnsi="Questrial" w:cs="Questrial" w:eastAsia="Questrial"/>
@@ -5236,9 +5227,7 @@
           <w:tag w:val="goog_rdk_7"/>
           <w:id w:val="-793607245"/>
         </w:sdtPr>
-        <w:sdtContent>
-          <w:commentRangeStart w:id="4"/>
-        </w:sdtContent>
+        <w:sdtContent/>
       </w:sdt>
       <w:r>
         <w:rPr>
@@ -5247,7 +5236,6 @@
         </w:rPr>
         <w:t>Esquema de Base de Datos y Estructura JSONB</w:t>
       </w:r>
-      <w:commentRangeEnd w:id="4"/>
       <w:r>
         <w:rPr>
           <w:rFonts w:ascii="Questrial" w:hAnsi="Questrial" w:cs="Questrial" w:eastAsia="Questrial"/>
@@ -7710,9 +7698,7 @@
           <w:tag w:val="goog_rdk_8"/>
           <w:id w:val="-1525466884"/>
         </w:sdtPr>
-        <w:sdtContent>
-          <w:commentRangeStart w:id="5"/>
-        </w:sdtContent>
+        <w:sdtContent/>
       </w:sdt>
       <w:r>
         <w:rPr>
@@ -7721,7 +7707,6 @@
         </w:rPr>
         <w:t>Características de los Usuarios</w:t>
       </w:r>
-      <w:commentRangeEnd w:id="5"/>
       <w:r>
         <w:rPr>
           <w:rFonts w:ascii="Questrial" w:hAnsi="Questrial" w:cs="Questrial" w:eastAsia="Questrial"/>
@@ -9108,9 +9093,7 @@
           <w:tag w:val="goog_rdk_9"/>
           <w:id w:val="361606423"/>
         </w:sdtPr>
-        <w:sdtContent>
-          <w:commentRangeStart w:id="6"/>
-        </w:sdtContent>
+        <w:sdtContent/>
       </w:sdt>
       <w:r>
         <w:rPr>
@@ -9119,7 +9102,6 @@
         </w:rPr>
         <w:t>Consideraciones de seguridad: Inmunidad crítica ambiental</w:t>
       </w:r>
-      <w:commentRangeEnd w:id="6"/>
       <w:r>
         <w:rPr>
           <w:rFonts w:ascii="Questrial" w:hAnsi="Questrial" w:cs="Questrial" w:eastAsia="Questrial"/>
@@ -9453,9 +9435,7 @@
           <w:tag w:val="goog_rdk_10"/>
           <w:id w:val="1427354661"/>
         </w:sdtPr>
-        <w:sdtContent>
-          <w:commentRangeStart w:id="7"/>
-        </w:sdtContent>
+        <w:sdtContent/>
       </w:sdt>
       <w:r>
         <w:rPr>
@@ -9464,7 +9444,6 @@
         </w:rPr>
         <w:t>4.1. Requerimientos funcionales</w:t>
       </w:r>
-      <w:commentRangeEnd w:id="7"/>
       <w:r>
         <w:rPr>
           <w:rFonts w:ascii="Questrial" w:hAnsi="Questrial" w:cs="Questrial" w:eastAsia="Questrial"/>
@@ -11319,9 +11298,7 @@
           <w:tag w:val="goog_rdk_12"/>
           <w:id w:val="1345811660"/>
         </w:sdtPr>
-        <w:sdtContent>
-          <w:commentRangeStart w:id="9"/>
-        </w:sdtContent>
+        <w:sdtContent/>
       </w:sdt>
       <w:r>
         <w:rPr>
@@ -11330,7 +11307,6 @@
         </w:rPr>
         <w:t>Requerimientos No Funcionales (RNF)</w:t>
       </w:r>
-      <w:commentRangeEnd w:id="9"/>
       <w:r>
         <w:rPr>
           <w:rFonts w:ascii="Questrial" w:hAnsi="Questrial" w:cs="Questrial" w:eastAsia="Questrial"/>
@@ -14173,9 +14149,7 @@
           <w:tag w:val="goog_rdk_13"/>
           <w:id w:val="-381068389"/>
         </w:sdtPr>
-        <w:sdtContent>
-          <w:commentRangeStart w:id="10"/>
-        </w:sdtContent>
+        <w:sdtContent/>
       </w:sdt>
       <w:r>
         <w:rPr>
@@ -14214,10 +14188,6 @@
           </wp:inline>
         </w:drawing>
       </w:r>
-      <w:commentRangeEnd w:id="10"/>
-      <w:r>
-        <w:commentReference w:id="10"/>
-      </w:r>
       <w:r>
         <w:rPr>
           <w:rtl w:val="0"/>
@@ -17903,9 +17873,7 @@
                 <w:tag w:val="goog_rdk_14"/>
                 <w:id w:val="-1506028332"/>
               </w:sdtPr>
-              <w:sdtContent>
-                <w:commentRangeStart w:id="11"/>
-              </w:sdtContent>
+              <w:sdtContent/>
             </w:sdt>
             <w:r>
               <w:rPr>
@@ -19625,7 +19593,6 @@
       </w:pPr>
       <w:bookmarkStart w:colFirst="0" w:colLast="0" w:name="_heading=h.rm6a3yvtax41" w:id="2"/>
       <w:bookmarkEnd w:id="2"/>
-      <w:commentRangeEnd w:id="11"/>
       <w:r>
         <w:rPr>
           <w:rFonts w:ascii="IBM Plex Sans" w:hAnsi="IBM Plex Sans" w:cs="IBM Plex Sans" w:eastAsia="IBM Plex Sans"/>
@@ -21850,9 +21817,7 @@
           <w:tag w:val="goog_rdk_18"/>
           <w:id w:val="1758680820"/>
         </w:sdtPr>
-        <w:sdtContent>
-          <w:commentRangeStart w:id="13"/>
-        </w:sdtContent>
+        <w:sdtContent/>
       </w:sdt>
       <w:r>
         <w:rPr>
@@ -21867,7 +21832,6 @@
         <w:br/>
         <w:t>Para la etapa actual del proyecto se resolvió continuar con el servicio existente, por dos razones: el sistema no es crítico para la seguridad -su caída no detiene la producción, solo obliga a operar el telar de forma manual- y el costo de un enlace redundante no se justifica mientras haya un solo telar automatizado. La incorporación de un respaldo por red móvil queda registrada como lineamiento futuro, a evaluar cuando se sumen más máquinas al sistema.</w:t>
       </w:r>
-      <w:commentRangeEnd w:id="13"/>
       <w:r>
         <w:rPr>
           <w:rFonts w:ascii="IBM Plex Sans" w:hAnsi="IBM Plex Sans" w:cs="IBM Plex Sans" w:eastAsia="IBM Plex Sans"/>
@@ -22820,9 +22784,7 @@
                 <w:tag w:val="goog_rdk_19"/>
                 <w:id w:val="-95384766"/>
               </w:sdtPr>
-              <w:sdtContent>
-                <w:commentRangeStart w:id="14"/>
-              </w:sdtContent>
+              <w:sdtContent/>
             </w:sdt>
             <w:r>
               <w:rPr>
@@ -23398,7 +23360,6 @@
         <w:jc w:val="both"/>
         <w:rPr/>
       </w:pPr>
-      <w:commentRangeEnd w:id="14"/>
       <w:r>
         <w:rPr>
           <w:rFonts w:ascii="IBM Plex Sans" w:hAnsi="IBM Plex Sans" w:cs="IBM Plex Sans" w:eastAsia="IBM Plex Sans"/>
@@ -24544,856 +24505,6 @@
     </w:sectPr>
   </w:body>
 </w:document>
-</file>
-
-<file path=word/comments.xml><?xml version="1.0" encoding="utf-8"?>
-<w:comments xmlns:mc="http://schemas.openxmlformats.org/markup-compatibility/2006" xmlns:o="urn:schemas-microsoft-com:office:office" xmlns:r="http://schemas.openxmlformats.org/officeDocument/2006/relationships" xmlns:m="http://schemas.openxmlformats.org/officeDocument/2006/math" xmlns:v="urn:schemas-microsoft-com:vml" xmlns:wp="http://schemas.openxmlformats.org/drawingml/2006/wordprocessingDrawing" xmlns:w10="urn:schemas-microsoft-com:office:word" xmlns:w="http://schemas.openxmlformats.org/wordprocessingml/2006/main" xmlns:wne="http://schemas.microsoft.com/office/word/2006/wordml" xmlns:sl="http://schemas.openxmlformats.org/schemaLibrary/2006/main" xmlns:a="http://schemas.openxmlformats.org/drawingml/2006/main" xmlns:pic="http://schemas.openxmlformats.org/drawingml/2006/picture" xmlns:c="http://schemas.openxmlformats.org/drawingml/2006/chart" xmlns:lc="http://schemas.openxmlformats.org/drawingml/2006/lockedCanvas" xmlns:dgm="http://schemas.openxmlformats.org/drawingml/2006/diagram" xmlns:wps="http://schemas.microsoft.com/office/word/2010/wordprocessingShape" xmlns:wpg="http://schemas.microsoft.com/office/word/2010/wordprocessingGroup" xmlns:w14="http://schemas.microsoft.com/office/word/2010/wordml" xmlns:w15="http://schemas.microsoft.com/office/word/2012/wordml" xmlns:w16="http://schemas.microsoft.com/office/word/2018/wordml" xmlns:w16cex="http://schemas.microsoft.com/office/word/2018/wordml/cex" xmlns:w16cid="http://schemas.microsoft.com/office/word/2016/wordml/cid" xmlns="http://schemas.microsoft.com/office/tasks/2019/documenttasks" xmlns:cr="http://schemas.microsoft.com/office/comments/2020/reactions">
-  <w:comment w:author="Lourdes Pedaci" w:id="7" w:date="2026-08-28T23:49:07Z">
-    <w:p>
-      <w:pPr>
-        <w:keepNext w:val="0"/>
-        <w:keepLines w:val="0"/>
-        <w:pageBreakBefore w:val="0"/>
-        <w:widowControl w:val="0"/>
-        <w:pBdr>
-          <w:top w:space="0" w:sz="0" w:val="nil"/>
-          <w:left w:space="0" w:sz="0" w:val="nil"/>
-          <w:bottom w:space="0" w:sz="0" w:val="nil"/>
-          <w:right w:space="0" w:sz="0" w:val="nil"/>
-          <w:between w:space="0" w:sz="0" w:val="nil"/>
-        </w:pBdr>
-        <w:shd w:fill="auto" w:val="clear"/>
-        <w:spacing w:after="0" w:before="0" w:line="240" w:lineRule="auto"/>
-        <w:ind w:left="0" w:right="0" w:firstLine="0"/>
-        <w:jc w:val="left"/>
-        <w:rPr>
-          <w:rFonts w:ascii="IBM Plex Sans" w:cs="IBM Plex Sans" w:eastAsia="IBM Plex Sans" w:hAnsi="IBM Plex Sans"/>
-          <w:b w:val="0"/>
-          <w:bCs w:val="0"/>
-          <w:i w:val="0"/>
-          <w:iCs w:val="0"/>
-          <w:smallCaps w:val="0"/>
-          <w:strike w:val="0"/>
-          <w:color w:val="000000"/>
-          <w:sz w:val="22"/>
-          <w:szCs w:val="22"/>
-          <w:u w:val="none"/>
-          <w:shd w:fill="auto" w:val="clear"/>
-          <w:vertAlign w:val="baseline"/>
-        </w:rPr>
-      </w:pPr>
-      <w:r>
-        <w:rPr>
-          <w:rFonts w:ascii="IBM Plex Sans" w:cs="IBM Plex Sans" w:eastAsia="IBM Plex Sans" w:hAnsi="IBM Plex Sans"/>
-          <w:b w:val="0"/>
-          <w:bCs w:val="0"/>
-          <w:i w:val="0"/>
-          <w:iCs w:val="0"/>
-          <w:smallCaps w:val="0"/>
-          <w:strike w:val="0"/>
-          <w:color w:val="000000"/>
-          <w:sz w:val="22"/>
-          <w:szCs w:val="22"/>
-          <w:u w:val="none"/>
-          <w:shd w:fill="auto" w:val="clear"/>
-          <w:vertAlign w:val="baseline"/>
-          <w:rtl w:val="0"/>
-        </w:rPr>
-        <w:t xml:space="preserve">Revisar material UTN, tipo de RF... Es una tabla</w:t>
-      </w:r>
-    </w:p>
-  </w:comment>
-  <w:comment w:author="Juan ignacio Manfredo" w:id="11" w:date="2026-08-07T22:18:06Z">
-    <w:p>
-      <w:pPr>
-        <w:keepNext w:val="0"/>
-        <w:keepLines w:val="0"/>
-        <w:pageBreakBefore w:val="0"/>
-        <w:widowControl w:val="0"/>
-        <w:pBdr>
-          <w:top w:space="0" w:sz="0" w:val="nil"/>
-          <w:left w:space="0" w:sz="0" w:val="nil"/>
-          <w:bottom w:space="0" w:sz="0" w:val="nil"/>
-          <w:right w:space="0" w:sz="0" w:val="nil"/>
-          <w:between w:space="0" w:sz="0" w:val="nil"/>
-        </w:pBdr>
-        <w:shd w:fill="auto" w:val="clear"/>
-        <w:spacing w:after="0" w:before="0" w:line="240" w:lineRule="auto"/>
-        <w:ind w:left="0" w:right="0" w:firstLine="0"/>
-        <w:jc w:val="left"/>
-        <w:rPr>
-          <w:rFonts w:ascii="IBM Plex Sans" w:cs="IBM Plex Sans" w:eastAsia="IBM Plex Sans" w:hAnsi="IBM Plex Sans"/>
-          <w:b w:val="0"/>
-          <w:bCs w:val="0"/>
-          <w:i w:val="0"/>
-          <w:iCs w:val="0"/>
-          <w:smallCaps w:val="0"/>
-          <w:strike w:val="0"/>
-          <w:color w:val="000000"/>
-          <w:sz w:val="22"/>
-          <w:szCs w:val="22"/>
-          <w:u w:val="none"/>
-          <w:shd w:fill="auto" w:val="clear"/>
-          <w:vertAlign w:val="baseline"/>
-        </w:rPr>
-      </w:pPr>
-      <w:r>
-        <w:rPr>
-          <w:rFonts w:ascii="IBM Plex Sans" w:cs="IBM Plex Sans" w:eastAsia="IBM Plex Sans" w:hAnsi="IBM Plex Sans"/>
-          <w:b w:val="0"/>
-          <w:bCs w:val="0"/>
-          <w:i w:val="0"/>
-          <w:iCs w:val="0"/>
-          <w:smallCaps w:val="0"/>
-          <w:strike w:val="0"/>
-          <w:color w:val="000000"/>
-          <w:sz w:val="22"/>
-          <w:szCs w:val="22"/>
-          <w:u w:val="none"/>
-          <w:shd w:fill="auto" w:val="clear"/>
-          <w:vertAlign w:val="baseline"/>
-          <w:rtl w:val="0"/>
-        </w:rPr>
-        <w:t xml:space="preserve">cambiar cuadro</w:t>
-      </w:r>
-    </w:p>
-  </w:comment>
-  <w:comment w:author="Lourdes Pedaci" w:id="9" w:date="2026-08-28T23:50:42Z">
-    <w:p>
-      <w:pPr>
-        <w:keepNext w:val="0"/>
-        <w:keepLines w:val="0"/>
-        <w:pageBreakBefore w:val="0"/>
-        <w:widowControl w:val="0"/>
-        <w:pBdr>
-          <w:top w:space="0" w:sz="0" w:val="nil"/>
-          <w:left w:space="0" w:sz="0" w:val="nil"/>
-          <w:bottom w:space="0" w:sz="0" w:val="nil"/>
-          <w:right w:space="0" w:sz="0" w:val="nil"/>
-          <w:between w:space="0" w:sz="0" w:val="nil"/>
-        </w:pBdr>
-        <w:shd w:fill="auto" w:val="clear"/>
-        <w:spacing w:after="0" w:before="0" w:line="240" w:lineRule="auto"/>
-        <w:ind w:left="0" w:right="0" w:firstLine="0"/>
-        <w:jc w:val="left"/>
-        <w:rPr>
-          <w:rFonts w:ascii="IBM Plex Sans" w:cs="IBM Plex Sans" w:eastAsia="IBM Plex Sans" w:hAnsi="IBM Plex Sans"/>
-          <w:b w:val="0"/>
-          <w:bCs w:val="0"/>
-          <w:i w:val="0"/>
-          <w:iCs w:val="0"/>
-          <w:smallCaps w:val="0"/>
-          <w:strike w:val="0"/>
-          <w:color w:val="000000"/>
-          <w:sz w:val="22"/>
-          <w:szCs w:val="22"/>
-          <w:u w:val="none"/>
-          <w:shd w:fill="auto" w:val="clear"/>
-          <w:vertAlign w:val="baseline"/>
-        </w:rPr>
-      </w:pPr>
-      <w:r>
-        <w:rPr>
-          <w:rFonts w:ascii="IBM Plex Sans" w:cs="IBM Plex Sans" w:eastAsia="IBM Plex Sans" w:hAnsi="IBM Plex Sans"/>
-          <w:b w:val="0"/>
-          <w:bCs w:val="0"/>
-          <w:i w:val="0"/>
-          <w:iCs w:val="0"/>
-          <w:smallCaps w:val="0"/>
-          <w:strike w:val="0"/>
-          <w:color w:val="000000"/>
-          <w:sz w:val="22"/>
-          <w:szCs w:val="22"/>
-          <w:u w:val="none"/>
-          <w:shd w:fill="auto" w:val="clear"/>
-          <w:vertAlign w:val="baseline"/>
-          <w:rtl w:val="0"/>
-        </w:rPr>
-        <w:t xml:space="preserve">Revisar material UTN, tipo de RnF... Es una tabla</w:t>
-      </w:r>
-    </w:p>
-  </w:comment>
-  <w:comment w:author="Lourdes Pedaci" w:id="3" w:date="2026-08-28T23:32:06Z">
-    <w:p>
-      <w:pPr>
-        <w:keepNext w:val="0"/>
-        <w:keepLines w:val="0"/>
-        <w:pageBreakBefore w:val="0"/>
-        <w:widowControl w:val="0"/>
-        <w:pBdr>
-          <w:top w:space="0" w:sz="0" w:val="nil"/>
-          <w:left w:space="0" w:sz="0" w:val="nil"/>
-          <w:bottom w:space="0" w:sz="0" w:val="nil"/>
-          <w:right w:space="0" w:sz="0" w:val="nil"/>
-          <w:between w:space="0" w:sz="0" w:val="nil"/>
-        </w:pBdr>
-        <w:shd w:fill="auto" w:val="clear"/>
-        <w:spacing w:after="0" w:before="0" w:line="240" w:lineRule="auto"/>
-        <w:ind w:left="0" w:right="0" w:firstLine="0"/>
-        <w:jc w:val="left"/>
-        <w:rPr>
-          <w:rFonts w:ascii="IBM Plex Sans" w:cs="IBM Plex Sans" w:eastAsia="IBM Plex Sans" w:hAnsi="IBM Plex Sans"/>
-          <w:b w:val="0"/>
-          <w:bCs w:val="0"/>
-          <w:i w:val="0"/>
-          <w:iCs w:val="0"/>
-          <w:smallCaps w:val="0"/>
-          <w:strike w:val="0"/>
-          <w:color w:val="000000"/>
-          <w:sz w:val="22"/>
-          <w:szCs w:val="22"/>
-          <w:u w:val="none"/>
-          <w:shd w:fill="auto" w:val="clear"/>
-          <w:vertAlign w:val="baseline"/>
-        </w:rPr>
-      </w:pPr>
-      <w:r>
-        <w:rPr>
-          <w:rFonts w:ascii="IBM Plex Sans" w:cs="IBM Plex Sans" w:eastAsia="IBM Plex Sans" w:hAnsi="IBM Plex Sans"/>
-          <w:b w:val="0"/>
-          <w:bCs w:val="0"/>
-          <w:i w:val="0"/>
-          <w:iCs w:val="0"/>
-          <w:smallCaps w:val="0"/>
-          <w:strike w:val="0"/>
-          <w:color w:val="000000"/>
-          <w:sz w:val="22"/>
-          <w:szCs w:val="22"/>
-          <w:u w:val="none"/>
-          <w:shd w:fill="auto" w:val="clear"/>
-          <w:vertAlign w:val="baseline"/>
-          <w:rtl w:val="0"/>
-        </w:rPr>
-        <w:t xml:space="preserve">En formato apa 7ma ed</w:t>
-      </w:r>
-    </w:p>
-  </w:comment>
-  <w:comment w:author="Lourdes Pedaci" w:id="8" w:date="2026-08-28T23:50:20Z">
-    <w:p>
-      <w:pPr>
-        <w:keepNext w:val="0"/>
-        <w:keepLines w:val="0"/>
-        <w:pageBreakBefore w:val="0"/>
-        <w:widowControl w:val="0"/>
-        <w:pBdr>
-          <w:top w:space="0" w:sz="0" w:val="nil"/>
-          <w:left w:space="0" w:sz="0" w:val="nil"/>
-          <w:bottom w:space="0" w:sz="0" w:val="nil"/>
-          <w:right w:space="0" w:sz="0" w:val="nil"/>
-          <w:between w:space="0" w:sz="0" w:val="nil"/>
-        </w:pBdr>
-        <w:shd w:fill="auto" w:val="clear"/>
-        <w:spacing w:after="0" w:before="0" w:line="240" w:lineRule="auto"/>
-        <w:ind w:left="0" w:right="0" w:firstLine="0"/>
-        <w:jc w:val="left"/>
-        <w:rPr>
-          <w:rFonts w:ascii="IBM Plex Sans" w:cs="IBM Plex Sans" w:eastAsia="IBM Plex Sans" w:hAnsi="IBM Plex Sans"/>
-          <w:b w:val="0"/>
-          <w:bCs w:val="0"/>
-          <w:i w:val="0"/>
-          <w:iCs w:val="0"/>
-          <w:smallCaps w:val="0"/>
-          <w:strike w:val="0"/>
-          <w:color w:val="000000"/>
-          <w:sz w:val="22"/>
-          <w:szCs w:val="22"/>
-          <w:u w:val="none"/>
-          <w:shd w:fill="auto" w:val="clear"/>
-          <w:vertAlign w:val="baseline"/>
-        </w:rPr>
-      </w:pPr>
-      <w:r>
-        <w:rPr>
-          <w:rFonts w:ascii="IBM Plex Sans" w:cs="IBM Plex Sans" w:eastAsia="IBM Plex Sans" w:hAnsi="IBM Plex Sans"/>
-          <w:b w:val="0"/>
-          <w:bCs w:val="0"/>
-          <w:i w:val="0"/>
-          <w:iCs w:val="0"/>
-          <w:smallCaps w:val="0"/>
-          <w:strike w:val="0"/>
-          <w:color w:val="000000"/>
-          <w:sz w:val="22"/>
-          <w:szCs w:val="22"/>
-          <w:u w:val="none"/>
-          <w:shd w:fill="auto" w:val="clear"/>
-          <w:vertAlign w:val="baseline"/>
-          <w:rtl w:val="0"/>
-        </w:rPr>
-        <w:t xml:space="preserve">Adecuar código</w:t>
-      </w:r>
-    </w:p>
-  </w:comment>
-  <w:comment w:author="Lourdes Pedaci" w:id="2" w:date="2026-08-28T23:31:19Z">
-    <w:p>
-      <w:pPr>
-        <w:keepNext w:val="0"/>
-        <w:keepLines w:val="0"/>
-        <w:pageBreakBefore w:val="0"/>
-        <w:widowControl w:val="0"/>
-        <w:pBdr>
-          <w:top w:space="0" w:sz="0" w:val="nil"/>
-          <w:left w:space="0" w:sz="0" w:val="nil"/>
-          <w:bottom w:space="0" w:sz="0" w:val="nil"/>
-          <w:right w:space="0" w:sz="0" w:val="nil"/>
-          <w:between w:space="0" w:sz="0" w:val="nil"/>
-        </w:pBdr>
-        <w:shd w:fill="auto" w:val="clear"/>
-        <w:spacing w:after="0" w:before="0" w:line="240" w:lineRule="auto"/>
-        <w:ind w:left="0" w:right="0" w:firstLine="0"/>
-        <w:jc w:val="left"/>
-        <w:rPr>
-          <w:rFonts w:ascii="IBM Plex Sans" w:cs="IBM Plex Sans" w:eastAsia="IBM Plex Sans" w:hAnsi="IBM Plex Sans"/>
-          <w:b w:val="0"/>
-          <w:bCs w:val="0"/>
-          <w:i w:val="0"/>
-          <w:iCs w:val="0"/>
-          <w:smallCaps w:val="0"/>
-          <w:strike w:val="0"/>
-          <w:color w:val="000000"/>
-          <w:sz w:val="22"/>
-          <w:szCs w:val="22"/>
-          <w:u w:val="none"/>
-          <w:shd w:fill="auto" w:val="clear"/>
-          <w:vertAlign w:val="baseline"/>
-        </w:rPr>
-      </w:pPr>
-      <w:r>
-        <w:rPr>
-          <w:rFonts w:ascii="IBM Plex Sans" w:cs="IBM Plex Sans" w:eastAsia="IBM Plex Sans" w:hAnsi="IBM Plex Sans"/>
-          <w:b w:val="0"/>
-          <w:bCs w:val="0"/>
-          <w:i w:val="0"/>
-          <w:iCs w:val="0"/>
-          <w:smallCaps w:val="0"/>
-          <w:strike w:val="0"/>
-          <w:color w:val="000000"/>
-          <w:sz w:val="22"/>
-          <w:szCs w:val="22"/>
-          <w:u w:val="none"/>
-          <w:shd w:fill="auto" w:val="clear"/>
-          <w:vertAlign w:val="baseline"/>
-          <w:rtl w:val="0"/>
-        </w:rPr>
-        <w:t xml:space="preserve">Hacer tabla</w:t>
-      </w:r>
-    </w:p>
-  </w:comment>
-  <w:comment w:author="Lourdes Pedaci" w:id="0" w:date="2026-08-28T23:26:19Z">
-    <w:p>
-      <w:pPr>
-        <w:keepNext w:val="0"/>
-        <w:keepLines w:val="0"/>
-        <w:pageBreakBefore w:val="0"/>
-        <w:widowControl w:val="0"/>
-        <w:pBdr>
-          <w:top w:space="0" w:sz="0" w:val="nil"/>
-          <w:left w:space="0" w:sz="0" w:val="nil"/>
-          <w:bottom w:space="0" w:sz="0" w:val="nil"/>
-          <w:right w:space="0" w:sz="0" w:val="nil"/>
-          <w:between w:space="0" w:sz="0" w:val="nil"/>
-        </w:pBdr>
-        <w:shd w:fill="auto" w:val="clear"/>
-        <w:spacing w:after="0" w:before="0" w:line="240" w:lineRule="auto"/>
-        <w:ind w:left="0" w:right="0" w:firstLine="0"/>
-        <w:jc w:val="left"/>
-        <w:rPr>
-          <w:rFonts w:ascii="IBM Plex Sans" w:cs="IBM Plex Sans" w:eastAsia="IBM Plex Sans" w:hAnsi="IBM Plex Sans"/>
-          <w:b w:val="0"/>
-          <w:bCs w:val="0"/>
-          <w:i w:val="0"/>
-          <w:iCs w:val="0"/>
-          <w:smallCaps w:val="0"/>
-          <w:strike w:val="0"/>
-          <w:color w:val="000000"/>
-          <w:sz w:val="22"/>
-          <w:szCs w:val="22"/>
-          <w:u w:val="none"/>
-          <w:shd w:fill="auto" w:val="clear"/>
-          <w:vertAlign w:val="baseline"/>
-        </w:rPr>
-      </w:pPr>
-      <w:r>
-        <w:rPr>
-          <w:rFonts w:ascii="IBM Plex Sans" w:cs="IBM Plex Sans" w:eastAsia="IBM Plex Sans" w:hAnsi="IBM Plex Sans"/>
-          <w:b w:val="0"/>
-          <w:bCs w:val="0"/>
-          <w:i w:val="0"/>
-          <w:iCs w:val="0"/>
-          <w:smallCaps w:val="0"/>
-          <w:strike w:val="0"/>
-          <w:color w:val="000000"/>
-          <w:sz w:val="22"/>
-          <w:szCs w:val="22"/>
-          <w:u w:val="none"/>
-          <w:shd w:fill="auto" w:val="clear"/>
-          <w:vertAlign w:val="baseline"/>
-          <w:rtl w:val="0"/>
-        </w:rPr>
-        <w:t xml:space="preserve">Es una tabla.</w:t>
-      </w:r>
-    </w:p>
-  </w:comment>
-  <w:comment w:author="Juan ignacio Manfredo" w:id="14" w:date="2026-08-07T22:14:12Z">
-    <w:p>
-      <w:pPr>
-        <w:keepNext w:val="0"/>
-        <w:keepLines w:val="0"/>
-        <w:pageBreakBefore w:val="0"/>
-        <w:widowControl w:val="0"/>
-        <w:pBdr>
-          <w:top w:space="0" w:sz="0" w:val="nil"/>
-          <w:left w:space="0" w:sz="0" w:val="nil"/>
-          <w:bottom w:space="0" w:sz="0" w:val="nil"/>
-          <w:right w:space="0" w:sz="0" w:val="nil"/>
-          <w:between w:space="0" w:sz="0" w:val="nil"/>
-        </w:pBdr>
-        <w:shd w:fill="auto" w:val="clear"/>
-        <w:spacing w:after="0" w:before="0" w:line="240" w:lineRule="auto"/>
-        <w:ind w:left="0" w:right="0" w:firstLine="0"/>
-        <w:jc w:val="left"/>
-        <w:rPr>
-          <w:rFonts w:ascii="IBM Plex Sans" w:cs="IBM Plex Sans" w:eastAsia="IBM Plex Sans" w:hAnsi="IBM Plex Sans"/>
-          <w:b w:val="0"/>
-          <w:bCs w:val="0"/>
-          <w:i w:val="0"/>
-          <w:iCs w:val="0"/>
-          <w:smallCaps w:val="0"/>
-          <w:strike w:val="0"/>
-          <w:color w:val="000000"/>
-          <w:sz w:val="22"/>
-          <w:szCs w:val="22"/>
-          <w:u w:val="none"/>
-          <w:shd w:fill="auto" w:val="clear"/>
-          <w:vertAlign w:val="baseline"/>
-        </w:rPr>
-      </w:pPr>
-      <w:r>
-        <w:rPr>
-          <w:rFonts w:ascii="IBM Plex Sans" w:cs="IBM Plex Sans" w:eastAsia="IBM Plex Sans" w:hAnsi="IBM Plex Sans"/>
-          <w:b w:val="0"/>
-          <w:bCs w:val="0"/>
-          <w:i w:val="0"/>
-          <w:iCs w:val="0"/>
-          <w:smallCaps w:val="0"/>
-          <w:strike w:val="0"/>
-          <w:color w:val="000000"/>
-          <w:sz w:val="22"/>
-          <w:szCs w:val="22"/>
-          <w:u w:val="none"/>
-          <w:shd w:fill="auto" w:val="clear"/>
-          <w:vertAlign w:val="baseline"/>
-          <w:rtl w:val="0"/>
-        </w:rPr>
-        <w:t xml:space="preserve">cambiar precios a final del proyecto</w:t>
-      </w:r>
-    </w:p>
-  </w:comment>
-  <w:comment w:author="Lourdes Pedaci" w:id="1" w:date="2026-08-28T23:53:11Z">
-    <w:p>
-      <w:pPr>
-        <w:keepNext w:val="0"/>
-        <w:keepLines w:val="0"/>
-        <w:pageBreakBefore w:val="0"/>
-        <w:widowControl w:val="0"/>
-        <w:pBdr>
-          <w:top w:space="0" w:sz="0" w:val="nil"/>
-          <w:left w:space="0" w:sz="0" w:val="nil"/>
-          <w:bottom w:space="0" w:sz="0" w:val="nil"/>
-          <w:right w:space="0" w:sz="0" w:val="nil"/>
-          <w:between w:space="0" w:sz="0" w:val="nil"/>
-        </w:pBdr>
-        <w:shd w:fill="auto" w:val="clear"/>
-        <w:spacing w:after="0" w:before="0" w:line="240" w:lineRule="auto"/>
-        <w:ind w:left="0" w:right="0" w:firstLine="0"/>
-        <w:jc w:val="left"/>
-        <w:rPr>
-          <w:rFonts w:ascii="IBM Plex Sans" w:cs="IBM Plex Sans" w:eastAsia="IBM Plex Sans" w:hAnsi="IBM Plex Sans"/>
-          <w:b w:val="0"/>
-          <w:bCs w:val="0"/>
-          <w:i w:val="0"/>
-          <w:iCs w:val="0"/>
-          <w:smallCaps w:val="0"/>
-          <w:strike w:val="0"/>
-          <w:color w:val="000000"/>
-          <w:sz w:val="22"/>
-          <w:szCs w:val="22"/>
-          <w:u w:val="none"/>
-          <w:shd w:fill="auto" w:val="clear"/>
-          <w:vertAlign w:val="baseline"/>
-        </w:rPr>
-      </w:pPr>
-      <w:r>
-        <w:rPr>
-          <w:rFonts w:ascii="IBM Plex Sans" w:cs="IBM Plex Sans" w:eastAsia="IBM Plex Sans" w:hAnsi="IBM Plex Sans"/>
-          <w:b w:val="0"/>
-          <w:bCs w:val="0"/>
-          <w:i w:val="0"/>
-          <w:iCs w:val="0"/>
-          <w:smallCaps w:val="0"/>
-          <w:strike w:val="0"/>
-          <w:color w:val="000000"/>
-          <w:sz w:val="22"/>
-          <w:szCs w:val="22"/>
-          <w:u w:val="none"/>
-          <w:shd w:fill="auto" w:val="clear"/>
-          <w:vertAlign w:val="baseline"/>
-          <w:rtl w:val="0"/>
-        </w:rPr>
-        <w:t xml:space="preserve">Antes agregar el indice</w:t>
-      </w:r>
-    </w:p>
-  </w:comment>
-  <w:comment w:author="Lourdes Pedaci" w:id="4" w:date="2026-08-28T23:37:33Z">
-    <w:p>
-      <w:pPr>
-        <w:keepNext w:val="0"/>
-        <w:keepLines w:val="0"/>
-        <w:pageBreakBefore w:val="0"/>
-        <w:widowControl w:val="0"/>
-        <w:pBdr>
-          <w:top w:space="0" w:sz="0" w:val="nil"/>
-          <w:left w:space="0" w:sz="0" w:val="nil"/>
-          <w:bottom w:space="0" w:sz="0" w:val="nil"/>
-          <w:right w:space="0" w:sz="0" w:val="nil"/>
-          <w:between w:space="0" w:sz="0" w:val="nil"/>
-        </w:pBdr>
-        <w:shd w:fill="auto" w:val="clear"/>
-        <w:spacing w:after="0" w:before="0" w:line="240" w:lineRule="auto"/>
-        <w:ind w:left="0" w:right="0" w:firstLine="0"/>
-        <w:jc w:val="left"/>
-        <w:rPr>
-          <w:rFonts w:ascii="IBM Plex Sans" w:cs="IBM Plex Sans" w:eastAsia="IBM Plex Sans" w:hAnsi="IBM Plex Sans"/>
-          <w:b w:val="0"/>
-          <w:bCs w:val="0"/>
-          <w:i w:val="0"/>
-          <w:iCs w:val="0"/>
-          <w:smallCaps w:val="0"/>
-          <w:strike w:val="0"/>
-          <w:color w:val="000000"/>
-          <w:sz w:val="22"/>
-          <w:szCs w:val="22"/>
-          <w:u w:val="none"/>
-          <w:shd w:fill="auto" w:val="clear"/>
-          <w:vertAlign w:val="baseline"/>
-        </w:rPr>
-      </w:pPr>
-      <w:r>
-        <w:rPr>
-          <w:rFonts w:ascii="IBM Plex Sans" w:cs="IBM Plex Sans" w:eastAsia="IBM Plex Sans" w:hAnsi="IBM Plex Sans"/>
-          <w:b w:val="0"/>
-          <w:bCs w:val="0"/>
-          <w:i w:val="0"/>
-          <w:iCs w:val="0"/>
-          <w:smallCaps w:val="0"/>
-          <w:strike w:val="0"/>
-          <w:color w:val="000000"/>
-          <w:sz w:val="22"/>
-          <w:szCs w:val="22"/>
-          <w:u w:val="none"/>
-          <w:shd w:fill="auto" w:val="clear"/>
-          <w:vertAlign w:val="baseline"/>
-          <w:rtl w:val="0"/>
-        </w:rPr>
-        <w:t xml:space="preserve">Es el modelo entidad relación de la bd</w:t>
-      </w:r>
-    </w:p>
-  </w:comment>
-  <w:comment w:author="Juan ignacio Manfredo" w:id="13" w:date="2026-08-07T22:16:44Z">
-    <w:p>
-      <w:pPr>
-        <w:keepNext w:val="0"/>
-        <w:keepLines w:val="0"/>
-        <w:pageBreakBefore w:val="0"/>
-        <w:widowControl w:val="0"/>
-        <w:pBdr>
-          <w:top w:space="0" w:sz="0" w:val="nil"/>
-          <w:left w:space="0" w:sz="0" w:val="nil"/>
-          <w:bottom w:space="0" w:sz="0" w:val="nil"/>
-          <w:right w:space="0" w:sz="0" w:val="nil"/>
-          <w:between w:space="0" w:sz="0" w:val="nil"/>
-        </w:pBdr>
-        <w:shd w:fill="auto" w:val="clear"/>
-        <w:spacing w:after="0" w:before="0" w:line="240" w:lineRule="auto"/>
-        <w:ind w:left="0" w:right="0" w:firstLine="0"/>
-        <w:jc w:val="left"/>
-        <w:rPr>
-          <w:rFonts w:ascii="IBM Plex Sans" w:cs="IBM Plex Sans" w:eastAsia="IBM Plex Sans" w:hAnsi="IBM Plex Sans"/>
-          <w:b w:val="0"/>
-          <w:bCs w:val="0"/>
-          <w:i w:val="0"/>
-          <w:iCs w:val="0"/>
-          <w:smallCaps w:val="0"/>
-          <w:strike w:val="0"/>
-          <w:color w:val="000000"/>
-          <w:sz w:val="22"/>
-          <w:szCs w:val="22"/>
-          <w:u w:val="none"/>
-          <w:shd w:fill="auto" w:val="clear"/>
-          <w:vertAlign w:val="baseline"/>
-        </w:rPr>
-      </w:pPr>
-      <w:r>
-        <w:rPr>
-          <w:rFonts w:ascii="IBM Plex Sans" w:cs="IBM Plex Sans" w:eastAsia="IBM Plex Sans" w:hAnsi="IBM Plex Sans"/>
-          <w:b w:val="0"/>
-          <w:bCs w:val="0"/>
-          <w:i w:val="0"/>
-          <w:iCs w:val="0"/>
-          <w:smallCaps w:val="0"/>
-          <w:strike w:val="0"/>
-          <w:color w:val="000000"/>
-          <w:sz w:val="22"/>
-          <w:szCs w:val="22"/>
-          <w:u w:val="none"/>
-          <w:shd w:fill="auto" w:val="clear"/>
-          <w:vertAlign w:val="baseline"/>
-          <w:rtl w:val="0"/>
-        </w:rPr>
-        <w:t xml:space="preserve">a completar</w:t>
-      </w:r>
-    </w:p>
-  </w:comment>
-  <w:comment w:author="Juan ignacio Manfredo" w:id="12" w:date="2026-08-07T22:17:04Z">
-    <w:p>
-      <w:pPr>
-        <w:keepNext w:val="0"/>
-        <w:keepLines w:val="0"/>
-        <w:pageBreakBefore w:val="0"/>
-        <w:widowControl w:val="0"/>
-        <w:pBdr>
-          <w:top w:space="0" w:sz="0" w:val="nil"/>
-          <w:left w:space="0" w:sz="0" w:val="nil"/>
-          <w:bottom w:space="0" w:sz="0" w:val="nil"/>
-          <w:right w:space="0" w:sz="0" w:val="nil"/>
-          <w:between w:space="0" w:sz="0" w:val="nil"/>
-        </w:pBdr>
-        <w:shd w:fill="auto" w:val="clear"/>
-        <w:spacing w:after="0" w:before="0" w:line="240" w:lineRule="auto"/>
-        <w:ind w:left="0" w:right="0" w:firstLine="0"/>
-        <w:jc w:val="left"/>
-        <w:rPr>
-          <w:rFonts w:ascii="IBM Plex Sans" w:cs="IBM Plex Sans" w:eastAsia="IBM Plex Sans" w:hAnsi="IBM Plex Sans"/>
-          <w:b w:val="0"/>
-          <w:bCs w:val="0"/>
-          <w:i w:val="0"/>
-          <w:iCs w:val="0"/>
-          <w:smallCaps w:val="0"/>
-          <w:strike w:val="0"/>
-          <w:color w:val="000000"/>
-          <w:sz w:val="22"/>
-          <w:szCs w:val="22"/>
-          <w:u w:val="none"/>
-          <w:shd w:fill="auto" w:val="clear"/>
-          <w:vertAlign w:val="baseline"/>
-        </w:rPr>
-      </w:pPr>
-      <w:r>
-        <w:rPr>
-          <w:rFonts w:ascii="IBM Plex Sans" w:cs="IBM Plex Sans" w:eastAsia="IBM Plex Sans" w:hAnsi="IBM Plex Sans"/>
-          <w:b w:val="0"/>
-          <w:bCs w:val="0"/>
-          <w:i w:val="0"/>
-          <w:iCs w:val="0"/>
-          <w:smallCaps w:val="0"/>
-          <w:strike w:val="0"/>
-          <w:color w:val="000000"/>
-          <w:sz w:val="22"/>
-          <w:szCs w:val="22"/>
-          <w:u w:val="none"/>
-          <w:shd w:fill="auto" w:val="clear"/>
-          <w:vertAlign w:val="baseline"/>
-          <w:rtl w:val="0"/>
-        </w:rPr>
-        <w:t xml:space="preserve">cambiar cuadro</w:t>
-      </w:r>
-    </w:p>
-  </w:comment>
-  <w:comment w:author="Lourdes Pedaci" w:id="6" w:date="2026-08-28T23:48:14Z">
-    <w:p>
-      <w:pPr>
-        <w:keepNext w:val="0"/>
-        <w:keepLines w:val="0"/>
-        <w:pageBreakBefore w:val="0"/>
-        <w:widowControl w:val="0"/>
-        <w:pBdr>
-          <w:top w:space="0" w:sz="0" w:val="nil"/>
-          <w:left w:space="0" w:sz="0" w:val="nil"/>
-          <w:bottom w:space="0" w:sz="0" w:val="nil"/>
-          <w:right w:space="0" w:sz="0" w:val="nil"/>
-          <w:between w:space="0" w:sz="0" w:val="nil"/>
-        </w:pBdr>
-        <w:shd w:fill="auto" w:val="clear"/>
-        <w:spacing w:after="0" w:before="0" w:line="240" w:lineRule="auto"/>
-        <w:ind w:left="0" w:right="0" w:firstLine="0"/>
-        <w:jc w:val="left"/>
-        <w:rPr>
-          <w:rFonts w:ascii="IBM Plex Sans" w:cs="IBM Plex Sans" w:eastAsia="IBM Plex Sans" w:hAnsi="IBM Plex Sans"/>
-          <w:b w:val="0"/>
-          <w:bCs w:val="0"/>
-          <w:i w:val="0"/>
-          <w:iCs w:val="0"/>
-          <w:smallCaps w:val="0"/>
-          <w:strike w:val="0"/>
-          <w:color w:val="000000"/>
-          <w:sz w:val="22"/>
-          <w:szCs w:val="22"/>
-          <w:u w:val="none"/>
-          <w:shd w:fill="auto" w:val="clear"/>
-          <w:vertAlign w:val="baseline"/>
-        </w:rPr>
-      </w:pPr>
-      <w:r>
-        <w:rPr>
-          <w:rFonts w:ascii="IBM Plex Sans" w:cs="IBM Plex Sans" w:eastAsia="IBM Plex Sans" w:hAnsi="IBM Plex Sans"/>
-          <w:b w:val="0"/>
-          <w:bCs w:val="0"/>
-          <w:i w:val="0"/>
-          <w:iCs w:val="0"/>
-          <w:smallCaps w:val="0"/>
-          <w:strike w:val="0"/>
-          <w:color w:val="000000"/>
-          <w:sz w:val="22"/>
-          <w:szCs w:val="22"/>
-          <w:u w:val="none"/>
-          <w:shd w:fill="auto" w:val="clear"/>
-          <w:vertAlign w:val="baseline"/>
-          <w:rtl w:val="0"/>
-        </w:rPr>
-        <w:t xml:space="preserve">cuestiones de backup, recuperación de datos</w:t>
-      </w:r>
-    </w:p>
-  </w:comment>
-  <w:comment w:author="Lourdes Pedaci" w:id="10" w:date="2026-08-28T23:54:03Z">
-    <w:p>
-      <w:pPr>
-        <w:keepNext w:val="0"/>
-        <w:keepLines w:val="0"/>
-        <w:pageBreakBefore w:val="0"/>
-        <w:widowControl w:val="0"/>
-        <w:pBdr>
-          <w:top w:space="0" w:sz="0" w:val="nil"/>
-          <w:left w:space="0" w:sz="0" w:val="nil"/>
-          <w:bottom w:space="0" w:sz="0" w:val="nil"/>
-          <w:right w:space="0" w:sz="0" w:val="nil"/>
-          <w:between w:space="0" w:sz="0" w:val="nil"/>
-        </w:pBdr>
-        <w:shd w:fill="auto" w:val="clear"/>
-        <w:spacing w:after="0" w:before="0" w:line="240" w:lineRule="auto"/>
-        <w:ind w:left="0" w:right="0" w:firstLine="0"/>
-        <w:jc w:val="left"/>
-        <w:rPr>
-          <w:rFonts w:ascii="IBM Plex Sans" w:cs="IBM Plex Sans" w:eastAsia="IBM Plex Sans" w:hAnsi="IBM Plex Sans"/>
-          <w:b w:val="0"/>
-          <w:bCs w:val="0"/>
-          <w:i w:val="0"/>
-          <w:iCs w:val="0"/>
-          <w:smallCaps w:val="0"/>
-          <w:strike w:val="0"/>
-          <w:color w:val="000000"/>
-          <w:sz w:val="22"/>
-          <w:szCs w:val="22"/>
-          <w:u w:val="none"/>
-          <w:shd w:fill="auto" w:val="clear"/>
-          <w:vertAlign w:val="baseline"/>
-        </w:rPr>
-      </w:pPr>
-      <w:r>
-        <w:rPr>
-          <w:rFonts w:ascii="IBM Plex Sans" w:cs="IBM Plex Sans" w:eastAsia="IBM Plex Sans" w:hAnsi="IBM Plex Sans"/>
-          <w:b w:val="0"/>
-          <w:bCs w:val="0"/>
-          <w:i w:val="0"/>
-          <w:iCs w:val="0"/>
-          <w:smallCaps w:val="0"/>
-          <w:strike w:val="0"/>
-          <w:color w:val="000000"/>
-          <w:sz w:val="22"/>
-          <w:szCs w:val="22"/>
-          <w:u w:val="none"/>
-          <w:shd w:fill="auto" w:val="clear"/>
-          <w:vertAlign w:val="baseline"/>
-          <w:rtl w:val="0"/>
-        </w:rPr>
-        <w:t xml:space="preserve">las imágenes llevan epigrafes</w:t>
-      </w:r>
-    </w:p>
-  </w:comment>
-  <w:comment w:author="Lourdes Pedaci" w:id="5" w:date="2026-08-28T23:44:41Z">
-    <w:p>
-      <w:pPr>
-        <w:keepNext w:val="0"/>
-        <w:keepLines w:val="0"/>
-        <w:pageBreakBefore w:val="0"/>
-        <w:widowControl w:val="0"/>
-        <w:pBdr>
-          <w:top w:space="0" w:sz="0" w:val="nil"/>
-          <w:left w:space="0" w:sz="0" w:val="nil"/>
-          <w:bottom w:space="0" w:sz="0" w:val="nil"/>
-          <w:right w:space="0" w:sz="0" w:val="nil"/>
-          <w:between w:space="0" w:sz="0" w:val="nil"/>
-        </w:pBdr>
-        <w:shd w:fill="auto" w:val="clear"/>
-        <w:spacing w:after="0" w:before="0" w:line="240" w:lineRule="auto"/>
-        <w:ind w:left="0" w:right="0" w:firstLine="0"/>
-        <w:jc w:val="left"/>
-        <w:rPr>
-          <w:rFonts w:ascii="IBM Plex Sans" w:cs="IBM Plex Sans" w:eastAsia="IBM Plex Sans" w:hAnsi="IBM Plex Sans"/>
-          <w:b w:val="0"/>
-          <w:bCs w:val="0"/>
-          <w:i w:val="0"/>
-          <w:iCs w:val="0"/>
-          <w:smallCaps w:val="0"/>
-          <w:strike w:val="0"/>
-          <w:color w:val="000000"/>
-          <w:sz w:val="22"/>
-          <w:szCs w:val="22"/>
-          <w:u w:val="none"/>
-          <w:shd w:fill="auto" w:val="clear"/>
-          <w:vertAlign w:val="baseline"/>
-        </w:rPr>
-      </w:pPr>
-      <w:r>
-        <w:rPr>
-          <w:rFonts w:ascii="IBM Plex Sans" w:cs="IBM Plex Sans" w:eastAsia="IBM Plex Sans" w:hAnsi="IBM Plex Sans"/>
-          <w:b w:val="0"/>
-          <w:bCs w:val="0"/>
-          <w:i w:val="0"/>
-          <w:iCs w:val="0"/>
-          <w:smallCaps w:val="0"/>
-          <w:strike w:val="0"/>
-          <w:color w:val="000000"/>
-          <w:sz w:val="22"/>
-          <w:szCs w:val="22"/>
-          <w:u w:val="none"/>
-          <w:shd w:fill="auto" w:val="clear"/>
-          <w:vertAlign w:val="baseline"/>
-          <w:rtl w:val="0"/>
-        </w:rPr>
-        <w:t xml:space="preserve">ver manual UTN</w:t>
-      </w:r>
-    </w:p>
-  </w:comment>
-</w:comments>
-</file>
-
-<file path=word/commentsExtended.xml><?xml version="1.0" encoding="utf-8"?>
-<w15:commentsEx xmlns:mc="http://schemas.openxmlformats.org/markup-compatibility/2006" xmlns:o="urn:schemas-microsoft-com:office:office" xmlns:r="http://schemas.openxmlformats.org/officeDocument/2006/relationships" xmlns:m="http://schemas.openxmlformats.org/officeDocument/2006/math" xmlns:v="urn:schemas-microsoft-com:vml" xmlns:wp="http://schemas.openxmlformats.org/drawingml/2006/wordprocessingDrawing" xmlns:w10="urn:schemas-microsoft-com:office:word" xmlns:w="http://schemas.openxmlformats.org/wordprocessingml/2006/main" xmlns:wne="http://schemas.microsoft.com/office/word/2006/wordml" xmlns:sl="http://schemas.openxmlformats.org/schemaLibrary/2006/main" xmlns:a="http://schemas.openxmlformats.org/drawingml/2006/main" xmlns:pic="http://schemas.openxmlformats.org/drawingml/2006/picture" xmlns:c="http://schemas.openxmlformats.org/drawingml/2006/chart" xmlns:lc="http://schemas.openxmlformats.org/drawingml/2006/lockedCanvas" xmlns:dgm="http://schemas.openxmlformats.org/drawingml/2006/diagram" xmlns:wps="http://schemas.microsoft.com/office/word/2010/wordprocessingShape" xmlns:wpg="http://schemas.microsoft.com/office/word/2010/wordprocessingGroup" xmlns:w14="http://schemas.microsoft.com/office/word/2010/wordml" xmlns:w15="http://schemas.microsoft.com/office/word/2012/wordml" xmlns:w16="http://schemas.microsoft.com/office/word/2018/wordml" xmlns:w16cex="http://schemas.microsoft.com/office/word/2018/wordml/cex" xmlns:w16cid="http://schemas.microsoft.com/office/word/2016/wordml/cid" xmlns="http://schemas.microsoft.com/office/tasks/2019/documenttasks" xmlns:cr="http://schemas.microsoft.com/office/comments/2020/reactions">
-  <w15:commentEx w15:paraId="0000022E" w15:done="0"/>
-  <w15:commentEx w15:paraId="0000022F" w15:done="0"/>
-  <w15:commentEx w15:paraId="00000230" w15:done="0"/>
-  <w15:commentEx w15:paraId="00000231" w15:done="0"/>
-  <w15:commentEx w15:paraId="00000232" w15:done="0"/>
-  <w15:commentEx w15:paraId="00000233" w15:done="0"/>
-  <w15:commentEx w15:paraId="00000234" w15:done="0"/>
-  <w15:commentEx w15:paraId="00000235" w15:done="0"/>
-  <w15:commentEx w15:paraId="00000236" w15:done="0"/>
-  <w15:commentEx w15:paraId="00000237" w15:done="0"/>
-  <w15:commentEx w15:paraId="00000238" w15:done="0"/>
-  <w15:commentEx w15:paraId="00000239" w15:done="0"/>
-  <w15:commentEx w15:paraId="0000023A" w15:done="0"/>
-  <w15:commentEx w15:paraId="0000023B" w15:done="0"/>
-  <w15:commentEx w15:paraId="0000023C" w15:done="0"/>
-</w15:commentsEx>
 </file>
 
 <file path=word/numbering.xml><?xml version="1.0" encoding="utf-8"?>

</xml_diff>